<commit_message>
Update Board Minutes with matching header, footer and signature section
</commit_message>
<xml_diff>
--- a/ASCO Board Minutes 2026.docx
+++ b/ASCO Board Minutes 2026.docx
@@ -4,63 +4,63 @@
   <w:body>
     <w:p>
       <w:pPr>
-        <w:spacing w:after="80" w:before="480"/>
+        <w:spacing w:after="0" w:before="0"/>
         <w:jc w:val="center"/>
       </w:pPr>
       <w:r>
         <w:rPr>
           <w:rFonts w:ascii="Times New Roman" w:hAnsi="Times New Roman"/>
           <w:b/>
-          <w:sz w:val="28"/>
+          <w:sz w:val="0"/>
         </w:rPr>
         <w:t>MINUTES OF THE MEETING OF THE BOARD OF DIRECTORS</w:t>
       </w:r>
     </w:p>
     <w:p>
       <w:pPr>
-        <w:spacing w:after="80" w:before="0"/>
+        <w:spacing w:after="0" w:before="0"/>
         <w:jc w:val="center"/>
       </w:pPr>
       <w:r>
         <w:rPr>
           <w:rFonts w:ascii="Times New Roman" w:hAnsi="Times New Roman"/>
           <w:b w:val="0"/>
-          <w:sz w:val="24"/>
+          <w:sz w:val="0"/>
         </w:rPr>
         <w:t>OF</w:t>
       </w:r>
     </w:p>
     <w:p>
       <w:pPr>
-        <w:spacing w:after="80" w:before="0"/>
+        <w:spacing w:after="0" w:before="0"/>
         <w:jc w:val="center"/>
       </w:pPr>
       <w:r>
         <w:rPr>
           <w:rFonts w:ascii="Times New Roman" w:hAnsi="Times New Roman"/>
           <w:b/>
-          <w:sz w:val="28"/>
+          <w:sz w:val="0"/>
         </w:rPr>
         <w:t>AFRICAN SOLIDARITY CIVIC ORGANISATION NPC</w:t>
       </w:r>
     </w:p>
     <w:p>
       <w:pPr>
-        <w:spacing w:after="240" w:before="0"/>
+        <w:spacing w:after="0" w:before="0"/>
         <w:jc w:val="center"/>
       </w:pPr>
       <w:r>
         <w:rPr>
           <w:rFonts w:ascii="Times New Roman" w:hAnsi="Times New Roman"/>
           <w:b/>
-          <w:sz w:val="24"/>
+          <w:sz w:val="0"/>
         </w:rPr>
         <w:t>(ASCO NPC)</w:t>
       </w:r>
     </w:p>
     <w:p>
       <w:pPr>
-        <w:spacing w:after="120" w:before="120"/>
+        <w:spacing w:after="0" w:before="0"/>
         <w:jc w:val="center"/>
         <w:pBdr>
           <w:bottom w:val="single" w:sz="4" w:space="1" w:color="000000"/>
@@ -69,14 +69,14 @@
     </w:p>
     <w:p>
       <w:pPr>
-        <w:spacing w:after="80"/>
+        <w:spacing w:after="0"/>
         <w:jc w:val="left"/>
       </w:pPr>
       <w:r>
         <w:rPr>
           <w:rFonts w:ascii="Times New Roman" w:hAnsi="Times New Roman"/>
           <w:b/>
-          <w:sz w:val="24"/>
+          <w:sz w:val="0"/>
         </w:rPr>
         <w:t>Registration Number:</w:t>
         <w:tab/>
@@ -84,21 +84,21 @@
       <w:r>
         <w:rPr>
           <w:rFonts w:ascii="Times New Roman" w:hAnsi="Times New Roman"/>
-          <w:sz w:val="24"/>
+          <w:sz w:val="0"/>
         </w:rPr>
         <w:t>____________________</w:t>
       </w:r>
     </w:p>
     <w:p>
       <w:pPr>
-        <w:spacing w:after="80"/>
+        <w:spacing w:after="0"/>
         <w:jc w:val="left"/>
       </w:pPr>
       <w:r>
         <w:rPr>
           <w:rFonts w:ascii="Times New Roman" w:hAnsi="Times New Roman"/>
           <w:b/>
-          <w:sz w:val="24"/>
+          <w:sz w:val="0"/>
         </w:rPr>
         <w:t>Date of Meeting:</w:t>
         <w:tab/>
@@ -106,21 +106,21 @@
       <w:r>
         <w:rPr>
           <w:rFonts w:ascii="Times New Roman" w:hAnsi="Times New Roman"/>
-          <w:sz w:val="24"/>
+          <w:sz w:val="0"/>
         </w:rPr>
         <w:t>____________________</w:t>
       </w:r>
     </w:p>
     <w:p>
       <w:pPr>
-        <w:spacing w:after="80"/>
+        <w:spacing w:after="0"/>
         <w:jc w:val="left"/>
       </w:pPr>
       <w:r>
         <w:rPr>
           <w:rFonts w:ascii="Times New Roman" w:hAnsi="Times New Roman"/>
           <w:b/>
-          <w:sz w:val="24"/>
+          <w:sz w:val="0"/>
         </w:rPr>
         <w:t>Time:</w:t>
         <w:tab/>
@@ -128,21 +128,21 @@
       <w:r>
         <w:rPr>
           <w:rFonts w:ascii="Times New Roman" w:hAnsi="Times New Roman"/>
-          <w:sz w:val="24"/>
+          <w:sz w:val="0"/>
         </w:rPr>
         <w:t>____________________</w:t>
       </w:r>
     </w:p>
     <w:p>
       <w:pPr>
-        <w:spacing w:after="80"/>
+        <w:spacing w:after="0"/>
         <w:jc w:val="left"/>
       </w:pPr>
       <w:r>
         <w:rPr>
           <w:rFonts w:ascii="Times New Roman" w:hAnsi="Times New Roman"/>
           <w:b/>
-          <w:sz w:val="24"/>
+          <w:sz w:val="0"/>
         </w:rPr>
         <w:t>Venue:</w:t>
         <w:tab/>
@@ -150,14 +150,14 @@
       <w:r>
         <w:rPr>
           <w:rFonts w:ascii="Times New Roman" w:hAnsi="Times New Roman"/>
-          <w:sz w:val="24"/>
+          <w:sz w:val="0"/>
         </w:rPr>
         <w:t>____________________</w:t>
       </w:r>
     </w:p>
     <w:p>
       <w:pPr>
-        <w:spacing w:after="120" w:before="120"/>
+        <w:spacing w:after="0" w:before="0"/>
         <w:jc w:val="center"/>
         <w:pBdr>
           <w:bottom w:val="single" w:sz="4" w:space="1" w:color="000000"/>
@@ -166,60 +166,63 @@
     </w:p>
     <w:p>
       <w:pPr>
-        <w:spacing w:after="120" w:before="240"/>
+        <w:spacing w:after="0" w:before="0"/>
         <w:jc w:val="left"/>
       </w:pPr>
       <w:r>
         <w:rPr>
           <w:rFonts w:ascii="Times New Roman" w:hAnsi="Times New Roman"/>
           <w:b/>
-          <w:sz w:val="28"/>
+          <w:sz w:val="0"/>
         </w:rPr>
         <w:t>1. OPENING AND WELCOME</w:t>
       </w:r>
     </w:p>
     <w:p>
       <w:pPr>
-        <w:spacing w:after="120" w:before="0"/>
+        <w:spacing w:after="0" w:before="0"/>
         <w:jc w:val="both"/>
       </w:pPr>
       <w:r>
         <w:rPr>
           <w:rFonts w:ascii="Times New Roman" w:hAnsi="Times New Roman"/>
-          <w:sz w:val="24"/>
+          <w:b w:val="0"/>
+          <w:sz w:val="0"/>
         </w:rPr>
         <w:t>The meeting of the Board of Directors of African Solidarity Civic Organisation NPC (ASCO NPC) was called to order by the Chairlady of the Board, Ms Busisiwe Makhosi Shandu.</w:t>
       </w:r>
     </w:p>
     <w:p>
       <w:pPr>
-        <w:spacing w:after="120" w:before="0"/>
+        <w:spacing w:after="0" w:before="0"/>
         <w:jc w:val="both"/>
       </w:pPr>
       <w:r>
         <w:rPr>
           <w:rFonts w:ascii="Times New Roman" w:hAnsi="Times New Roman"/>
-          <w:sz w:val="24"/>
+          <w:b w:val="0"/>
+          <w:sz w:val="0"/>
         </w:rPr>
         <w:t>The Chairlady welcomed all Directors and confirmed that the meeting was properly constituted, with the required quorum present to deliberate and adopt resolutions binding on the organisation.</w:t>
       </w:r>
     </w:p>
     <w:p>
       <w:pPr>
-        <w:spacing w:after="120" w:before="0"/>
+        <w:spacing w:after="0" w:before="0"/>
         <w:jc w:val="both"/>
       </w:pPr>
       <w:r>
         <w:rPr>
           <w:rFonts w:ascii="Times New Roman" w:hAnsi="Times New Roman"/>
-          <w:sz w:val="24"/>
+          <w:b w:val="0"/>
+          <w:sz w:val="0"/>
         </w:rPr>
         <w:t>The Chairlady stated that the purpose of the meeting was to consider and formally adopt the customised Memorandum of Incorporation (MOI) of ASCO NPC, ensuring that the organisation's governance framework reflects its founding principles, non-profit objectives, institutional values and future sustainability.</w:t>
       </w:r>
     </w:p>
     <w:p>
       <w:pPr>
-        <w:spacing w:after="120" w:before="120"/>
+        <w:spacing w:after="0" w:before="0"/>
         <w:jc w:val="center"/>
         <w:pBdr>
           <w:bottom w:val="single" w:sz="4" w:space="1" w:color="000000"/>
@@ -228,37 +231,45 @@
     </w:p>
     <w:p>
       <w:pPr>
-        <w:spacing w:after="120" w:before="240"/>
+        <w:spacing w:after="0" w:before="0"/>
         <w:jc w:val="left"/>
       </w:pPr>
       <w:r>
         <w:rPr>
           <w:rFonts w:ascii="Times New Roman" w:hAnsi="Times New Roman"/>
           <w:b/>
-          <w:sz w:val="28"/>
+          <w:sz w:val="0"/>
         </w:rPr>
         <w:t>2. ATTENDANCE</w:t>
       </w:r>
     </w:p>
     <w:p>
       <w:pPr>
-        <w:spacing w:after="120" w:before="0"/>
+        <w:spacing w:after="0" w:before="0"/>
         <w:jc w:val="both"/>
       </w:pPr>
       <w:r>
         <w:rPr>
           <w:rFonts w:ascii="Times New Roman" w:hAnsi="Times New Roman"/>
-          <w:sz w:val="24"/>
+          <w:b w:val="0"/>
+          <w:sz w:val="0"/>
         </w:rPr>
         <w:t>The following Directors were present:</w:t>
       </w:r>
     </w:p>
     <w:tbl>
       <w:tblPr>
-        <w:tblStyle w:val="TableGrid"/>
         <w:tblW w:type="auto" w:w="0"/>
         <w:jc w:val="center"/>
         <w:tblLook w:firstColumn="1" w:firstRow="1" w:lastColumn="0" w:lastRow="0" w:noHBand="0" w:noVBand="1" w:val="04A0"/>
+        <w:tblBorders>
+          <w:top w:val="single" w:sz="5" w:space="0" w:color="D8DDD8"/>
+          <w:left w:val="single" w:sz="5" w:space="0" w:color="D8DDD8"/>
+          <w:bottom w:val="single" w:sz="5" w:space="0" w:color="D8DDD8"/>
+          <w:right w:val="single" w:sz="5" w:space="0" w:color="D8DDD8"/>
+          <w:insideH w:val="single" w:sz="5" w:space="0" w:color="D8DDD8"/>
+          <w:insideV w:val="single" w:sz="5" w:space="0" w:color="D8DDD8"/>
+        </w:tblBorders>
       </w:tblPr>
       <w:tblGrid>
         <w:gridCol w:w="4680"/>
@@ -267,18 +278,15 @@
       <w:tr>
         <w:tc>
           <w:tcPr>
-            <w:tcW w:type="dxa" w:w="3969"/>
-            <w:shd w:fill="D9E2F3"/>
+            <w:tcW w:type="dxa" w:w="4680"/>
+            <w:shd w:val="clear" w:color="auto" w:fill="145A32"/>
           </w:tcPr>
           <w:p>
-            <w:pPr>
-              <w:jc w:val="left"/>
-            </w:pPr>
             <w:r>
               <w:rPr>
                 <w:rFonts w:ascii="Times New Roman" w:hAnsi="Times New Roman"/>
                 <w:b/>
-                <w:sz w:val="22"/>
+                <w:sz w:val="0"/>
               </w:rPr>
               <w:t>Name</w:t>
             </w:r>
@@ -286,18 +294,15 @@
         </w:tc>
         <w:tc>
           <w:tcPr>
-            <w:tcW w:type="dxa" w:w="5669"/>
-            <w:shd w:fill="D9E2F3"/>
+            <w:tcW w:type="dxa" w:w="4680"/>
+            <w:shd w:val="clear" w:color="auto" w:fill="145A32"/>
           </w:tcPr>
           <w:p>
-            <w:pPr>
-              <w:jc w:val="left"/>
-            </w:pPr>
             <w:r>
               <w:rPr>
                 <w:rFonts w:ascii="Times New Roman" w:hAnsi="Times New Roman"/>
                 <w:b/>
-                <w:sz w:val="22"/>
+                <w:sz w:val="0"/>
               </w:rPr>
               <w:t>Position</w:t>
             </w:r>
@@ -307,13 +312,13 @@
       <w:tr>
         <w:tc>
           <w:tcPr>
-            <w:tcW w:type="dxa" w:w="3969"/>
+            <w:tcW w:type="dxa" w:w="4680"/>
           </w:tcPr>
           <w:p>
             <w:r>
               <w:rPr>
                 <w:rFonts w:ascii="Times New Roman" w:hAnsi="Times New Roman"/>
-                <w:sz w:val="22"/>
+                <w:sz w:val="0"/>
               </w:rPr>
               <w:t>Ms Busisiwe Makhosi Shandu</w:t>
             </w:r>
@@ -321,13 +326,13 @@
         </w:tc>
         <w:tc>
           <w:tcPr>
-            <w:tcW w:type="dxa" w:w="5669"/>
+            <w:tcW w:type="dxa" w:w="4680"/>
           </w:tcPr>
           <w:p>
             <w:r>
               <w:rPr>
                 <w:rFonts w:ascii="Times New Roman" w:hAnsi="Times New Roman"/>
-                <w:sz w:val="22"/>
+                <w:sz w:val="0"/>
               </w:rPr>
               <w:t>Chairlady of the Board / Founder and Custodian of Founding Legacy</w:t>
             </w:r>
@@ -337,13 +342,14 @@
       <w:tr>
         <w:tc>
           <w:tcPr>
-            <w:tcW w:type="dxa" w:w="3969"/>
+            <w:tcW w:type="dxa" w:w="4680"/>
+            <w:shd w:val="clear" w:color="auto" w:fill="F7F8F5"/>
           </w:tcPr>
           <w:p>
             <w:r>
               <w:rPr>
                 <w:rFonts w:ascii="Times New Roman" w:hAnsi="Times New Roman"/>
-                <w:sz w:val="22"/>
+                <w:sz w:val="0"/>
               </w:rPr>
               <w:t>Mr Bhekisisa Shandu</w:t>
             </w:r>
@@ -351,13 +357,14 @@
         </w:tc>
         <w:tc>
           <w:tcPr>
-            <w:tcW w:type="dxa" w:w="5669"/>
+            <w:tcW w:type="dxa" w:w="4680"/>
+            <w:shd w:val="clear" w:color="auto" w:fill="F7F8F5"/>
           </w:tcPr>
           <w:p>
             <w:r>
               <w:rPr>
                 <w:rFonts w:ascii="Times New Roman" w:hAnsi="Times New Roman"/>
-                <w:sz w:val="22"/>
+                <w:sz w:val="0"/>
               </w:rPr>
               <w:t>Executive Director</w:t>
             </w:r>
@@ -367,13 +374,13 @@
       <w:tr>
         <w:tc>
           <w:tcPr>
-            <w:tcW w:type="dxa" w:w="3969"/>
+            <w:tcW w:type="dxa" w:w="4680"/>
           </w:tcPr>
           <w:p>
             <w:r>
               <w:rPr>
                 <w:rFonts w:ascii="Times New Roman" w:hAnsi="Times New Roman"/>
-                <w:sz w:val="22"/>
+                <w:sz w:val="0"/>
               </w:rPr>
               <w:t>Mr Thapelo Nelson Maqalika</w:t>
             </w:r>
@@ -381,13 +388,13 @@
         </w:tc>
         <w:tc>
           <w:tcPr>
-            <w:tcW w:type="dxa" w:w="5669"/>
+            <w:tcW w:type="dxa" w:w="4680"/>
           </w:tcPr>
           <w:p>
             <w:r>
               <w:rPr>
                 <w:rFonts w:ascii="Times New Roman" w:hAnsi="Times New Roman"/>
-                <w:sz w:val="22"/>
+                <w:sz w:val="0"/>
               </w:rPr>
               <w:t>Director: Head of ICT and Communications</w:t>
             </w:r>
@@ -397,13 +404,14 @@
       <w:tr>
         <w:tc>
           <w:tcPr>
-            <w:tcW w:type="dxa" w:w="3969"/>
+            <w:tcW w:type="dxa" w:w="4680"/>
+            <w:shd w:val="clear" w:color="auto" w:fill="F7F8F5"/>
           </w:tcPr>
           <w:p>
             <w:r>
               <w:rPr>
                 <w:rFonts w:ascii="Times New Roman" w:hAnsi="Times New Roman"/>
-                <w:sz w:val="22"/>
+                <w:sz w:val="0"/>
               </w:rPr>
               <w:t>Mr Khulekani Gumede</w:t>
             </w:r>
@@ -411,13 +419,14 @@
         </w:tc>
         <w:tc>
           <w:tcPr>
-            <w:tcW w:type="dxa" w:w="5669"/>
+            <w:tcW w:type="dxa" w:w="4680"/>
+            <w:shd w:val="clear" w:color="auto" w:fill="F7F8F5"/>
           </w:tcPr>
           <w:p>
             <w:r>
               <w:rPr>
                 <w:rFonts w:ascii="Times New Roman" w:hAnsi="Times New Roman"/>
-                <w:sz w:val="22"/>
+                <w:sz w:val="0"/>
               </w:rPr>
               <w:t>Director: People and Culture</w:t>
             </w:r>
@@ -428,34 +437,35 @@
     <w:p/>
     <w:p>
       <w:pPr>
-        <w:spacing w:after="120" w:before="240"/>
+        <w:spacing w:after="0" w:before="0"/>
         <w:jc w:val="left"/>
       </w:pPr>
       <w:r>
         <w:rPr>
           <w:rFonts w:ascii="Times New Roman" w:hAnsi="Times New Roman"/>
           <w:b/>
-          <w:sz w:val="28"/>
+          <w:sz w:val="0"/>
         </w:rPr>
         <w:t>3. APOLOGIES</w:t>
       </w:r>
     </w:p>
     <w:p>
       <w:pPr>
-        <w:spacing w:after="120" w:before="0"/>
+        <w:spacing w:after="0" w:before="0"/>
         <w:jc w:val="both"/>
       </w:pPr>
       <w:r>
         <w:rPr>
           <w:rFonts w:ascii="Times New Roman" w:hAnsi="Times New Roman"/>
-          <w:sz w:val="24"/>
+          <w:b w:val="0"/>
+          <w:sz w:val="0"/>
         </w:rPr>
         <w:t>No apologies were received.</w:t>
       </w:r>
     </w:p>
     <w:p>
       <w:pPr>
-        <w:spacing w:after="120" w:before="120"/>
+        <w:spacing w:after="0" w:before="0"/>
         <w:jc w:val="center"/>
         <w:pBdr>
           <w:bottom w:val="single" w:sz="4" w:space="1" w:color="000000"/>
@@ -464,34 +474,35 @@
     </w:p>
     <w:p>
       <w:pPr>
-        <w:spacing w:after="120" w:before="240"/>
+        <w:spacing w:after="0" w:before="0"/>
         <w:jc w:val="left"/>
       </w:pPr>
       <w:r>
         <w:rPr>
           <w:rFonts w:ascii="Times New Roman" w:hAnsi="Times New Roman"/>
           <w:b/>
-          <w:sz w:val="28"/>
+          <w:sz w:val="0"/>
         </w:rPr>
         <w:t>4. DECLARATION OF INTEREST</w:t>
       </w:r>
     </w:p>
     <w:p>
       <w:pPr>
-        <w:spacing w:after="120" w:before="0"/>
+        <w:spacing w:after="0" w:before="0"/>
         <w:jc w:val="both"/>
       </w:pPr>
       <w:r>
         <w:rPr>
           <w:rFonts w:ascii="Times New Roman" w:hAnsi="Times New Roman"/>
-          <w:sz w:val="24"/>
+          <w:b w:val="0"/>
+          <w:sz w:val="0"/>
         </w:rPr>
         <w:t>All Directors present confirmed that they had no personal financial interests that conflicted with the matters tabled before the meeting.</w:t>
       </w:r>
     </w:p>
     <w:p>
       <w:pPr>
-        <w:spacing w:after="120" w:before="120"/>
+        <w:spacing w:after="0" w:before="0"/>
         <w:jc w:val="center"/>
         <w:pBdr>
           <w:bottom w:val="single" w:sz="4" w:space="1" w:color="000000"/>
@@ -500,104 +511,105 @@
     </w:p>
     <w:p>
       <w:pPr>
-        <w:spacing w:after="120" w:before="240"/>
+        <w:spacing w:after="0" w:before="0"/>
         <w:jc w:val="left"/>
       </w:pPr>
       <w:r>
         <w:rPr>
           <w:rFonts w:ascii="Times New Roman" w:hAnsi="Times New Roman"/>
           <w:b/>
-          <w:sz w:val="28"/>
+          <w:sz w:val="0"/>
         </w:rPr>
         <w:t>5. PURPOSE OF THE MEETING</w:t>
       </w:r>
     </w:p>
     <w:p>
       <w:pPr>
-        <w:spacing w:after="120" w:before="0"/>
+        <w:spacing w:after="0" w:before="0"/>
         <w:jc w:val="both"/>
       </w:pPr>
       <w:r>
         <w:rPr>
           <w:rFonts w:ascii="Times New Roman" w:hAnsi="Times New Roman"/>
-          <w:sz w:val="24"/>
+          <w:b w:val="0"/>
+          <w:sz w:val="0"/>
         </w:rPr>
         <w:t>The Chairlady tabled the following objectives of the meeting:</w:t>
       </w:r>
     </w:p>
     <w:p>
       <w:pPr>
-        <w:spacing w:after="80"/>
-        <w:ind w:left="720"/>
+        <w:spacing w:after="0"/>
+        <w:ind w:left="1829"/>
         <w:jc w:val="both"/>
       </w:pPr>
       <w:r>
         <w:rPr>
           <w:rFonts w:ascii="Times New Roman" w:hAnsi="Times New Roman"/>
-          <w:sz w:val="24"/>
+          <w:sz w:val="0"/>
         </w:rPr>
         <w:t>5.1  To consider the customised Memorandum of Incorporation (MOI) prepared for African Solidarity Civic Organisation NPC;</w:t>
       </w:r>
     </w:p>
     <w:p>
       <w:pPr>
-        <w:spacing w:after="80"/>
-        <w:ind w:left="720"/>
+        <w:spacing w:after="0"/>
+        <w:ind w:left="1829"/>
         <w:jc w:val="both"/>
       </w:pPr>
       <w:r>
         <w:rPr>
           <w:rFonts w:ascii="Times New Roman" w:hAnsi="Times New Roman"/>
-          <w:sz w:val="24"/>
+          <w:sz w:val="0"/>
         </w:rPr>
         <w:t>5.2  To ensure that ASCO NPC has a governance framework aligned with the Companies Act 71 of 2008 and principles applicable to non-profit companies;</w:t>
       </w:r>
     </w:p>
     <w:p>
       <w:pPr>
-        <w:spacing w:after="80"/>
-        <w:ind w:left="720"/>
+        <w:spacing w:after="0"/>
+        <w:ind w:left="1829"/>
         <w:jc w:val="both"/>
       </w:pPr>
       <w:r>
         <w:rPr>
           <w:rFonts w:ascii="Times New Roman" w:hAnsi="Times New Roman"/>
-          <w:sz w:val="24"/>
+          <w:sz w:val="0"/>
         </w:rPr>
         <w:t>5.3  To formally recognise the contribution of the founder in establishing ASCO NPC and preserving its founding vision;</w:t>
       </w:r>
     </w:p>
     <w:p>
       <w:pPr>
-        <w:spacing w:after="80"/>
-        <w:ind w:left="720"/>
+        <w:spacing w:after="0"/>
+        <w:ind w:left="1829"/>
         <w:jc w:val="both"/>
       </w:pPr>
       <w:r>
         <w:rPr>
           <w:rFonts w:ascii="Times New Roman" w:hAnsi="Times New Roman"/>
-          <w:sz w:val="24"/>
+          <w:sz w:val="0"/>
         </w:rPr>
         <w:t>5.4  To strengthen governance systems required for engagement with regulators, donors, international partners and potential applications relating to Public Benefit Organisation (PBO) and Section 18A approval;</w:t>
       </w:r>
     </w:p>
     <w:p>
       <w:pPr>
-        <w:spacing w:after="80"/>
-        <w:ind w:left="720"/>
+        <w:spacing w:after="0"/>
+        <w:ind w:left="1829"/>
         <w:jc w:val="both"/>
       </w:pPr>
       <w:r>
         <w:rPr>
           <w:rFonts w:ascii="Times New Roman" w:hAnsi="Times New Roman"/>
-          <w:sz w:val="24"/>
+          <w:sz w:val="0"/>
         </w:rPr>
         <w:t>5.5  To confirm the roles, responsibilities and authority of the Board of Directors and Executive Management.</w:t>
       </w:r>
     </w:p>
     <w:p>
       <w:pPr>
-        <w:spacing w:after="120" w:before="120"/>
+        <w:spacing w:after="0" w:before="0"/>
         <w:jc w:val="center"/>
         <w:pBdr>
           <w:bottom w:val="single" w:sz="4" w:space="1" w:color="000000"/>
@@ -606,172 +618,175 @@
     </w:p>
     <w:p>
       <w:pPr>
-        <w:spacing w:after="120" w:before="240"/>
+        <w:spacing w:after="0" w:before="0"/>
         <w:jc w:val="left"/>
       </w:pPr>
       <w:r>
         <w:rPr>
           <w:rFonts w:ascii="Times New Roman" w:hAnsi="Times New Roman"/>
           <w:b/>
-          <w:sz w:val="28"/>
+          <w:sz w:val="0"/>
         </w:rPr>
         <w:t>6. BACKGROUND AND CONSIDERATION OF THE CUSTOMISED MOI</w:t>
       </w:r>
     </w:p>
     <w:p>
       <w:pPr>
-        <w:spacing w:after="120" w:before="0"/>
+        <w:spacing w:after="0" w:before="0"/>
         <w:jc w:val="both"/>
       </w:pPr>
       <w:r>
         <w:rPr>
           <w:rFonts w:ascii="Times New Roman" w:hAnsi="Times New Roman"/>
-          <w:sz w:val="24"/>
+          <w:b w:val="0"/>
+          <w:sz w:val="0"/>
         </w:rPr>
         <w:t>The Board considered the customised Memorandum of Incorporation prepared for ASCO NPC.</w:t>
       </w:r>
     </w:p>
     <w:p>
       <w:pPr>
-        <w:spacing w:after="120" w:before="0"/>
+        <w:spacing w:after="0" w:before="0"/>
         <w:jc w:val="both"/>
       </w:pPr>
       <w:r>
         <w:rPr>
           <w:rFonts w:ascii="Times New Roman" w:hAnsi="Times New Roman"/>
-          <w:sz w:val="24"/>
+          <w:b w:val="0"/>
+          <w:sz w:val="0"/>
         </w:rPr>
         <w:t>The Board noted that the MOI is intended to serve as the organisation's principal governance instrument and provides clarity on:</w:t>
       </w:r>
     </w:p>
     <w:p>
       <w:pPr>
-        <w:spacing w:after="80"/>
-        <w:ind w:left="720"/>
+        <w:spacing w:after="0"/>
+        <w:ind w:left="1829"/>
         <w:jc w:val="both"/>
       </w:pPr>
       <w:r>
         <w:rPr>
           <w:rFonts w:ascii="Times New Roman" w:hAnsi="Times New Roman"/>
-          <w:sz w:val="24"/>
+          <w:sz w:val="0"/>
         </w:rPr>
         <w:t>• The purpose and objectives of ASCO NPC;</w:t>
       </w:r>
     </w:p>
     <w:p>
       <w:pPr>
-        <w:spacing w:after="80"/>
-        <w:ind w:left="720"/>
+        <w:spacing w:after="0"/>
+        <w:ind w:left="1829"/>
         <w:jc w:val="both"/>
       </w:pPr>
       <w:r>
         <w:rPr>
           <w:rFonts w:ascii="Times New Roman" w:hAnsi="Times New Roman"/>
-          <w:sz w:val="24"/>
+          <w:sz w:val="0"/>
         </w:rPr>
         <w:t>• The organisation's non-profit character;</w:t>
       </w:r>
     </w:p>
     <w:p>
       <w:pPr>
-        <w:spacing w:after="80"/>
-        <w:ind w:left="720"/>
+        <w:spacing w:after="0"/>
+        <w:ind w:left="1829"/>
         <w:jc w:val="both"/>
       </w:pPr>
       <w:r>
         <w:rPr>
           <w:rFonts w:ascii="Times New Roman" w:hAnsi="Times New Roman"/>
-          <w:sz w:val="24"/>
+          <w:sz w:val="0"/>
         </w:rPr>
         <w:t>• The authority and responsibilities of the Board of Directors;</w:t>
       </w:r>
     </w:p>
     <w:p>
       <w:pPr>
-        <w:spacing w:after="80"/>
-        <w:ind w:left="720"/>
+        <w:spacing w:after="0"/>
+        <w:ind w:left="1829"/>
         <w:jc w:val="both"/>
       </w:pPr>
       <w:r>
         <w:rPr>
           <w:rFonts w:ascii="Times New Roman" w:hAnsi="Times New Roman"/>
-          <w:sz w:val="24"/>
+          <w:sz w:val="0"/>
         </w:rPr>
         <w:t>• The separation between governance oversight and operational management;</w:t>
       </w:r>
     </w:p>
     <w:p>
       <w:pPr>
-        <w:spacing w:after="80"/>
-        <w:ind w:left="720"/>
+        <w:spacing w:after="0"/>
+        <w:ind w:left="1829"/>
         <w:jc w:val="both"/>
       </w:pPr>
       <w:r>
         <w:rPr>
           <w:rFonts w:ascii="Times New Roman" w:hAnsi="Times New Roman"/>
-          <w:sz w:val="24"/>
+          <w:sz w:val="0"/>
         </w:rPr>
         <w:t>• Ethical leadership and accountability;</w:t>
       </w:r>
     </w:p>
     <w:p>
       <w:pPr>
-        <w:spacing w:after="80"/>
-        <w:ind w:left="720"/>
+        <w:spacing w:after="0"/>
+        <w:ind w:left="1829"/>
         <w:jc w:val="both"/>
       </w:pPr>
       <w:r>
         <w:rPr>
           <w:rFonts w:ascii="Times New Roman" w:hAnsi="Times New Roman"/>
-          <w:sz w:val="24"/>
+          <w:sz w:val="0"/>
         </w:rPr>
         <w:t>• Protection of organisational assets and resources;</w:t>
       </w:r>
     </w:p>
     <w:p>
       <w:pPr>
-        <w:spacing w:after="80"/>
-        <w:ind w:left="720"/>
+        <w:spacing w:after="0"/>
+        <w:ind w:left="1829"/>
         <w:jc w:val="both"/>
       </w:pPr>
       <w:r>
         <w:rPr>
           <w:rFonts w:ascii="Times New Roman" w:hAnsi="Times New Roman"/>
-          <w:sz w:val="24"/>
+          <w:sz w:val="0"/>
         </w:rPr>
         <w:t>• Institutional continuity beyond individual office bearers;</w:t>
       </w:r>
     </w:p>
     <w:p>
       <w:pPr>
-        <w:spacing w:after="80"/>
-        <w:ind w:left="720"/>
+        <w:spacing w:after="0"/>
+        <w:ind w:left="1829"/>
         <w:jc w:val="both"/>
       </w:pPr>
       <w:r>
         <w:rPr>
           <w:rFonts w:ascii="Times New Roman" w:hAnsi="Times New Roman"/>
-          <w:sz w:val="24"/>
+          <w:sz w:val="0"/>
         </w:rPr>
         <w:t>• Compliance with legal and regulatory requirements.</w:t>
       </w:r>
     </w:p>
     <w:p>
       <w:pPr>
-        <w:spacing w:after="120" w:before="0"/>
+        <w:spacing w:after="0" w:before="0"/>
         <w:jc w:val="both"/>
       </w:pPr>
       <w:r>
         <w:rPr>
           <w:rFonts w:ascii="Times New Roman" w:hAnsi="Times New Roman"/>
-          <w:sz w:val="24"/>
+          <w:b w:val="0"/>
+          <w:sz w:val="0"/>
         </w:rPr>
         <w:t>The Board further noted that the customised MOI strengthens ASCO NPC's readiness to engage with funding institutions, government structures, international organisations and regulatory authorities.</w:t>
       </w:r>
     </w:p>
     <w:p>
       <w:pPr>
-        <w:spacing w:after="120" w:before="120"/>
+        <w:spacing w:after="0" w:before="0"/>
         <w:jc w:val="center"/>
         <w:pBdr>
           <w:bottom w:val="single" w:sz="4" w:space="1" w:color="000000"/>
@@ -780,158 +795,161 @@
     </w:p>
     <w:p>
       <w:pPr>
-        <w:spacing w:after="120" w:before="240"/>
+        <w:spacing w:after="0" w:before="0"/>
         <w:jc w:val="left"/>
       </w:pPr>
       <w:r>
         <w:rPr>
           <w:rFonts w:ascii="Times New Roman" w:hAnsi="Times New Roman"/>
           <w:b/>
-          <w:sz w:val="28"/>
+          <w:sz w:val="0"/>
         </w:rPr>
         <w:t>7. RECOGNITION OF THE FOUNDER AND FOUNDING LEGACY</w:t>
       </w:r>
     </w:p>
     <w:p>
       <w:pPr>
-        <w:spacing w:after="120" w:before="0"/>
+        <w:spacing w:after="0" w:before="0"/>
         <w:jc w:val="both"/>
       </w:pPr>
       <w:r>
         <w:rPr>
           <w:rFonts w:ascii="Times New Roman" w:hAnsi="Times New Roman"/>
-          <w:sz w:val="24"/>
+          <w:b w:val="0"/>
+          <w:sz w:val="0"/>
         </w:rPr>
         <w:t>The Board formally considered the recognition of Ms Busisiwe Makhosi Shandu as Founder and Custodian of the Founding Legacy of African Solidarity Civic Organisation NPC.</w:t>
       </w:r>
     </w:p>
     <w:p>
       <w:pPr>
-        <w:spacing w:after="120" w:before="0"/>
+        <w:spacing w:after="0" w:before="0"/>
         <w:jc w:val="both"/>
       </w:pPr>
       <w:r>
         <w:rPr>
           <w:rFonts w:ascii="Times New Roman" w:hAnsi="Times New Roman"/>
-          <w:sz w:val="24"/>
+          <w:b w:val="0"/>
+          <w:sz w:val="0"/>
         </w:rPr>
         <w:t>The Board recorded that the recognition of the Founder is intended to preserve and honour:</w:t>
       </w:r>
     </w:p>
     <w:p>
       <w:pPr>
-        <w:spacing w:after="80"/>
-        <w:ind w:left="720"/>
+        <w:spacing w:after="0"/>
+        <w:ind w:left="1829"/>
         <w:jc w:val="both"/>
       </w:pPr>
       <w:r>
         <w:rPr>
           <w:rFonts w:ascii="Times New Roman" w:hAnsi="Times New Roman"/>
-          <w:sz w:val="24"/>
+          <w:sz w:val="0"/>
         </w:rPr>
         <w:t>• The founding vision of ASCO NPC;</w:t>
       </w:r>
     </w:p>
     <w:p>
       <w:pPr>
-        <w:spacing w:after="80"/>
-        <w:ind w:left="720"/>
+        <w:spacing w:after="0"/>
+        <w:ind w:left="1829"/>
         <w:jc w:val="both"/>
       </w:pPr>
       <w:r>
         <w:rPr>
           <w:rFonts w:ascii="Times New Roman" w:hAnsi="Times New Roman"/>
-          <w:sz w:val="24"/>
+          <w:sz w:val="0"/>
         </w:rPr>
         <w:t>• The contribution and sacrifice made during the establishment of the organisation;</w:t>
       </w:r>
     </w:p>
     <w:p>
       <w:pPr>
-        <w:spacing w:after="80"/>
-        <w:ind w:left="720"/>
+        <w:spacing w:after="0"/>
+        <w:ind w:left="1829"/>
         <w:jc w:val="both"/>
       </w:pPr>
       <w:r>
         <w:rPr>
           <w:rFonts w:ascii="Times New Roman" w:hAnsi="Times New Roman"/>
-          <w:sz w:val="24"/>
+          <w:sz w:val="0"/>
         </w:rPr>
         <w:t>• The principles, values and objectives upon which ASCO NPC was created.</w:t>
       </w:r>
     </w:p>
     <w:p>
       <w:pPr>
-        <w:spacing w:after="120" w:before="0"/>
+        <w:spacing w:after="0" w:before="0"/>
         <w:jc w:val="both"/>
       </w:pPr>
       <w:r>
         <w:rPr>
           <w:rFonts w:ascii="Times New Roman" w:hAnsi="Times New Roman"/>
-          <w:sz w:val="24"/>
+          <w:b w:val="0"/>
+          <w:sz w:val="0"/>
         </w:rPr>
         <w:t>The Board further resolved that:</w:t>
       </w:r>
     </w:p>
     <w:p>
       <w:pPr>
-        <w:spacing w:after="80"/>
-        <w:ind w:left="720"/>
+        <w:spacing w:after="0"/>
+        <w:ind w:left="1829"/>
         <w:jc w:val="both"/>
       </w:pPr>
       <w:r>
         <w:rPr>
           <w:rFonts w:ascii="Times New Roman" w:hAnsi="Times New Roman"/>
-          <w:sz w:val="24"/>
+          <w:sz w:val="0"/>
         </w:rPr>
         <w:t>7.1  Recognition of the Founder does not create ownership rights, personal control or financial entitlement over ASCO NPC;</w:t>
       </w:r>
     </w:p>
     <w:p>
       <w:pPr>
-        <w:spacing w:after="80"/>
-        <w:ind w:left="720"/>
+        <w:spacing w:after="0"/>
+        <w:ind w:left="1829"/>
         <w:jc w:val="both"/>
       </w:pPr>
       <w:r>
         <w:rPr>
           <w:rFonts w:ascii="Times New Roman" w:hAnsi="Times New Roman"/>
-          <w:sz w:val="24"/>
+          <w:sz w:val="0"/>
         </w:rPr>
         <w:t>7.2  ASCO NPC remains an independent non-profit company established for public benefit purposes;</w:t>
       </w:r>
     </w:p>
     <w:p>
       <w:pPr>
-        <w:spacing w:after="80"/>
-        <w:ind w:left="720"/>
+        <w:spacing w:after="0"/>
+        <w:ind w:left="1829"/>
         <w:jc w:val="both"/>
       </w:pPr>
       <w:r>
         <w:rPr>
           <w:rFonts w:ascii="Times New Roman" w:hAnsi="Times New Roman"/>
-          <w:sz w:val="24"/>
+          <w:sz w:val="0"/>
         </w:rPr>
         <w:t>7.3  The Founder's recognition exists to protect institutional memory, history and founding values for future generations;</w:t>
       </w:r>
     </w:p>
     <w:p>
       <w:pPr>
-        <w:spacing w:after="80"/>
-        <w:ind w:left="720"/>
+        <w:spacing w:after="0"/>
+        <w:ind w:left="1829"/>
         <w:jc w:val="both"/>
       </w:pPr>
       <w:r>
         <w:rPr>
           <w:rFonts w:ascii="Times New Roman" w:hAnsi="Times New Roman"/>
-          <w:sz w:val="24"/>
+          <w:sz w:val="0"/>
         </w:rPr>
         <w:t>7.4  Future leadership structures shall respect and uphold the founding principles of ASCO NPC.</w:t>
       </w:r>
     </w:p>
     <w:p>
       <w:pPr>
-        <w:spacing w:after="120" w:before="120"/>
+        <w:spacing w:after="0" w:before="0"/>
         <w:jc w:val="center"/>
         <w:pBdr>
           <w:bottom w:val="single" w:sz="4" w:space="1" w:color="000000"/>
@@ -940,390 +958,395 @@
     </w:p>
     <w:p>
       <w:pPr>
-        <w:spacing w:after="120" w:before="240"/>
+        <w:spacing w:after="0" w:before="0"/>
         <w:jc w:val="left"/>
       </w:pPr>
       <w:r>
         <w:rPr>
           <w:rFonts w:ascii="Times New Roman" w:hAnsi="Times New Roman"/>
           <w:b/>
-          <w:sz w:val="28"/>
+          <w:sz w:val="0"/>
         </w:rPr>
         <w:t>8. CONFIRMATION OF GOVERNANCE STRUCTURE</w:t>
       </w:r>
     </w:p>
     <w:p>
       <w:pPr>
-        <w:spacing w:after="120" w:before="0"/>
+        <w:spacing w:after="0" w:before="0"/>
         <w:jc w:val="both"/>
       </w:pPr>
       <w:r>
         <w:rPr>
           <w:rFonts w:ascii="Times New Roman" w:hAnsi="Times New Roman"/>
-          <w:sz w:val="24"/>
+          <w:b w:val="0"/>
+          <w:sz w:val="0"/>
         </w:rPr>
         <w:t>The Board confirmed the following governance structure:</w:t>
       </w:r>
     </w:p>
     <w:p>
       <w:pPr>
-        <w:spacing w:after="120" w:before="160"/>
+        <w:spacing w:after="0" w:before="0"/>
         <w:jc w:val="left"/>
       </w:pPr>
       <w:r>
         <w:rPr>
           <w:rFonts w:ascii="Times New Roman" w:hAnsi="Times New Roman"/>
           <w:b/>
-          <w:sz w:val="24"/>
+          <w:sz w:val="0"/>
         </w:rPr>
         <w:t>8.1 Chairlady of the Board</w:t>
       </w:r>
     </w:p>
     <w:p>
       <w:pPr>
-        <w:spacing w:after="80"/>
+        <w:spacing w:after="0"/>
       </w:pPr>
       <w:r>
         <w:rPr>
           <w:rFonts w:ascii="Times New Roman" w:hAnsi="Times New Roman"/>
           <w:b/>
-          <w:sz w:val="24"/>
+          <w:sz w:val="0"/>
         </w:rPr>
         <w:t>Ms Busisiwe Makhosi Shandu</w:t>
       </w:r>
     </w:p>
     <w:p>
       <w:pPr>
-        <w:spacing w:after="120" w:before="0"/>
+        <w:spacing w:after="0" w:before="0"/>
         <w:jc w:val="both"/>
       </w:pPr>
       <w:r>
         <w:rPr>
           <w:rFonts w:ascii="Times New Roman" w:hAnsi="Times New Roman"/>
-          <w:sz w:val="24"/>
+          <w:b w:val="0"/>
+          <w:sz w:val="0"/>
         </w:rPr>
         <w:t>The Chairlady shall provide leadership to the Board, ensure effective governance oversight and safeguard the founding principles and long-term vision of ASCO NPC.</w:t>
       </w:r>
     </w:p>
     <w:p>
       <w:pPr>
-        <w:spacing w:after="120" w:before="160"/>
+        <w:spacing w:after="0" w:before="0"/>
         <w:jc w:val="left"/>
       </w:pPr>
       <w:r>
         <w:rPr>
           <w:rFonts w:ascii="Times New Roman" w:hAnsi="Times New Roman"/>
           <w:b/>
-          <w:sz w:val="24"/>
+          <w:sz w:val="0"/>
         </w:rPr>
         <w:t>8.2 Executive Director</w:t>
       </w:r>
     </w:p>
     <w:p>
       <w:pPr>
-        <w:spacing w:after="80"/>
+        <w:spacing w:after="0"/>
       </w:pPr>
       <w:r>
         <w:rPr>
           <w:rFonts w:ascii="Times New Roman" w:hAnsi="Times New Roman"/>
           <w:b/>
-          <w:sz w:val="24"/>
+          <w:sz w:val="0"/>
         </w:rPr>
         <w:t>Mr Bhekisisa Shandu</w:t>
       </w:r>
     </w:p>
     <w:p>
       <w:pPr>
-        <w:spacing w:after="120" w:before="0"/>
+        <w:spacing w:after="0" w:before="0"/>
         <w:jc w:val="both"/>
       </w:pPr>
       <w:r>
         <w:rPr>
           <w:rFonts w:ascii="Times New Roman" w:hAnsi="Times New Roman"/>
-          <w:sz w:val="24"/>
+          <w:b w:val="0"/>
+          <w:sz w:val="0"/>
         </w:rPr>
         <w:t>The Executive Director shall be responsible for:</w:t>
       </w:r>
     </w:p>
     <w:p>
       <w:pPr>
-        <w:spacing w:after="80"/>
-        <w:ind w:left="720"/>
+        <w:spacing w:after="0"/>
+        <w:ind w:left="1829"/>
         <w:jc w:val="both"/>
       </w:pPr>
       <w:r>
         <w:rPr>
           <w:rFonts w:ascii="Times New Roman" w:hAnsi="Times New Roman"/>
-          <w:sz w:val="24"/>
+          <w:sz w:val="0"/>
         </w:rPr>
         <w:t>• Implementation of Board resolutions;</w:t>
       </w:r>
     </w:p>
     <w:p>
       <w:pPr>
-        <w:spacing w:after="80"/>
-        <w:ind w:left="720"/>
+        <w:spacing w:after="0"/>
+        <w:ind w:left="1829"/>
         <w:jc w:val="both"/>
       </w:pPr>
       <w:r>
         <w:rPr>
           <w:rFonts w:ascii="Times New Roman" w:hAnsi="Times New Roman"/>
-          <w:sz w:val="24"/>
+          <w:sz w:val="0"/>
         </w:rPr>
         <w:t>• Day-to-day executive management of ASCO NPC;</w:t>
       </w:r>
     </w:p>
     <w:p>
       <w:pPr>
-        <w:spacing w:after="80"/>
-        <w:ind w:left="720"/>
+        <w:spacing w:after="0"/>
+        <w:ind w:left="1829"/>
         <w:jc w:val="both"/>
       </w:pPr>
       <w:r>
         <w:rPr>
           <w:rFonts w:ascii="Times New Roman" w:hAnsi="Times New Roman"/>
-          <w:sz w:val="24"/>
+          <w:sz w:val="0"/>
         </w:rPr>
         <w:t>• Coordination of organisational programmes and operations;</w:t>
       </w:r>
     </w:p>
     <w:p>
       <w:pPr>
-        <w:spacing w:after="80"/>
-        <w:ind w:left="720"/>
+        <w:spacing w:after="0"/>
+        <w:ind w:left="1829"/>
         <w:jc w:val="both"/>
       </w:pPr>
       <w:r>
         <w:rPr>
           <w:rFonts w:ascii="Times New Roman" w:hAnsi="Times New Roman"/>
-          <w:sz w:val="24"/>
+          <w:sz w:val="0"/>
         </w:rPr>
         <w:t>• Providing strategic leadership and institutional direction;</w:t>
       </w:r>
     </w:p>
     <w:p>
       <w:pPr>
-        <w:spacing w:after="80"/>
-        <w:ind w:left="720"/>
+        <w:spacing w:after="0"/>
+        <w:ind w:left="1829"/>
         <w:jc w:val="both"/>
       </w:pPr>
       <w:r>
         <w:rPr>
           <w:rFonts w:ascii="Times New Roman" w:hAnsi="Times New Roman"/>
-          <w:sz w:val="24"/>
+          <w:sz w:val="0"/>
         </w:rPr>
         <w:t>• Ensuring effective administration and execution of organisational objectives.</w:t>
       </w:r>
     </w:p>
     <w:p>
       <w:pPr>
-        <w:spacing w:after="120" w:before="160"/>
+        <w:spacing w:after="0" w:before="0"/>
         <w:jc w:val="left"/>
       </w:pPr>
       <w:r>
         <w:rPr>
           <w:rFonts w:ascii="Times New Roman" w:hAnsi="Times New Roman"/>
           <w:b/>
-          <w:sz w:val="24"/>
+          <w:sz w:val="0"/>
         </w:rPr>
         <w:t>8.3 Director: Head of ICT and Communications</w:t>
       </w:r>
     </w:p>
     <w:p>
       <w:pPr>
-        <w:spacing w:after="80"/>
+        <w:spacing w:after="0"/>
       </w:pPr>
       <w:r>
         <w:rPr>
           <w:rFonts w:ascii="Times New Roman" w:hAnsi="Times New Roman"/>
           <w:b/>
-          <w:sz w:val="24"/>
+          <w:sz w:val="0"/>
         </w:rPr>
         <w:t>Mr Thapelo Nelson Maqalika</w:t>
       </w:r>
     </w:p>
     <w:p>
       <w:pPr>
-        <w:spacing w:after="120" w:before="0"/>
+        <w:spacing w:after="0" w:before="0"/>
         <w:jc w:val="both"/>
       </w:pPr>
       <w:r>
         <w:rPr>
           <w:rFonts w:ascii="Times New Roman" w:hAnsi="Times New Roman"/>
-          <w:sz w:val="24"/>
+          <w:b w:val="0"/>
+          <w:sz w:val="0"/>
         </w:rPr>
         <w:t>The Board resolved that Mr Maqalika shall:</w:t>
       </w:r>
     </w:p>
     <w:p>
       <w:pPr>
-        <w:spacing w:after="80"/>
-        <w:ind w:left="720"/>
+        <w:spacing w:after="0"/>
+        <w:ind w:left="1829"/>
         <w:jc w:val="both"/>
       </w:pPr>
       <w:r>
         <w:rPr>
           <w:rFonts w:ascii="Times New Roman" w:hAnsi="Times New Roman"/>
-          <w:sz w:val="24"/>
+          <w:sz w:val="0"/>
         </w:rPr>
         <w:t>• Coordinate ICT and communication functions of ASCO NPC;</w:t>
       </w:r>
     </w:p>
     <w:p>
       <w:pPr>
-        <w:spacing w:after="80"/>
-        <w:ind w:left="720"/>
+        <w:spacing w:after="0"/>
+        <w:ind w:left="1829"/>
         <w:jc w:val="both"/>
       </w:pPr>
       <w:r>
         <w:rPr>
           <w:rFonts w:ascii="Times New Roman" w:hAnsi="Times New Roman"/>
-          <w:sz w:val="24"/>
+          <w:sz w:val="0"/>
         </w:rPr>
         <w:t>• Manage communication-related administrative processes;</w:t>
       </w:r>
     </w:p>
     <w:p>
       <w:pPr>
-        <w:spacing w:after="80"/>
-        <w:ind w:left="720"/>
+        <w:spacing w:after="0"/>
+        <w:ind w:left="1829"/>
         <w:jc w:val="both"/>
       </w:pPr>
       <w:r>
         <w:rPr>
           <w:rFonts w:ascii="Times New Roman" w:hAnsi="Times New Roman"/>
-          <w:sz w:val="24"/>
+          <w:sz w:val="0"/>
         </w:rPr>
         <w:t>• Be specifically mandated to coordinate the submission and registration process of the adopted MOI with the Companies and Intellectual Property Commission (CIPC);</w:t>
       </w:r>
     </w:p>
     <w:p>
       <w:pPr>
-        <w:spacing w:after="80"/>
-        <w:ind w:left="720"/>
+        <w:spacing w:after="0"/>
+        <w:ind w:left="1829"/>
         <w:jc w:val="both"/>
       </w:pPr>
       <w:r>
         <w:rPr>
           <w:rFonts w:ascii="Times New Roman" w:hAnsi="Times New Roman"/>
-          <w:sz w:val="24"/>
+          <w:sz w:val="0"/>
         </w:rPr>
         <w:t>• Work directly with the Office of the Executive Director to ensure all required documentation, correspondence and regulatory requirements are properly managed.</w:t>
       </w:r>
     </w:p>
     <w:p>
       <w:pPr>
-        <w:spacing w:after="120" w:before="160"/>
+        <w:spacing w:after="0" w:before="0"/>
         <w:jc w:val="left"/>
       </w:pPr>
       <w:r>
         <w:rPr>
           <w:rFonts w:ascii="Times New Roman" w:hAnsi="Times New Roman"/>
           <w:b/>
-          <w:sz w:val="24"/>
+          <w:sz w:val="0"/>
         </w:rPr>
         <w:t>8.4 Director: People and Culture</w:t>
       </w:r>
     </w:p>
     <w:p>
       <w:pPr>
-        <w:spacing w:after="80"/>
+        <w:spacing w:after="0"/>
       </w:pPr>
       <w:r>
         <w:rPr>
           <w:rFonts w:ascii="Times New Roman" w:hAnsi="Times New Roman"/>
           <w:b/>
-          <w:sz w:val="24"/>
+          <w:sz w:val="0"/>
         </w:rPr>
         <w:t>Mr Khulekani Gumede</w:t>
       </w:r>
     </w:p>
     <w:p>
       <w:pPr>
-        <w:spacing w:after="120" w:before="0"/>
+        <w:spacing w:after="0" w:before="0"/>
         <w:jc w:val="both"/>
       </w:pPr>
       <w:r>
         <w:rPr>
           <w:rFonts w:ascii="Times New Roman" w:hAnsi="Times New Roman"/>
-          <w:sz w:val="24"/>
+          <w:b w:val="0"/>
+          <w:sz w:val="0"/>
         </w:rPr>
         <w:t>The Board confirmed that Mr Gumede shall provide leadership and oversight relating to:</w:t>
       </w:r>
     </w:p>
     <w:p>
       <w:pPr>
-        <w:spacing w:after="80"/>
-        <w:ind w:left="720"/>
+        <w:spacing w:after="0"/>
+        <w:ind w:left="1829"/>
         <w:jc w:val="both"/>
       </w:pPr>
       <w:r>
         <w:rPr>
           <w:rFonts w:ascii="Times New Roman" w:hAnsi="Times New Roman"/>
-          <w:sz w:val="24"/>
+          <w:sz w:val="0"/>
         </w:rPr>
         <w:t>• People management;</w:t>
       </w:r>
     </w:p>
     <w:p>
       <w:pPr>
-        <w:spacing w:after="80"/>
-        <w:ind w:left="720"/>
+        <w:spacing w:after="0"/>
+        <w:ind w:left="1829"/>
         <w:jc w:val="both"/>
       </w:pPr>
       <w:r>
         <w:rPr>
           <w:rFonts w:ascii="Times New Roman" w:hAnsi="Times New Roman"/>
-          <w:sz w:val="24"/>
+          <w:sz w:val="0"/>
         </w:rPr>
         <w:t>• Organisational culture;</w:t>
       </w:r>
     </w:p>
     <w:p>
       <w:pPr>
-        <w:spacing w:after="80"/>
-        <w:ind w:left="720"/>
+        <w:spacing w:after="0"/>
+        <w:ind w:left="1829"/>
         <w:jc w:val="both"/>
       </w:pPr>
       <w:r>
         <w:rPr>
           <w:rFonts w:ascii="Times New Roman" w:hAnsi="Times New Roman"/>
-          <w:sz w:val="24"/>
+          <w:sz w:val="0"/>
         </w:rPr>
         <w:t>• Human capital development;</w:t>
       </w:r>
     </w:p>
     <w:p>
       <w:pPr>
-        <w:spacing w:after="80"/>
-        <w:ind w:left="720"/>
+        <w:spacing w:after="0"/>
+        <w:ind w:left="1829"/>
         <w:jc w:val="both"/>
       </w:pPr>
       <w:r>
         <w:rPr>
           <w:rFonts w:ascii="Times New Roman" w:hAnsi="Times New Roman"/>
-          <w:sz w:val="24"/>
+          <w:sz w:val="0"/>
         </w:rPr>
         <w:t>• Governance participation;</w:t>
       </w:r>
     </w:p>
     <w:p>
       <w:pPr>
-        <w:spacing w:after="80"/>
-        <w:ind w:left="720"/>
+        <w:spacing w:after="0"/>
+        <w:ind w:left="1829"/>
         <w:jc w:val="both"/>
       </w:pPr>
       <w:r>
         <w:rPr>
           <w:rFonts w:ascii="Times New Roman" w:hAnsi="Times New Roman"/>
-          <w:sz w:val="24"/>
+          <w:sz w:val="0"/>
         </w:rPr>
         <w:t>• Supporting effective institutional growth.</w:t>
       </w:r>
     </w:p>
     <w:p>
       <w:pPr>
-        <w:spacing w:after="120" w:before="120"/>
+        <w:spacing w:after="0" w:before="0"/>
         <w:jc w:val="center"/>
         <w:pBdr>
           <w:bottom w:val="single" w:sz="4" w:space="1" w:color="000000"/>
@@ -1332,159 +1355,159 @@
     </w:p>
     <w:p>
       <w:pPr>
-        <w:spacing w:after="120" w:before="240"/>
+        <w:spacing w:after="0" w:before="0"/>
         <w:jc w:val="left"/>
       </w:pPr>
       <w:r>
         <w:rPr>
           <w:rFonts w:ascii="Times New Roman" w:hAnsi="Times New Roman"/>
           <w:b/>
-          <w:sz w:val="28"/>
+          <w:sz w:val="0"/>
         </w:rPr>
         <w:t>9. BOARD RESOLUTION: ADOPTION OF CUSTOMISED MOI</w:t>
       </w:r>
     </w:p>
     <w:p>
       <w:pPr>
-        <w:spacing w:after="120" w:before="0"/>
+        <w:spacing w:after="0" w:before="0"/>
         <w:jc w:val="both"/>
       </w:pPr>
       <w:r>
         <w:rPr>
           <w:rFonts w:ascii="Times New Roman" w:hAnsi="Times New Roman"/>
-          <w:sz w:val="24"/>
+          <w:b w:val="0"/>
+          <w:sz w:val="0"/>
         </w:rPr>
         <w:t>After thorough consideration and discussion, the Board unanimously adopted the following resolution:</w:t>
       </w:r>
     </w:p>
     <w:p>
       <w:pPr>
-        <w:spacing w:before="160" w:after="80"/>
-        <w:jc w:val="left"/>
+        <w:spacing w:before="0" w:after="0"/>
       </w:pPr>
       <w:r>
         <w:rPr>
           <w:rFonts w:ascii="Times New Roman" w:hAnsi="Times New Roman"/>
           <w:b/>
-          <w:sz w:val="24"/>
+          <w:sz w:val="0"/>
         </w:rPr>
         <w:t>RESOLUTION NUMBER: ASCO/BOD/MOI/2026/01</w:t>
       </w:r>
     </w:p>
     <w:p>
       <w:pPr>
-        <w:spacing w:after="80"/>
+        <w:spacing w:after="0"/>
       </w:pPr>
       <w:r>
         <w:rPr>
           <w:rFonts w:ascii="Times New Roman" w:hAnsi="Times New Roman"/>
           <w:b/>
-          <w:sz w:val="24"/>
+          <w:sz w:val="0"/>
         </w:rPr>
         <w:t>IT IS HEREBY RESOLVED THAT:</w:t>
       </w:r>
     </w:p>
     <w:p>
       <w:pPr>
-        <w:spacing w:after="80"/>
-        <w:ind w:left="720"/>
+        <w:spacing w:after="0"/>
+        <w:ind w:left="1829"/>
         <w:jc w:val="both"/>
       </w:pPr>
       <w:r>
         <w:rPr>
           <w:rFonts w:ascii="Times New Roman" w:hAnsi="Times New Roman"/>
-          <w:sz w:val="24"/>
+          <w:sz w:val="0"/>
         </w:rPr>
         <w:t>1.  The Board of Directors hereby approves and adopts the customised Memorandum of Incorporation of African Solidarity Civic Organisation NPC.</w:t>
       </w:r>
     </w:p>
     <w:p>
       <w:pPr>
-        <w:spacing w:after="80"/>
-        <w:ind w:left="720"/>
+        <w:spacing w:after="0"/>
+        <w:ind w:left="1829"/>
         <w:jc w:val="both"/>
       </w:pPr>
       <w:r>
         <w:rPr>
           <w:rFonts w:ascii="Times New Roman" w:hAnsi="Times New Roman"/>
-          <w:sz w:val="24"/>
+          <w:sz w:val="0"/>
         </w:rPr>
         <w:t>2.  The adopted MOI shall become the governing constitutional document of ASCO NPC and shall regulate the affairs, governance and administration of the organisation.</w:t>
       </w:r>
     </w:p>
     <w:p>
       <w:pPr>
-        <w:spacing w:after="80"/>
-        <w:ind w:left="720"/>
+        <w:spacing w:after="0"/>
+        <w:ind w:left="1829"/>
         <w:jc w:val="both"/>
       </w:pPr>
       <w:r>
         <w:rPr>
           <w:rFonts w:ascii="Times New Roman" w:hAnsi="Times New Roman"/>
-          <w:sz w:val="24"/>
+          <w:sz w:val="0"/>
         </w:rPr>
         <w:t>3.  The Board confirms that the customised MOI reflects ASCO NPC's commitment to good governance, accountability, transparency, sustainability and compliance with applicable legislation.</w:t>
       </w:r>
     </w:p>
     <w:p>
       <w:pPr>
-        <w:spacing w:after="80"/>
-        <w:ind w:left="720"/>
+        <w:spacing w:after="0"/>
+        <w:ind w:left="1829"/>
         <w:jc w:val="both"/>
       </w:pPr>
       <w:r>
         <w:rPr>
           <w:rFonts w:ascii="Times New Roman" w:hAnsi="Times New Roman"/>
-          <w:sz w:val="24"/>
+          <w:sz w:val="0"/>
         </w:rPr>
         <w:t>4.  Mr Thapelo Nelson Maqalika, Director: Head of ICT and Communications, is hereby authorised and mandated to coordinate the registration and submission process of the adopted MOI with CIPC.</w:t>
       </w:r>
     </w:p>
     <w:p>
       <w:pPr>
-        <w:spacing w:after="80"/>
-        <w:ind w:left="720"/>
+        <w:spacing w:after="0"/>
+        <w:ind w:left="1829"/>
         <w:jc w:val="both"/>
       </w:pPr>
       <w:r>
         <w:rPr>
           <w:rFonts w:ascii="Times New Roman" w:hAnsi="Times New Roman"/>
-          <w:sz w:val="24"/>
+          <w:sz w:val="0"/>
         </w:rPr>
         <w:t>5.  Mr Thapelo Nelson Maqalika shall work directly with the Office of the Executive Director, Mr Bhekisisa Shandu, to ensure successful completion of all administrative and regulatory requirements.</w:t>
       </w:r>
     </w:p>
     <w:p>
       <w:pPr>
-        <w:spacing w:after="80"/>
-        <w:ind w:left="720"/>
+        <w:spacing w:after="0"/>
+        <w:ind w:left="1829"/>
         <w:jc w:val="both"/>
       </w:pPr>
       <w:r>
         <w:rPr>
           <w:rFonts w:ascii="Times New Roman" w:hAnsi="Times New Roman"/>
-          <w:sz w:val="24"/>
+          <w:sz w:val="0"/>
         </w:rPr>
         <w:t>6.  The Executive Director shall provide executive oversight, institutional support and coordination necessary to implement this resolution.</w:t>
       </w:r>
     </w:p>
     <w:p>
       <w:pPr>
-        <w:spacing w:after="80"/>
-        <w:ind w:left="720"/>
+        <w:spacing w:after="0"/>
+        <w:ind w:left="1829"/>
         <w:jc w:val="both"/>
       </w:pPr>
       <w:r>
         <w:rPr>
           <w:rFonts w:ascii="Times New Roman" w:hAnsi="Times New Roman"/>
-          <w:sz w:val="24"/>
+          <w:sz w:val="0"/>
         </w:rPr>
         <w:t>7.  The Chairlady of the Board and any authorised Director are empowered to sign documents necessary to give effect to this resolution.</w:t>
       </w:r>
     </w:p>
     <w:p>
       <w:pPr>
-        <w:spacing w:after="120" w:before="120"/>
+        <w:spacing w:after="0" w:before="0"/>
         <w:jc w:val="center"/>
         <w:pBdr>
           <w:bottom w:val="single" w:sz="4" w:space="1" w:color="000000"/>
@@ -1493,76 +1516,77 @@
     </w:p>
     <w:p>
       <w:pPr>
-        <w:spacing w:after="120" w:before="240"/>
+        <w:spacing w:after="0" w:before="0"/>
         <w:jc w:val="left"/>
       </w:pPr>
       <w:r>
         <w:rPr>
           <w:rFonts w:ascii="Times New Roman" w:hAnsi="Times New Roman"/>
           <w:b/>
-          <w:sz w:val="28"/>
+          <w:sz w:val="0"/>
         </w:rPr>
         <w:t>10. IMPLEMENTATION OF THE RESOLUTION</w:t>
       </w:r>
     </w:p>
     <w:p>
       <w:pPr>
-        <w:spacing w:after="120" w:before="0"/>
+        <w:spacing w:after="0" w:before="0"/>
         <w:jc w:val="both"/>
       </w:pPr>
       <w:r>
         <w:rPr>
           <w:rFonts w:ascii="Times New Roman" w:hAnsi="Times New Roman"/>
-          <w:sz w:val="24"/>
+          <w:b w:val="0"/>
+          <w:sz w:val="0"/>
         </w:rPr>
         <w:t>The Board directed that:</w:t>
       </w:r>
     </w:p>
     <w:p>
       <w:pPr>
-        <w:spacing w:after="80"/>
-        <w:ind w:left="720"/>
+        <w:spacing w:after="0"/>
+        <w:ind w:left="1829"/>
         <w:jc w:val="both"/>
       </w:pPr>
       <w:r>
         <w:rPr>
           <w:rFonts w:ascii="Times New Roman" w:hAnsi="Times New Roman"/>
-          <w:sz w:val="24"/>
+          <w:sz w:val="0"/>
         </w:rPr>
         <w:t>10.1  The adopted MOI shall be submitted to CIPC through the appropriate channels;</w:t>
       </w:r>
     </w:p>
     <w:p>
       <w:pPr>
-        <w:spacing w:after="80"/>
-        <w:ind w:left="720"/>
+        <w:spacing w:after="0"/>
+        <w:ind w:left="1829"/>
         <w:jc w:val="both"/>
       </w:pPr>
       <w:r>
         <w:rPr>
           <w:rFonts w:ascii="Times New Roman" w:hAnsi="Times New Roman"/>
-          <w:sz w:val="24"/>
+          <w:sz w:val="0"/>
         </w:rPr>
         <w:t>10.2  All organisational policies, governance documents and operational frameworks shall be reviewed for alignment with the adopted MOI;</w:t>
       </w:r>
     </w:p>
     <w:p>
       <w:pPr>
-        <w:spacing w:after="80"/>
-        <w:ind w:left="720"/>
+        <w:spacing w:after="0"/>
+        <w:ind w:left="1829"/>
         <w:jc w:val="both"/>
       </w:pPr>
       <w:r>
         <w:rPr>
           <w:rFonts w:ascii="Times New Roman" w:hAnsi="Times New Roman"/>
-          <w:sz w:val="24"/>
+          <w:sz w:val="0"/>
         </w:rPr>
         <w:t>10.3  The governance framework shall support ASCO NPC's future applications, including engagements relating to SARS PBO status, Section 18A approval, donor compliance and international partnerships.</w:t>
       </w:r>
     </w:p>
     <w:p>
       <w:pPr>
-        <w:spacing w:after="120" w:before="120"/>
+        <w:spacing w:after="0" w:before="0"/>
         <w:jc w:val="center"/>
         <w:pBdr>
           <w:bottom w:val="single" w:sz="4" w:space="1" w:color="000000"/>
@@ -1571,46 +1595,47 @@
     </w:p>
     <w:p>
       <w:pPr>
-        <w:spacing w:after="120" w:before="240"/>
+        <w:spacing w:after="0" w:before="0"/>
         <w:jc w:val="left"/>
       </w:pPr>
       <w:r>
         <w:rPr>
           <w:rFonts w:ascii="Times New Roman" w:hAnsi="Times New Roman"/>
           <w:b/>
-          <w:sz w:val="28"/>
+          <w:sz w:val="0"/>
         </w:rPr>
         <w:t>11. CLOSURE</w:t>
       </w:r>
     </w:p>
     <w:p>
       <w:pPr>
-        <w:spacing w:after="120" w:before="0"/>
+        <w:spacing w:after="0" w:before="0"/>
         <w:jc w:val="both"/>
       </w:pPr>
       <w:r>
         <w:rPr>
           <w:rFonts w:ascii="Times New Roman" w:hAnsi="Times New Roman"/>
-          <w:sz w:val="24"/>
+          <w:b w:val="0"/>
+          <w:sz w:val="0"/>
         </w:rPr>
         <w:t>There being no further matters for consideration, the Chairlady thanked all Directors for their participation and declared the meeting officially closed.</w:t>
       </w:r>
     </w:p>
     <w:p>
       <w:pPr>
-        <w:spacing w:before="160"/>
+        <w:spacing w:before="0"/>
       </w:pPr>
       <w:r>
         <w:rPr>
           <w:rFonts w:ascii="Times New Roman" w:hAnsi="Times New Roman"/>
-          <w:sz w:val="24"/>
+          <w:sz w:val="0"/>
         </w:rPr>
         <w:t>Time closed: ____________________</w:t>
       </w:r>
     </w:p>
     <w:p>
       <w:pPr>
-        <w:spacing w:after="120" w:before="120"/>
+        <w:spacing w:after="0" w:before="0"/>
         <w:jc w:val="center"/>
         <w:pBdr>
           <w:bottom w:val="single" w:sz="4" w:space="1" w:color="000000"/>
@@ -1619,265 +1644,582 @@
     </w:p>
     <w:p>
       <w:pPr>
-        <w:spacing w:after="240" w:before="240"/>
+        <w:spacing w:after="0" w:before="0"/>
         <w:jc w:val="center"/>
       </w:pPr>
       <w:r>
         <w:rPr>
           <w:rFonts w:ascii="Times New Roman" w:hAnsi="Times New Roman"/>
           <w:b/>
-          <w:sz w:val="28"/>
+          <w:sz w:val="0"/>
         </w:rPr>
         <w:t>SIGNATURES OF DIRECTORS</w:t>
-      </w:r>
-    </w:p>
-    <w:p>
-      <w:pPr>
-        <w:spacing w:before="360" w:after="40"/>
-        <w:jc w:val="left"/>
-      </w:pPr>
-      <w:r>
-        <w:rPr>
-          <w:rFonts w:ascii="Times New Roman" w:hAnsi="Times New Roman"/>
-          <w:b/>
-          <w:sz w:val="24"/>
-        </w:rPr>
-        <w:t>CHAIRLADY OF THE BOARD</w:t>
-      </w:r>
-    </w:p>
-    <w:p>
-      <w:pPr>
-        <w:spacing w:after="40"/>
-        <w:jc w:val="left"/>
-      </w:pPr>
-      <w:r>
-        <w:rPr>
-          <w:rFonts w:ascii="Times New Roman" w:hAnsi="Times New Roman"/>
-          <w:sz w:val="24"/>
-        </w:rPr>
-        <w:t>Ms Busisiwe Makhosi Shandu</w:t>
-      </w:r>
-    </w:p>
-    <w:p>
-      <w:pPr>
-        <w:spacing w:after="40"/>
-        <w:jc w:val="left"/>
-      </w:pPr>
-      <w:r>
-        <w:rPr>
-          <w:rFonts w:ascii="Times New Roman" w:hAnsi="Times New Roman"/>
-          <w:sz w:val="24"/>
-        </w:rPr>
-        <w:t>Signature: ____________________</w:t>
-      </w:r>
-    </w:p>
-    <w:p>
-      <w:pPr>
-        <w:spacing w:after="120"/>
-        <w:jc w:val="left"/>
-      </w:pPr>
-      <w:r>
-        <w:rPr>
-          <w:rFonts w:ascii="Times New Roman" w:hAnsi="Times New Roman"/>
-          <w:sz w:val="24"/>
-        </w:rPr>
-        <w:t>Date: ____________________</w:t>
-      </w:r>
-    </w:p>
-    <w:p>
-      <w:pPr>
-        <w:spacing w:after="120" w:before="120"/>
-        <w:jc w:val="center"/>
-        <w:pBdr>
-          <w:bottom w:val="single" w:sz="4" w:space="1" w:color="000000"/>
-        </w:pBdr>
-      </w:pPr>
-    </w:p>
-    <w:p>
-      <w:pPr>
-        <w:spacing w:before="360" w:after="40"/>
-        <w:jc w:val="left"/>
-      </w:pPr>
-      <w:r>
-        <w:rPr>
-          <w:rFonts w:ascii="Times New Roman" w:hAnsi="Times New Roman"/>
-          <w:b/>
-          <w:sz w:val="24"/>
-        </w:rPr>
-        <w:t>EXECUTIVE DIRECTOR</w:t>
-      </w:r>
-    </w:p>
-    <w:p>
-      <w:pPr>
-        <w:spacing w:after="40"/>
-        <w:jc w:val="left"/>
-      </w:pPr>
-      <w:r>
-        <w:rPr>
-          <w:rFonts w:ascii="Times New Roman" w:hAnsi="Times New Roman"/>
-          <w:sz w:val="24"/>
-        </w:rPr>
-        <w:t>Mr Bhekisisa Shandu</w:t>
-      </w:r>
-    </w:p>
-    <w:p>
-      <w:pPr>
-        <w:spacing w:after="40"/>
-        <w:jc w:val="left"/>
-      </w:pPr>
-      <w:r>
-        <w:rPr>
-          <w:rFonts w:ascii="Times New Roman" w:hAnsi="Times New Roman"/>
-          <w:sz w:val="24"/>
-        </w:rPr>
-        <w:t>Signature: ____________________</w:t>
-      </w:r>
-    </w:p>
-    <w:p>
-      <w:pPr>
-        <w:spacing w:after="120"/>
-        <w:jc w:val="left"/>
-      </w:pPr>
-      <w:r>
-        <w:rPr>
-          <w:rFonts w:ascii="Times New Roman" w:hAnsi="Times New Roman"/>
-          <w:sz w:val="24"/>
-        </w:rPr>
-        <w:t>Date: ____________________</w:t>
-      </w:r>
-    </w:p>
-    <w:p>
-      <w:pPr>
-        <w:spacing w:after="120" w:before="120"/>
-        <w:jc w:val="center"/>
-        <w:pBdr>
-          <w:bottom w:val="single" w:sz="4" w:space="1" w:color="000000"/>
-        </w:pBdr>
-      </w:pPr>
-    </w:p>
-    <w:p>
-      <w:pPr>
-        <w:spacing w:before="360" w:after="40"/>
-        <w:jc w:val="left"/>
-      </w:pPr>
-      <w:r>
-        <w:rPr>
-          <w:rFonts w:ascii="Times New Roman" w:hAnsi="Times New Roman"/>
-          <w:b/>
-          <w:sz w:val="24"/>
-        </w:rPr>
-        <w:t>DIRECTOR: HEAD OF ICT AND COMMUNICATIONS</w:t>
-      </w:r>
-    </w:p>
-    <w:p>
-      <w:pPr>
-        <w:spacing w:after="40"/>
-        <w:jc w:val="left"/>
-      </w:pPr>
-      <w:r>
-        <w:rPr>
-          <w:rFonts w:ascii="Times New Roman" w:hAnsi="Times New Roman"/>
-          <w:sz w:val="24"/>
-        </w:rPr>
-        <w:t>Mr Thapelo Nelson Maqalika</w:t>
-      </w:r>
-    </w:p>
-    <w:p>
-      <w:pPr>
-        <w:spacing w:after="40"/>
-        <w:jc w:val="left"/>
-      </w:pPr>
-      <w:r>
-        <w:rPr>
-          <w:rFonts w:ascii="Times New Roman" w:hAnsi="Times New Roman"/>
-          <w:sz w:val="24"/>
-        </w:rPr>
-        <w:t>Signature: ____________________</w:t>
-      </w:r>
-    </w:p>
-    <w:p>
-      <w:pPr>
-        <w:spacing w:after="120"/>
-        <w:jc w:val="left"/>
-      </w:pPr>
-      <w:r>
-        <w:rPr>
-          <w:rFonts w:ascii="Times New Roman" w:hAnsi="Times New Roman"/>
-          <w:sz w:val="24"/>
-        </w:rPr>
-        <w:t>Date: ____________________</w:t>
-      </w:r>
-    </w:p>
-    <w:p>
-      <w:pPr>
-        <w:spacing w:after="120" w:before="120"/>
-        <w:jc w:val="center"/>
-        <w:pBdr>
-          <w:bottom w:val="single" w:sz="4" w:space="1" w:color="000000"/>
-        </w:pBdr>
-      </w:pPr>
-    </w:p>
-    <w:p>
-      <w:pPr>
-        <w:spacing w:before="360" w:after="40"/>
-        <w:jc w:val="left"/>
-      </w:pPr>
-      <w:r>
-        <w:rPr>
-          <w:rFonts w:ascii="Times New Roman" w:hAnsi="Times New Roman"/>
-          <w:b/>
-          <w:sz w:val="24"/>
-        </w:rPr>
-        <w:t>DIRECTOR: PEOPLE AND CULTURE</w:t>
-      </w:r>
-    </w:p>
-    <w:p>
-      <w:pPr>
-        <w:spacing w:after="40"/>
-        <w:jc w:val="left"/>
-      </w:pPr>
-      <w:r>
-        <w:rPr>
-          <w:rFonts w:ascii="Times New Roman" w:hAnsi="Times New Roman"/>
-          <w:sz w:val="24"/>
-        </w:rPr>
-        <w:t>Mr Khulekani Gumede</w:t>
-      </w:r>
-    </w:p>
-    <w:p>
-      <w:pPr>
-        <w:spacing w:after="40"/>
-        <w:jc w:val="left"/>
-      </w:pPr>
-      <w:r>
-        <w:rPr>
-          <w:rFonts w:ascii="Times New Roman" w:hAnsi="Times New Roman"/>
-          <w:sz w:val="24"/>
-        </w:rPr>
-        <w:t>Signature: ____________________</w:t>
-      </w:r>
-    </w:p>
-    <w:p>
-      <w:pPr>
-        <w:spacing w:after="120"/>
-        <w:jc w:val="left"/>
-      </w:pPr>
-      <w:r>
-        <w:rPr>
-          <w:rFonts w:ascii="Times New Roman" w:hAnsi="Times New Roman"/>
-          <w:sz w:val="24"/>
-        </w:rPr>
-        <w:t>Date: ____________________</w:t>
       </w:r>
     </w:p>
     <w:sectPr>
       <w:headerReference w:type="default" r:id="rId9"/>
       <w:footerReference w:type="default" r:id="rId10"/>
       <w:pgSz w:w="12240" w:h="15840"/>
-      <w:pgMar w:top="1440" w:right="1440" w:bottom="1440" w:left="1440" w:header="720" w:footer="720" w:gutter="0"/>
+      <w:pgMar w:top="1440" w:right="1440" w:bottom="1440" w:left="1440" w:header="708" w:footer="708" w:gutter="0"/>
       <w:cols w:space="720"/>
       <w:docGrid w:linePitch="360"/>
     </w:sectPr>
+    <w:p>
+      <w:pPr>
+        <w:keepNext/>
+        <w:spacing w:before="180" w:after="90" w:line="276" w:lineRule="auto"/>
+      </w:pPr>
+      <w:r>
+        <w:rPr>
+          <w:b/>
+          <w:color w:val="145A32"/>
+          <w:sz w:val="22"/>
+        </w:rPr>
+        <w:t>ADOPTED BY THE BOARD OF DIRECTORS OF ASCO NPC</w:t>
+      </w:r>
+    </w:p>
+    <w:p>
+      <w:r>
+        <w:t>The policy is adopted by the ASCO Board of Directors and takes effect on 06 September 2026.</w:t>
+      </w:r>
+    </w:p>
+    <w:p/>
+    <w:tbl>
+      <w:tblPr>
+        <w:tblW w:w="0" w:type="auto"/>
+        <w:jc w:val="center"/>
+        <w:tblLayout w:type="fixed"/>
+        <w:tblLook w:val="04A0" w:firstRow="1" w:lastRow="0" w:firstColumn="1" w:lastColumn="0" w:noHBand="0" w:noVBand="1"/>
+      </w:tblPr>
+      <w:tblGrid>
+        <w:gridCol w:w="4968"/>
+        <w:gridCol w:w="4968"/>
+      </w:tblGrid>
+      <w:tr>
+        <w:trPr>
+          <w:cantSplit/>
+          <w:jc w:val="center"/>
+        </w:trPr>
+        <w:tc>
+          <w:tcPr>
+            <w:tcW w:w="4968" w:type="dxa"/>
+            <w:tcBorders>
+              <w:top w:val="single" w:sz="5" w:space="0" w:color="D8DDD8"/>
+              <w:left w:val="single" w:sz="5" w:space="0" w:color="D8DDD8"/>
+              <w:bottom w:val="single" w:sz="5" w:space="0" w:color="D8DDD8"/>
+              <w:right w:val="single" w:sz="5" w:space="0" w:color="D8DDD8"/>
+            </w:tcBorders>
+            <w:shd w:val="clear" w:color="auto" w:fill="F7F8F5"/>
+          </w:tcPr>
+          <w:p>
+            <w:r>
+              <w:rPr>
+                <w:noProof/>
+              </w:rPr>
+              <w:drawing>
+                <wp:anchor distT="0" distB="0" distL="114300" distR="114300" simplePos="0" relativeHeight="251659264" behindDoc="0" locked="0" layoutInCell="1" allowOverlap="1" wp14:anchorId="3E14C20B" wp14:editId="3D6500E1">
+                  <wp:simplePos x="0" y="0"/>
+                  <wp:positionH relativeFrom="column">
+                    <wp:posOffset>257175</wp:posOffset>
+                  </wp:positionH>
+                  <wp:positionV relativeFrom="paragraph">
+                    <wp:posOffset>283845</wp:posOffset>
+                  </wp:positionV>
+                  <wp:extent cx="2152650" cy="485775"/>
+                  <wp:effectExtent l="0" t="0" r="0" b="0"/>
+                  <wp:wrapNone/>
+                  <wp:docPr id="1466813974" name="Picture 2"/>
+                  <wp:cNvGraphicFramePr>
+                    <a:graphicFrameLocks xmlns:a="http://schemas.openxmlformats.org/drawingml/2006/main" noChangeAspect="1"/>
+                  </wp:cNvGraphicFramePr>
+                  <a:graphic xmlns:a="http://schemas.openxmlformats.org/drawingml/2006/main">
+                    <a:graphicData uri="http://schemas.openxmlformats.org/drawingml/2006/picture">
+                      <pic:pic xmlns:pic="http://schemas.openxmlformats.org/drawingml/2006/picture">
+                        <pic:nvPicPr>
+                          <pic:cNvPr id="1466813974" name="Picture 1466813974"/>
+                          <pic:cNvPicPr/>
+                        </pic:nvPicPr>
+                        <pic:blipFill rotWithShape="1">
+                          <a:blip r:embed="rId8">
+                            <a:biLevel thresh="75000"/>
+                          </a:blip>
+                          <a:srcRect l="9786" t="42903" r="18875" b="40265"/>
+                          <a:stretch>
+                            <a:fillRect/>
+                          </a:stretch>
+                        </pic:blipFill>
+                        <pic:spPr bwMode="auto">
+                          <a:xfrm>
+                            <a:off x="0" y="0"/>
+                            <a:ext cx="2152650" cy="485775"/>
+                          </a:xfrm>
+                          <a:prstGeom prst="rect">
+                            <a:avLst/>
+                          </a:prstGeom>
+                          <a:ln>
+                            <a:noFill/>
+                          </a:ln>
+                          <a:extLst>
+                            <a:ext uri="{53640926-AAD7-44D8-BBD7-CCE9431645EC}">
+                              <a14:shadowObscured xmlns:a14="http://schemas.microsoft.com/office/drawing/2010/main"/>
+                            </a:ext>
+                          </a:extLst>
+                        </pic:spPr>
+                      </pic:pic>
+                    </a:graphicData>
+                  </a:graphic>
+                  <wp14:sizeRelH relativeFrom="margin">
+                    <wp14:pctWidth>0</wp14:pctWidth>
+                  </wp14:sizeRelH>
+                  <wp14:sizeRelV relativeFrom="margin">
+                    <wp14:pctHeight>0</wp14:pctHeight>
+                  </wp14:sizeRelV>
+                </wp:anchor>
+              </w:drawing>
+            </w:r>
+            <w:r>
+              <w:rPr>
+                <w:b/>
+                <w:color w:val="145A32"/>
+                <w:sz w:val="16"/>
+              </w:rPr>
+              <w:t>CHAIR LADY</w:t>
+            </w:r>
+            <w:r>
+              <w:rPr>
+                <w:b/>
+                <w:sz w:val="18"/>
+              </w:rPr>
+              <w:br/>
+              <w:t>Ms. Busisiwe Makhosi Shandu</w:t>
+            </w:r>
+            <w:r>
+              <w:br/>
+            </w:r>
+            <w:r>
+              <w:br/>
+              <w:t xml:space="preserve">Signature: </w:t>
+            </w:r>
+            <w:r>
+              <w:br/>
+              <w:t>____________________________</w:t>
+            </w:r>
+            <w:r>
+              <w:br/>
+            </w:r>
+            <w:r>
+              <w:br/>
+              <w:t xml:space="preserve">Date: </w:t>
+            </w:r>
+            <w:r>
+              <w:rPr>
+                <w:b/>
+                <w:bCs/>
+              </w:rPr>
+              <w:t>6 September 2026</w:t>
+            </w:r>
+            <w:r>
+              <w:br/>
+              <w:t>____________________________</w:t>
+            </w:r>
+          </w:p>
+        </w:tc>
+        <w:tc>
+          <w:tcPr>
+            <w:tcW w:w="4968" w:type="dxa"/>
+            <w:tcBorders>
+              <w:top w:val="single" w:sz="5" w:space="0" w:color="D8DDD8"/>
+              <w:left w:val="single" w:sz="5" w:space="0" w:color="D8DDD8"/>
+              <w:bottom w:val="single" w:sz="5" w:space="0" w:color="D8DDD8"/>
+              <w:right w:val="single" w:sz="5" w:space="0" w:color="D8DDD8"/>
+            </w:tcBorders>
+            <w:shd w:val="clear" w:color="auto" w:fill="F7F8F5"/>
+          </w:tcPr>
+          <w:p>
+            <w:pPr>
+              <w:rPr>
+                <w:noProof/>
+              </w:rPr>
+            </w:pPr>
+            <w:r>
+              <w:rPr>
+                <w:noProof/>
+              </w:rPr>
+              <w:drawing>
+                <wp:anchor distT="0" distB="0" distL="114300" distR="114300" simplePos="0" relativeHeight="251662336" behindDoc="0" locked="0" layoutInCell="1" allowOverlap="1" wp14:anchorId="66DF8C41" wp14:editId="2914959F">
+                  <wp:simplePos x="0" y="0"/>
+                  <wp:positionH relativeFrom="column">
+                    <wp:posOffset>236220</wp:posOffset>
+                  </wp:positionH>
+                  <wp:positionV relativeFrom="paragraph">
+                    <wp:posOffset>198120</wp:posOffset>
+                  </wp:positionV>
+                  <wp:extent cx="2472690" cy="561975"/>
+                  <wp:effectExtent l="0" t="0" r="0" b="0"/>
+                  <wp:wrapNone/>
+                  <wp:docPr id="1629349264" name="Picture 5"/>
+                  <wp:cNvGraphicFramePr>
+                    <a:graphicFrameLocks xmlns:a="http://schemas.openxmlformats.org/drawingml/2006/main" noChangeAspect="1"/>
+                  </wp:cNvGraphicFramePr>
+                  <a:graphic xmlns:a="http://schemas.openxmlformats.org/drawingml/2006/main">
+                    <a:graphicData uri="http://schemas.openxmlformats.org/drawingml/2006/picture">
+                      <pic:pic xmlns:pic="http://schemas.openxmlformats.org/drawingml/2006/picture">
+                        <pic:nvPicPr>
+                          <pic:cNvPr id="1629349264" name="Picture 1629349264"/>
+                          <pic:cNvPicPr/>
+                        </pic:nvPicPr>
+                        <pic:blipFill rotWithShape="1">
+                          <a:blip r:embed="rId9">
+                            <a:biLevel thresh="75000"/>
+                          </a:blip>
+                          <a:srcRect t="41080" b="41419"/>
+                          <a:stretch>
+                            <a:fillRect/>
+                          </a:stretch>
+                        </pic:blipFill>
+                        <pic:spPr bwMode="auto">
+                          <a:xfrm>
+                            <a:off x="0" y="0"/>
+                            <a:ext cx="2472690" cy="561975"/>
+                          </a:xfrm>
+                          <a:prstGeom prst="rect">
+                            <a:avLst/>
+                          </a:prstGeom>
+                          <a:ln>
+                            <a:noFill/>
+                          </a:ln>
+                          <a:extLst>
+                            <a:ext uri="{53640926-AAD7-44D8-BBD7-CCE9431645EC}">
+                              <a14:shadowObscured xmlns:a14="http://schemas.microsoft.com/office/drawing/2010/main"/>
+                            </a:ext>
+                          </a:extLst>
+                        </pic:spPr>
+                      </pic:pic>
+                    </a:graphicData>
+                  </a:graphic>
+                  <wp14:sizeRelH relativeFrom="page">
+                    <wp14:pctWidth>0</wp14:pctWidth>
+                  </wp14:sizeRelH>
+                  <wp14:sizeRelV relativeFrom="page">
+                    <wp14:pctHeight>0</wp14:pctHeight>
+                  </wp14:sizeRelV>
+                </wp:anchor>
+              </w:drawing>
+            </w:r>
+            <w:r>
+              <w:rPr>
+                <w:b/>
+                <w:color w:val="145A32"/>
+                <w:sz w:val="16"/>
+              </w:rPr>
+              <w:t>DIRECTOR: HEAD OF ICT AND COMMUNICATIONS</w:t>
+            </w:r>
+            <w:r>
+              <w:rPr>
+                <w:b/>
+                <w:sz w:val="18"/>
+              </w:rPr>
+              <w:br/>
+              <w:t>Mr. Thapelo Nelson Maqalika</w:t>
+            </w:r>
+            <w:r>
+              <w:br/>
+            </w:r>
+            <w:r>
+              <w:br/>
+              <w:t xml:space="preserve">Signature: </w:t>
+            </w:r>
+            <w:r>
+              <w:br/>
+              <w:t>____________________________</w:t>
+            </w:r>
+            <w:r>
+              <w:br/>
+            </w:r>
+            <w:r>
+              <w:br/>
+              <w:t xml:space="preserve">Date: </w:t>
+            </w:r>
+            <w:r>
+              <w:rPr>
+                <w:b/>
+                <w:bCs/>
+              </w:rPr>
+              <w:t>6 September 2026</w:t>
+            </w:r>
+            <w:r>
+              <w:br/>
+              <w:t>____________________________</w:t>
+            </w:r>
+          </w:p>
+        </w:tc>
+      </w:tr>
+      <w:tr>
+        <w:trPr>
+          <w:cantSplit/>
+          <w:jc w:val="center"/>
+        </w:trPr>
+        <w:tc>
+          <w:tcPr>
+            <w:tcW w:w="4968" w:type="dxa"/>
+            <w:tcBorders>
+              <w:top w:val="single" w:sz="5" w:space="0" w:color="D8DDD8"/>
+              <w:left w:val="single" w:sz="5" w:space="0" w:color="D8DDD8"/>
+              <w:bottom w:val="single" w:sz="5" w:space="0" w:color="D8DDD8"/>
+              <w:right w:val="single" w:sz="5" w:space="0" w:color="D8DDD8"/>
+            </w:tcBorders>
+            <w:shd w:val="clear" w:color="auto" w:fill="F7F8F5"/>
+          </w:tcPr>
+          <w:p>
+            <w:pPr>
+              <w:rPr>
+                <w:noProof/>
+              </w:rPr>
+            </w:pPr>
+            <w:r>
+              <w:rPr>
+                <w:noProof/>
+              </w:rPr>
+              <w:drawing>
+                <wp:anchor distT="0" distB="0" distL="114300" distR="114300" simplePos="0" relativeHeight="251661312" behindDoc="0" locked="0" layoutInCell="1" allowOverlap="1" wp14:anchorId="15BCBFD8" wp14:editId="05187519">
+                  <wp:simplePos x="0" y="0"/>
+                  <wp:positionH relativeFrom="column">
+                    <wp:posOffset>434341</wp:posOffset>
+                  </wp:positionH>
+                  <wp:positionV relativeFrom="paragraph">
+                    <wp:posOffset>163195</wp:posOffset>
+                  </wp:positionV>
+                  <wp:extent cx="1777009" cy="684328"/>
+                  <wp:effectExtent l="0" t="0" r="0" b="0"/>
+                  <wp:wrapNone/>
+                  <wp:docPr id="264294559" name="Picture 4"/>
+                  <wp:cNvGraphicFramePr>
+                    <a:graphicFrameLocks xmlns:a="http://schemas.openxmlformats.org/drawingml/2006/main" noChangeAspect="1"/>
+                  </wp:cNvGraphicFramePr>
+                  <a:graphic xmlns:a="http://schemas.openxmlformats.org/drawingml/2006/main">
+                    <a:graphicData uri="http://schemas.openxmlformats.org/drawingml/2006/picture">
+                      <pic:pic xmlns:pic="http://schemas.openxmlformats.org/drawingml/2006/picture">
+                        <pic:nvPicPr>
+                          <pic:cNvPr id="264294559" name="Picture 264294559"/>
+                          <pic:cNvPicPr/>
+                        </pic:nvPicPr>
+                        <pic:blipFill rotWithShape="1">
+                          <a:blip r:embed="rId10">
+                            <a:biLevel thresh="75000"/>
+                          </a:blip>
+                          <a:srcRect t="36616" b="24874"/>
+                          <a:stretch>
+                            <a:fillRect/>
+                          </a:stretch>
+                        </pic:blipFill>
+                        <pic:spPr bwMode="auto">
+                          <a:xfrm rot="462680">
+                            <a:off x="0" y="0"/>
+                            <a:ext cx="1777009" cy="684328"/>
+                          </a:xfrm>
+                          <a:prstGeom prst="rect">
+                            <a:avLst/>
+                          </a:prstGeom>
+                          <a:ln>
+                            <a:noFill/>
+                          </a:ln>
+                          <a:extLst>
+                            <a:ext uri="{53640926-AAD7-44D8-BBD7-CCE9431645EC}">
+                              <a14:shadowObscured xmlns:a14="http://schemas.microsoft.com/office/drawing/2010/main"/>
+                            </a:ext>
+                          </a:extLst>
+                        </pic:spPr>
+                      </pic:pic>
+                    </a:graphicData>
+                  </a:graphic>
+                  <wp14:sizeRelH relativeFrom="page">
+                    <wp14:pctWidth>0</wp14:pctWidth>
+                  </wp14:sizeRelH>
+                  <wp14:sizeRelV relativeFrom="page">
+                    <wp14:pctHeight>0</wp14:pctHeight>
+                  </wp14:sizeRelV>
+                </wp:anchor>
+              </w:drawing>
+            </w:r>
+            <w:r>
+              <w:rPr>
+                <w:b/>
+                <w:color w:val="145A32"/>
+                <w:sz w:val="16"/>
+              </w:rPr>
+              <w:t>EXECUTIVE DIRECTOR</w:t>
+            </w:r>
+            <w:r>
+              <w:rPr>
+                <w:b/>
+                <w:sz w:val="18"/>
+              </w:rPr>
+              <w:br/>
+              <w:t>Mr. Bhekisisa Shandu</w:t>
+            </w:r>
+            <w:r>
+              <w:br/>
+            </w:r>
+            <w:r>
+              <w:br/>
+              <w:t xml:space="preserve">Signature: </w:t>
+            </w:r>
+            <w:r>
+              <w:br/>
+              <w:t>____________________________</w:t>
+            </w:r>
+            <w:r>
+              <w:br/>
+            </w:r>
+            <w:r>
+              <w:br/>
+              <w:t xml:space="preserve">Date: </w:t>
+            </w:r>
+            <w:r>
+              <w:rPr>
+                <w:b/>
+                <w:bCs/>
+              </w:rPr>
+              <w:t>6 September 2026</w:t>
+            </w:r>
+            <w:r>
+              <w:br/>
+              <w:t>____________________________</w:t>
+            </w:r>
+          </w:p>
+        </w:tc>
+        <w:tc>
+          <w:tcPr>
+            <w:tcW w:w="4968" w:type="dxa"/>
+            <w:tcBorders>
+              <w:top w:val="single" w:sz="5" w:space="0" w:color="D8DDD8"/>
+              <w:left w:val="single" w:sz="5" w:space="0" w:color="D8DDD8"/>
+              <w:bottom w:val="single" w:sz="5" w:space="0" w:color="D8DDD8"/>
+              <w:right w:val="single" w:sz="5" w:space="0" w:color="D8DDD8"/>
+            </w:tcBorders>
+            <w:shd w:val="clear" w:color="auto" w:fill="F7F8F5"/>
+          </w:tcPr>
+          <w:p>
+            <w:r>
+              <w:rPr>
+                <w:noProof/>
+                <w:sz w:val="16"/>
+                <w:szCs w:val="16"/>
+              </w:rPr>
+              <w:drawing>
+                <wp:anchor distT="0" distB="0" distL="114300" distR="114300" simplePos="0" relativeHeight="251660288" behindDoc="0" locked="0" layoutInCell="1" allowOverlap="1" wp14:anchorId="1650F955" wp14:editId="3B79DCAA">
+                  <wp:simplePos x="0" y="0"/>
+                  <wp:positionH relativeFrom="column">
+                    <wp:posOffset>393065</wp:posOffset>
+                  </wp:positionH>
+                  <wp:positionV relativeFrom="paragraph">
+                    <wp:posOffset>286514</wp:posOffset>
+                  </wp:positionV>
+                  <wp:extent cx="1354277" cy="892568"/>
+                  <wp:effectExtent l="0" t="0" r="0" b="0"/>
+                  <wp:wrapNone/>
+                  <wp:docPr id="70748101" name="Picture 3"/>
+                  <wp:cNvGraphicFramePr>
+                    <a:graphicFrameLocks xmlns:a="http://schemas.openxmlformats.org/drawingml/2006/main" noChangeAspect="1"/>
+                  </wp:cNvGraphicFramePr>
+                  <a:graphic xmlns:a="http://schemas.openxmlformats.org/drawingml/2006/main">
+                    <a:graphicData uri="http://schemas.openxmlformats.org/drawingml/2006/picture">
+                      <pic:pic xmlns:pic="http://schemas.openxmlformats.org/drawingml/2006/picture">
+                        <pic:nvPicPr>
+                          <pic:cNvPr id="70748101" name="Picture 70748101"/>
+                          <pic:cNvPicPr/>
+                        </pic:nvPicPr>
+                        <pic:blipFill rotWithShape="1">
+                          <a:blip r:embed="rId11">
+                            <a:biLevel thresh="75000"/>
+                          </a:blip>
+                          <a:srcRect t="20028" b="17298"/>
+                          <a:stretch>
+                            <a:fillRect/>
+                          </a:stretch>
+                        </pic:blipFill>
+                        <pic:spPr bwMode="auto">
+                          <a:xfrm rot="164574">
+                            <a:off x="0" y="0"/>
+                            <a:ext cx="1354277" cy="892568"/>
+                          </a:xfrm>
+                          <a:prstGeom prst="rect">
+                            <a:avLst/>
+                          </a:prstGeom>
+                          <a:ln>
+                            <a:noFill/>
+                          </a:ln>
+                          <a:extLst>
+                            <a:ext uri="{53640926-AAD7-44D8-BBD7-CCE9431645EC}">
+                              <a14:shadowObscured xmlns:a14="http://schemas.microsoft.com/office/drawing/2010/main"/>
+                            </a:ext>
+                          </a:extLst>
+                        </pic:spPr>
+                      </pic:pic>
+                    </a:graphicData>
+                  </a:graphic>
+                  <wp14:sizeRelH relativeFrom="margin">
+                    <wp14:pctWidth>0</wp14:pctWidth>
+                  </wp14:sizeRelH>
+                  <wp14:sizeRelV relativeFrom="margin">
+                    <wp14:pctHeight>0</wp14:pctHeight>
+                  </wp14:sizeRelV>
+                </wp:anchor>
+              </w:drawing>
+            </w:r>
+            <w:r>
+              <w:rPr>
+                <w:b/>
+                <w:color w:val="145A32"/>
+                <w:sz w:val="16"/>
+                <w:szCs w:val="16"/>
+              </w:rPr>
+              <w:t>DIRECTOR: PEOPLE AND CULTURE / CHAIRPERSON: FINANCE AND PROCUREMENT COMMITTEE</w:t>
+            </w:r>
+            <w:r>
+              <w:br/>
+            </w:r>
+            <w:r>
+              <w:rPr>
+                <w:b/>
+                <w:sz w:val="18"/>
+              </w:rPr>
+              <w:t>Mr. Khulekani Gumede</w:t>
+            </w:r>
+            <w:r>
+              <w:br/>
+            </w:r>
+            <w:r>
+              <w:br/>
+              <w:t xml:space="preserve">Signature: </w:t>
+            </w:r>
+            <w:r>
+              <w:br/>
+              <w:t>____________________________</w:t>
+            </w:r>
+            <w:r>
+              <w:br/>
+            </w:r>
+            <w:r>
+              <w:br/>
+              <w:t xml:space="preserve">Date: </w:t>
+            </w:r>
+            <w:r>
+              <w:rPr>
+                <w:b/>
+                <w:bCs/>
+              </w:rPr>
+              <w:t>6 September 2026</w:t>
+            </w:r>
+            <w:r>
+              <w:br/>
+              <w:t>____________________________</w:t>
+            </w:r>
+          </w:p>
+        </w:tc>
+      </w:tr>
+    </w:tbl>
+    <w:p/>
   </w:body>
 </w:document>
 </file>
@@ -1888,31 +2230,38 @@
     <w:pPr>
       <w:pStyle w:val="Footer"/>
       <w:jc w:val="center"/>
-      <w:pBdr>
-        <w:top w:val="single" w:sz="4" w:space="1" w:color="000000"/>
-      </w:pBdr>
     </w:pPr>
     <w:r>
       <w:rPr>
-        <w:rFonts w:ascii="Times New Roman" w:hAnsi="Times New Roman"/>
-        <w:color w:val="646464"/>
-        <w:sz w:val="18"/>
-      </w:rPr>
-      <w:t>African Solidarity Civic Organisation NPC | Board Meeting Minutes</w:t>
+        <w:color w:val="145A32"/>
+        <w:sz w:val="16"/>
+      </w:rPr>
+      <w:t xml:space="preserve">AFRICAN SOLIDARITY • UNITY. EMPOWERMENT. PROGRESS. • </w:t>
     </w:r>
-  </w:p>
-  <w:p>
-    <w:pPr>
-      <w:jc w:val="center"/>
-    </w:pPr>
     <w:r>
-      <w:rPr>
-        <w:rFonts w:ascii="Times New Roman" w:hAnsi="Times New Roman"/>
-        <w:i/>
-        <w:color w:val="646464"/>
-        <w:sz w:val="18"/>
-      </w:rPr>
-      <w:t>Confidential – For Board Use Only</w:t>
+      <w:fldChar w:fldCharType="begin"/>
+    </w:r>
+    <w:r>
+      <w:instrText>PAGE</w:instrText>
+    </w:r>
+    <w:r>
+      <w:fldChar w:fldCharType="separate"/>
+    </w:r>
+    <w:r>
+      <w:rPr>
+        <w:noProof/>
+      </w:rPr>
+      <w:t>1</w:t>
+    </w:r>
+    <w:r>
+      <w:fldChar w:fldCharType="end"/>
+    </w:r>
+    <w:r>
+      <w:rPr>
+        <w:color w:val="5F6B63"/>
+        <w:sz w:val="16"/>
+      </w:rPr>
+      <w:t xml:space="preserve">  |  OFFICIAL POLICY</w:t>
     </w:r>
   </w:p>
 </w:ftr>
@@ -1920,43 +2269,295 @@
 
 <file path=word/header1.xml><?xml version="1.0" encoding="utf-8"?>
 <w:hdr xmlns:m="http://schemas.openxmlformats.org/officeDocument/2006/math" xmlns:mc="http://schemas.openxmlformats.org/markup-compatibility/2006" xmlns:mo="http://schemas.microsoft.com/office/mac/office/2008/main" xmlns:mv="urn:schemas-microsoft-com:mac:vml" xmlns:o="urn:schemas-microsoft-com:office:office" xmlns:r="http://schemas.openxmlformats.org/officeDocument/2006/relationships" xmlns:v="urn:schemas-microsoft-com:vml" xmlns:w10="urn:schemas-microsoft-com:office:word" xmlns:w14="http://schemas.microsoft.com/office/word/2010/wordml" xmlns:w="http://schemas.openxmlformats.org/wordprocessingml/2006/main" xmlns:wne="http://schemas.microsoft.com/office/word/2006/wordml" xmlns:wp14="http://schemas.microsoft.com/office/word/2010/wordprocessingDrawing" xmlns:wp="http://schemas.openxmlformats.org/drawingml/2006/wordprocessingDrawing" xmlns:wpc="http://schemas.microsoft.com/office/word/2010/wordprocessingCanvas" xmlns:wpg="http://schemas.microsoft.com/office/word/2010/wordprocessingGroup" xmlns:wpi="http://schemas.microsoft.com/office/word/2010/wordprocessingInk" xmlns:wps="http://schemas.microsoft.com/office/word/2010/wordprocessingShape" mc:Ignorable="w14 wp14">
-  <w:p>
-    <w:pPr>
-      <w:pStyle w:val="Header"/>
-      <w:jc w:val="center"/>
-    </w:pPr>
-    <w:r>
-      <w:rPr>
-        <w:rFonts w:ascii="Times New Roman" w:hAnsi="Times New Roman"/>
-        <w:b/>
-        <w:color w:val="000000"/>
-        <w:sz w:val="28"/>
-      </w:rPr>
-      <w:t>AFRICAN SOLIDARITY CIVIC ORGANISATION NPC</w:t>
-    </w:r>
-  </w:p>
-  <w:p>
-    <w:pPr>
-      <w:jc w:val="center"/>
-    </w:pPr>
-    <w:r>
-      <w:rPr>
-        <w:rFonts w:ascii="Times New Roman" w:hAnsi="Times New Roman"/>
-        <w:b/>
-        <w:color w:val="000000"/>
-        <w:sz w:val="24"/>
-      </w:rPr>
-      <w:t>ASCO NPC</w:t>
-    </w:r>
-  </w:p>
-  <w:p>
-    <w:pPr>
-      <w:jc w:val="center"/>
-      <w:pBdr>
-        <w:bottom w:val="single" w:sz="4" w:space="1" w:color="000000"/>
-      </w:pBdr>
-    </w:pPr>
-  </w:p>
+  <w:tbl>
+    <w:tblPr>
+      <w:tblW w:w="0" w:type="auto"/>
+      <w:tblLook w:val="04A0" w:firstRow="1" w:lastRow="0" w:firstColumn="1" w:lastColumn="0" w:noHBand="0" w:noVBand="1"/>
+    </w:tblPr>
+    <w:tblGrid>
+      <w:gridCol w:w="5040"/>
+      <w:gridCol w:w="5040"/>
+    </w:tblGrid>
+    <w:tr>
+      <w:trPr>
+        <w:trHeight w:val="2664"/>
+      </w:trPr>
+      <w:tc>
+        <w:tcPr>
+          <w:tcW w:w="5040" w:type="dxa"/>
+          <w:tcBorders>
+            <w:top w:val="single" w:sz="12" w:space="0" w:color="C9A227"/>
+            <w:left w:val="single" w:sz="12" w:space="0" w:color="C9A227"/>
+            <w:bottom w:val="single" w:sz="12" w:space="0" w:color="C9A227"/>
+            <w:right w:val="single" w:sz="12" w:space="0" w:color="C9A227"/>
+          </w:tcBorders>
+        </w:tcPr>
+        <w:p>
+          <w:r>
+            <w:rPr>
+              <w:noProof/>
+            </w:rPr>
+            <mc:AlternateContent>
+              <mc:Choice Requires="wps">
+                <w:drawing>
+                  <wp:anchor distT="45720" distB="45720" distL="114300" distR="114300" simplePos="0" relativeHeight="251662848" behindDoc="0" locked="0" layoutInCell="1" allowOverlap="1" wp14:anchorId="451D4ADE" wp14:editId="64828AEB">
+                    <wp:simplePos x="0" y="0"/>
+                    <wp:positionH relativeFrom="column">
+                      <wp:posOffset>268605</wp:posOffset>
+                    </wp:positionH>
+                    <wp:positionV relativeFrom="paragraph">
+                      <wp:posOffset>182245</wp:posOffset>
+                    </wp:positionV>
+                    <wp:extent cx="2513965" cy="1390650"/>
+                    <wp:effectExtent l="0" t="0" r="635" b="0"/>
+                    <wp:wrapSquare wrapText="bothSides"/>
+                    <wp:docPr id="217" name="Text Box 2"/>
+                    <wp:cNvGraphicFramePr>
+                      <a:graphicFrameLocks xmlns:a="http://schemas.openxmlformats.org/drawingml/2006/main"/>
+                    </wp:cNvGraphicFramePr>
+                    <a:graphic xmlns:a="http://schemas.openxmlformats.org/drawingml/2006/main">
+                      <a:graphicData uri="http://schemas.microsoft.com/office/word/2010/wordprocessingShape">
+                        <wps:wsp>
+                          <wps:cNvSpPr txBox="1">
+                            <a:spLocks noChangeArrowheads="1"/>
+                          </wps:cNvSpPr>
+                          <wps:spPr bwMode="auto">
+                            <a:xfrm>
+                              <a:off x="0" y="0"/>
+                              <a:ext cx="2513965" cy="1390650"/>
+                            </a:xfrm>
+                            <a:prstGeom prst="rect">
+                              <a:avLst/>
+                            </a:prstGeom>
+                            <a:solidFill>
+                              <a:srgbClr val="FFFFFF"/>
+                            </a:solidFill>
+                            <a:ln w="9525">
+                              <a:noFill/>
+                              <a:miter lim="800000"/>
+                              <a:headEnd/>
+                              <a:tailEnd/>
+                            </a:ln>
+                          </wps:spPr>
+                          <wps:txbx>
+                            <w:txbxContent>
+                              <w:p>
+                                <w:pPr>
+                                  <w:jc w:val="center"/>
+                                </w:pPr>
+                                <w:r>
+                                  <w:rPr>
+                                    <w:noProof/>
+                                  </w:rPr>
+                                  <w:drawing>
+                                    <wp:inline distT="0" distB="0" distL="0" distR="0" wp14:anchorId="61EA5CEF" wp14:editId="0AD47FA3">
+                                      <wp:extent cx="1238250" cy="1238250"/>
+                                      <wp:effectExtent l="0" t="0" r="0" b="0"/>
+                                      <wp:docPr id="472585581" name="Picture 3"/>
+                                      <wp:cNvGraphicFramePr>
+                                        <a:graphicFrameLocks noChangeAspect="1"/>
+                                      </wp:cNvGraphicFramePr>
+                                      <a:graphic>
+                                        <a:graphicData uri="http://schemas.openxmlformats.org/drawingml/2006/picture">
+                                          <pic:pic xmlns:pic="http://schemas.openxmlformats.org/drawingml/2006/picture">
+                                            <pic:nvPicPr>
+                                              <pic:cNvPr id="621409856" name="Picture 621409856"/>
+                                              <pic:cNvPicPr/>
+                                            </pic:nvPicPr>
+                                            <pic:blipFill>
+                                              <a:blip r:embed="rId1"/>
+                                              <a:stretch>
+                                                <a:fillRect/>
+                                              </a:stretch>
+                                            </pic:blipFill>
+                                            <pic:spPr>
+                                              <a:xfrm>
+                                                <a:off x="0" y="0"/>
+                                                <a:ext cx="1238250" cy="1238250"/>
+                                              </a:xfrm>
+                                              <a:prstGeom prst="rect">
+                                                <a:avLst/>
+                                              </a:prstGeom>
+                                            </pic:spPr>
+                                          </pic:pic>
+                                        </a:graphicData>
+                                      </a:graphic>
+                                    </wp:inline>
+                                  </w:drawing>
+                                </w:r>
+                              </w:p>
+                            </w:txbxContent>
+                          </wps:txbx>
+                          <wps:bodyPr rot="0" vert="horz" wrap="square" lIns="91440" tIns="45720" rIns="91440" bIns="45720" anchor="t" anchorCtr="0">
+                            <a:noAutofit/>
+                          </wps:bodyPr>
+                        </wps:wsp>
+                      </a:graphicData>
+                    </a:graphic>
+                    <wp14:sizeRelH relativeFrom="margin">
+                      <wp14:pctWidth>0</wp14:pctWidth>
+                    </wp14:sizeRelH>
+                    <wp14:sizeRelV relativeFrom="margin">
+                      <wp14:pctHeight>0</wp14:pctHeight>
+                    </wp14:sizeRelV>
+                  </wp:anchor>
+                </w:drawing>
+              </mc:Choice>
+              <mc:Fallback>
+                <w:pict>
+                  <v:shapetype w14:anchorId="451D4ADE" id="_x0000_t202" coordsize="21600,21600" o:spt="202" path="m,l,21600r21600,l21600,xe">
+                    <v:stroke joinstyle="miter"/>
+                    <v:path gradientshapeok="t" o:connecttype="rect"/>
+                  </v:shapetype>
+                  <v:shape id="Text Box 2" o:spid="_x0000_s1026" type="#_x0000_t202" style="position:absolute;margin-left:21.15pt;margin-top:14.35pt;width:197.95pt;height:109.5pt;z-index:251662848;visibility:visible;mso-wrap-style:square;mso-width-percent:0;mso-height-percent:0;mso-wrap-distance-left:9pt;mso-wrap-distance-top:3.6pt;mso-wrap-distance-right:9pt;mso-wrap-distance-bottom:3.6pt;mso-position-horizontal:absolute;mso-position-horizontal-relative:text;mso-position-vertical:absolute;mso-position-vertical-relative:text;mso-width-percent:0;mso-height-percent:0;mso-width-relative:margin;mso-height-relative:margin;v-text-anchor:top" o:gfxdata="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" stroked="f">
+                    <v:textbox>
+                      <w:txbxContent>
+                        <w:p>
+                          <w:pPr>
+                            <w:jc w:val="center"/>
+                          </w:pPr>
+                          <w:r>
+                            <w:rPr>
+                              <w:noProof/>
+                            </w:rPr>
+                            <w:drawing>
+                              <wp:inline distT="0" distB="0" distL="0" distR="0" wp14:anchorId="61EA5CEF" wp14:editId="0AD47FA3">
+                                <wp:extent cx="1238250" cy="1238250"/>
+                                <wp:effectExtent l="0" t="0" r="0" b="0"/>
+                                <wp:docPr id="472585581" name="Picture 3"/>
+                                <wp:cNvGraphicFramePr>
+                                  <a:graphicFrameLocks xmlns:a="http://schemas.openxmlformats.org/drawingml/2006/main" noChangeAspect="1"/>
+                                </wp:cNvGraphicFramePr>
+                                <a:graphic xmlns:a="http://schemas.openxmlformats.org/drawingml/2006/main">
+                                  <a:graphicData uri="http://schemas.openxmlformats.org/drawingml/2006/picture">
+                                    <pic:pic xmlns:pic="http://schemas.openxmlformats.org/drawingml/2006/picture">
+                                      <pic:nvPicPr>
+                                        <pic:cNvPr id="621409856" name="Picture 621409856"/>
+                                        <pic:cNvPicPr/>
+                                      </pic:nvPicPr>
+                                      <pic:blipFill>
+                                        <a:blip r:embed="rId1"/>
+                                        <a:stretch>
+                                          <a:fillRect/>
+                                        </a:stretch>
+                                      </pic:blipFill>
+                                      <pic:spPr>
+                                        <a:xfrm>
+                                          <a:off x="0" y="0"/>
+                                          <a:ext cx="1238250" cy="1238250"/>
+                                        </a:xfrm>
+                                        <a:prstGeom prst="rect">
+                                          <a:avLst/>
+                                        </a:prstGeom>
+                                      </pic:spPr>
+                                    </pic:pic>
+                                  </a:graphicData>
+                                </a:graphic>
+                              </wp:inline>
+                            </w:drawing>
+                          </w:r>
+                        </w:p>
+                      </w:txbxContent>
+                    </v:textbox>
+                    <w10:wrap type="square"/>
+                  </v:shape>
+                </w:pict>
+              </mc:Fallback>
+            </mc:AlternateContent>
+          </w:r>
+        </w:p>
+      </w:tc>
+      <w:tc>
+        <w:tcPr>
+          <w:tcW w:w="5040" w:type="dxa"/>
+          <w:tcBorders>
+            <w:top w:val="single" w:sz="12" w:space="0" w:color="C9A227"/>
+            <w:left w:val="single" w:sz="12" w:space="0" w:color="C9A227"/>
+            <w:bottom w:val="single" w:sz="12" w:space="0" w:color="C9A227"/>
+            <w:right w:val="single" w:sz="12" w:space="0" w:color="C9A227"/>
+          </w:tcBorders>
+        </w:tcPr>
+        <w:p>
+          <w:pPr>
+            <w:jc w:val="right"/>
+            <w:rPr>
+              <w:sz w:val="15"/>
+            </w:rPr>
+          </w:pPr>
+          <w:r>
+            <w:rPr>
+              <w:b/>
+              <w:color w:val="145A32"/>
+            </w:rPr>
+            <w:t>AFRICAN SOLIDARITY CIVIC ORGANISATION (ASCO)</w:t>
+          </w:r>
+          <w:r>
+            <w:rPr>
+              <w:sz w:val="16"/>
+            </w:rPr>
+            <w:br/>
+            <w:t>Registered NPC: 2026/521895/</w:t>
+          </w:r>
+          <w:r>
+            <w:rPr>
+              <w:sz w:val="16"/>
+            </w:rPr>
+            <w:t>08 | Tax</w:t>
+          </w:r>
+          <w:r>
+            <w:rPr>
+              <w:sz w:val="16"/>
+            </w:rPr>
+            <w:t xml:space="preserve"> Reference: 9322812265</w:t>
+          </w:r>
+          <w:r>
+            <w:rPr>
+              <w:sz w:val="15"/>
+            </w:rPr>
+            <w:br/>
+            <w:t xml:space="preserve">49 Rif Road, Manor Gardens </w:t>
+          </w:r>
+        </w:p>
+        <w:p>
+          <w:pPr>
+            <w:jc w:val="right"/>
+            <w:rPr>
+              <w:sz w:val="15"/>
+            </w:rPr>
+          </w:pPr>
+          <w:r>
+            <w:rPr>
+              <w:sz w:val="15"/>
+            </w:rPr>
+            <w:t xml:space="preserve">Durban, KwaZulu-Natal </w:t>
+          </w:r>
+        </w:p>
+        <w:p>
+          <w:pPr>
+            <w:jc w:val="right"/>
+          </w:pPr>
+          <w:r>
+            <w:rPr>
+              <w:sz w:val="15"/>
+            </w:rPr>
+            <w:t>4001</w:t>
+          </w:r>
+          <w:r>
+            <w:rPr>
+              <w:sz w:val="15"/>
+            </w:rPr>
+            <w:br/>
+          </w:r>
+          <w:r>
+            <w:rPr>
+              <w:sz w:val="15"/>
+            </w:rPr>
+            <w:t>info@africansolidaritycivic.org | www.africansolidaritycivic.org</w:t>
+          </w:r>
+        </w:p>
+      </w:tc>
+    </w:tr>
+  </w:tbl>
 </w:hdr>
 </file>
 
@@ -2325,8 +2926,7 @@
     <w:rsid w:val="00FC693F"/>
     <w:rPr>
       <w:rFonts w:ascii="Times New Roman" w:hAnsi="Times New Roman"/>
-      <w:color w:val="000000"/>
-      <w:sz w:val="24"/>
+      <w:sz w:val="0"/>
     </w:rPr>
   </w:style>
   <w:style w:type="paragraph" w:styleId="Header">

</xml_diff>

<commit_message>
Fix Board Minutes formatting to match other ASCO documents
</commit_message>
<xml_diff>
--- a/ASCO Board Minutes 2026.docx
+++ b/ASCO Board Minutes 2026.docx
@@ -4,67 +4,63 @@
   <w:body>
     <w:p>
       <w:pPr>
-        <w:spacing w:after="0" w:before="0"/>
+        <w:spacing w:after="80" w:before="80"/>
         <w:jc w:val="center"/>
       </w:pPr>
       <w:r>
         <w:rPr>
-          <w:rFonts w:ascii="Times New Roman" w:hAnsi="Times New Roman"/>
           <w:b/>
           <w:i w:val="0"/>
-          <w:sz w:val="0"/>
+          <w:sz w:val="34"/>
         </w:rPr>
         <w:t>MINUTES OF THE MEETING OF THE BOARD OF DIRECTORS</w:t>
       </w:r>
     </w:p>
     <w:p>
       <w:pPr>
-        <w:spacing w:after="0" w:before="0"/>
+        <w:spacing w:after="80" w:before="0"/>
         <w:jc w:val="center"/>
       </w:pPr>
       <w:r>
         <w:rPr>
-          <w:rFonts w:ascii="Times New Roman" w:hAnsi="Times New Roman"/>
           <w:b w:val="0"/>
           <w:i w:val="0"/>
-          <w:sz w:val="0"/>
+          <w:sz w:val="22"/>
         </w:rPr>
         <w:t>OF</w:t>
       </w:r>
     </w:p>
     <w:p>
       <w:pPr>
-        <w:spacing w:after="0" w:before="0"/>
+        <w:spacing w:after="80" w:before="0"/>
         <w:jc w:val="center"/>
       </w:pPr>
       <w:r>
         <w:rPr>
-          <w:rFonts w:ascii="Times New Roman" w:hAnsi="Times New Roman"/>
           <w:b/>
           <w:i w:val="0"/>
-          <w:sz w:val="0"/>
+          <w:sz w:val="22"/>
         </w:rPr>
         <w:t>AFRICAN SOLIDARITY CIVIC ORGANISATION NPC</w:t>
       </w:r>
     </w:p>
     <w:p>
       <w:pPr>
-        <w:spacing w:after="0" w:before="0"/>
+        <w:spacing w:after="220" w:before="0"/>
         <w:jc w:val="center"/>
       </w:pPr>
       <w:r>
         <w:rPr>
-          <w:rFonts w:ascii="Times New Roman" w:hAnsi="Times New Roman"/>
           <w:b/>
           <w:i w:val="0"/>
-          <w:sz w:val="0"/>
+          <w:sz w:val="22"/>
         </w:rPr>
         <w:t>(ASCO NPC)</w:t>
       </w:r>
     </w:p>
     <w:p>
       <w:pPr>
-        <w:spacing w:after="0" w:before="0"/>
+        <w:spacing w:after="90" w:before="90"/>
         <w:jc w:val="center"/>
         <w:pBdr>
           <w:bottom w:val="single" w:sz="4" w:space="1" w:color="000000"/>
@@ -73,91 +69,83 @@
     </w:p>
     <w:p>
       <w:pPr>
-        <w:spacing w:after="0"/>
+        <w:spacing w:after="90"/>
       </w:pPr>
       <w:r>
         <w:rPr>
-          <w:rFonts w:ascii="Times New Roman" w:hAnsi="Times New Roman"/>
           <w:b/>
-          <w:sz w:val="0"/>
+          <w:sz w:val="20"/>
         </w:rPr>
         <w:t>Registration Number:</w:t>
         <w:tab/>
       </w:r>
       <w:r>
         <w:rPr>
-          <w:rFonts w:ascii="Times New Roman" w:hAnsi="Times New Roman"/>
-          <w:sz w:val="0"/>
+          <w:sz w:val="20"/>
         </w:rPr>
         <w:t>____________________</w:t>
       </w:r>
     </w:p>
     <w:p>
       <w:pPr>
-        <w:spacing w:after="0"/>
+        <w:spacing w:after="90"/>
       </w:pPr>
       <w:r>
         <w:rPr>
-          <w:rFonts w:ascii="Times New Roman" w:hAnsi="Times New Roman"/>
           <w:b/>
-          <w:sz w:val="0"/>
+          <w:sz w:val="20"/>
         </w:rPr>
         <w:t>Date of Meeting:</w:t>
         <w:tab/>
       </w:r>
       <w:r>
         <w:rPr>
-          <w:rFonts w:ascii="Times New Roman" w:hAnsi="Times New Roman"/>
-          <w:sz w:val="0"/>
+          <w:sz w:val="20"/>
         </w:rPr>
         <w:t>____________________</w:t>
       </w:r>
     </w:p>
     <w:p>
       <w:pPr>
-        <w:spacing w:after="0"/>
+        <w:spacing w:after="90"/>
       </w:pPr>
       <w:r>
         <w:rPr>
-          <w:rFonts w:ascii="Times New Roman" w:hAnsi="Times New Roman"/>
           <w:b/>
-          <w:sz w:val="0"/>
+          <w:sz w:val="20"/>
         </w:rPr>
         <w:t>Time:</w:t>
         <w:tab/>
       </w:r>
       <w:r>
         <w:rPr>
-          <w:rFonts w:ascii="Times New Roman" w:hAnsi="Times New Roman"/>
-          <w:sz w:val="0"/>
+          <w:sz w:val="20"/>
         </w:rPr>
         <w:t>____________________</w:t>
       </w:r>
     </w:p>
     <w:p>
       <w:pPr>
-        <w:spacing w:after="0"/>
+        <w:spacing w:after="90"/>
       </w:pPr>
       <w:r>
         <w:rPr>
-          <w:rFonts w:ascii="Times New Roman" w:hAnsi="Times New Roman"/>
           <w:b/>
-          <w:sz w:val="0"/>
+          <w:sz w:val="20"/>
         </w:rPr>
         <w:t>Venue:</w:t>
         <w:tab/>
       </w:r>
       <w:r>
         <w:rPr>
-          <w:rFonts w:ascii="Times New Roman" w:hAnsi="Times New Roman"/>
-          <w:sz w:val="0"/>
+          <w:sz w:val="20"/>
         </w:rPr>
         <w:t>____________________</w:t>
       </w:r>
     </w:p>
     <w:p>
       <w:pPr>
-        <w:spacing w:after="0" w:before="0"/>
+        <w:spacing w:after="90" w:before="90"/>
         <w:jc w:val="center"/>
         <w:pBdr>
           <w:bottom w:val="single" w:sz="4" w:space="1" w:color="000000"/>
@@ -166,67 +154,63 @@
     </w:p>
     <w:p>
       <w:pPr>
-        <w:spacing w:after="0" w:before="0"/>
+        <w:spacing w:after="90" w:before="180"/>
         <w:jc w:val="left"/>
       </w:pPr>
       <w:r>
         <w:rPr>
-          <w:rFonts w:ascii="Times New Roman" w:hAnsi="Times New Roman"/>
           <w:b/>
           <w:i w:val="0"/>
-          <w:sz w:val="0"/>
+          <w:sz w:val="22"/>
         </w:rPr>
         <w:t>1. OPENING AND WELCOME</w:t>
       </w:r>
     </w:p>
     <w:p>
       <w:pPr>
-        <w:spacing w:after="0" w:before="0"/>
+        <w:spacing w:after="90" w:before="0"/>
         <w:jc w:val="left"/>
       </w:pPr>
       <w:r>
         <w:rPr>
-          <w:rFonts w:ascii="Times New Roman" w:hAnsi="Times New Roman"/>
           <w:b w:val="0"/>
           <w:i w:val="0"/>
-          <w:sz w:val="0"/>
+          <w:sz w:val="20"/>
         </w:rPr>
         <w:t>The meeting of the Board of Directors of African Solidarity Civic Organisation NPC (ASCO NPC) was called to order by the Chairlady of the Board, Ms Busisiwe Makhosi Shandu.</w:t>
       </w:r>
     </w:p>
     <w:p>
       <w:pPr>
-        <w:spacing w:after="0" w:before="0"/>
+        <w:spacing w:after="90" w:before="0"/>
         <w:jc w:val="left"/>
       </w:pPr>
       <w:r>
         <w:rPr>
-          <w:rFonts w:ascii="Times New Roman" w:hAnsi="Times New Roman"/>
           <w:b w:val="0"/>
           <w:i w:val="0"/>
-          <w:sz w:val="0"/>
+          <w:sz w:val="20"/>
         </w:rPr>
         <w:t>The Chairlady welcomed all Directors and confirmed that the meeting was properly constituted, with the required quorum present to deliberate and adopt resolutions binding on the organisation.</w:t>
       </w:r>
     </w:p>
     <w:p>
       <w:pPr>
-        <w:spacing w:after="0" w:before="0"/>
+        <w:spacing w:after="90" w:before="0"/>
         <w:jc w:val="left"/>
       </w:pPr>
       <w:r>
         <w:rPr>
-          <w:rFonts w:ascii="Times New Roman" w:hAnsi="Times New Roman"/>
           <w:b w:val="0"/>
           <w:i w:val="0"/>
-          <w:sz w:val="0"/>
+          <w:sz w:val="20"/>
         </w:rPr>
         <w:t>The Chairlady stated that the purpose of the meeting was to consider and formally adopt the customised Memorandum of Incorporation (MOI) of ASCO NPC, ensuring that the organisation's governance framework reflects its founding principles, non-profit objectives, institutional values and future sustainability.</w:t>
       </w:r>
     </w:p>
     <w:p>
       <w:pPr>
-        <w:spacing w:after="0" w:before="0"/>
+        <w:spacing w:after="90" w:before="90"/>
         <w:jc w:val="center"/>
         <w:pBdr>
           <w:bottom w:val="single" w:sz="4" w:space="1" w:color="000000"/>
@@ -235,30 +219,28 @@
     </w:p>
     <w:p>
       <w:pPr>
-        <w:spacing w:after="0" w:before="0"/>
+        <w:spacing w:after="90" w:before="180"/>
         <w:jc w:val="left"/>
       </w:pPr>
       <w:r>
         <w:rPr>
-          <w:rFonts w:ascii="Times New Roman" w:hAnsi="Times New Roman"/>
           <w:b/>
           <w:i w:val="0"/>
-          <w:sz w:val="0"/>
+          <w:sz w:val="22"/>
         </w:rPr>
         <w:t>2. ATTENDANCE</w:t>
       </w:r>
     </w:p>
     <w:p>
       <w:pPr>
-        <w:spacing w:after="0" w:before="0"/>
+        <w:spacing w:after="90" w:before="0"/>
         <w:jc w:val="left"/>
       </w:pPr>
       <w:r>
         <w:rPr>
-          <w:rFonts w:ascii="Times New Roman" w:hAnsi="Times New Roman"/>
           <w:b w:val="0"/>
           <w:i w:val="0"/>
-          <w:sz w:val="0"/>
+          <w:sz w:val="20"/>
         </w:rPr>
         <w:t>The following Directors were present:</w:t>
       </w:r>
@@ -282,7 +264,6 @@
           <w:p>
             <w:r>
               <w:rPr>
-                <w:rFonts w:ascii="Times New Roman" w:hAnsi="Times New Roman"/>
                 <w:b/>
                 <w:sz w:val="0"/>
               </w:rPr>
@@ -298,7 +279,6 @@
           <w:p>
             <w:r>
               <w:rPr>
-                <w:rFonts w:ascii="Times New Roman" w:hAnsi="Times New Roman"/>
                 <w:b/>
                 <w:sz w:val="0"/>
               </w:rPr>
@@ -315,7 +295,6 @@
           <w:p>
             <w:r>
               <w:rPr>
-                <w:rFonts w:ascii="Times New Roman" w:hAnsi="Times New Roman"/>
                 <w:sz w:val="0"/>
               </w:rPr>
               <w:t>Ms Busisiwe Makhosi Shandu</w:t>
@@ -329,7 +308,6 @@
           <w:p>
             <w:r>
               <w:rPr>
-                <w:rFonts w:ascii="Times New Roman" w:hAnsi="Times New Roman"/>
                 <w:sz w:val="0"/>
               </w:rPr>
               <w:t>Chairlady of the Board / Founder and Custodian of Founding Legacy</w:t>
@@ -346,7 +324,6 @@
           <w:p>
             <w:r>
               <w:rPr>
-                <w:rFonts w:ascii="Times New Roman" w:hAnsi="Times New Roman"/>
                 <w:sz w:val="0"/>
               </w:rPr>
               <w:t>Mr Bhekisisa Shandu</w:t>
@@ -361,7 +338,6 @@
           <w:p>
             <w:r>
               <w:rPr>
-                <w:rFonts w:ascii="Times New Roman" w:hAnsi="Times New Roman"/>
                 <w:sz w:val="0"/>
               </w:rPr>
               <w:t>Executive Director</w:t>
@@ -377,7 +353,6 @@
           <w:p>
             <w:r>
               <w:rPr>
-                <w:rFonts w:ascii="Times New Roman" w:hAnsi="Times New Roman"/>
                 <w:sz w:val="0"/>
               </w:rPr>
               <w:t>Mr Thapelo Nelson Maqalika</w:t>
@@ -391,7 +366,6 @@
           <w:p>
             <w:r>
               <w:rPr>
-                <w:rFonts w:ascii="Times New Roman" w:hAnsi="Times New Roman"/>
                 <w:sz w:val="0"/>
               </w:rPr>
               <w:t>Director: Head of ICT and Communications</w:t>
@@ -408,7 +382,6 @@
           <w:p>
             <w:r>
               <w:rPr>
-                <w:rFonts w:ascii="Times New Roman" w:hAnsi="Times New Roman"/>
                 <w:sz w:val="0"/>
               </w:rPr>
               <w:t>Mr Khulekani Gumede</w:t>
@@ -423,7 +396,6 @@
           <w:p>
             <w:r>
               <w:rPr>
-                <w:rFonts w:ascii="Times New Roman" w:hAnsi="Times New Roman"/>
                 <w:sz w:val="0"/>
               </w:rPr>
               <w:t>Director: People and Culture</w:t>
@@ -435,37 +407,35 @@
     <w:p/>
     <w:p>
       <w:pPr>
-        <w:spacing w:after="0" w:before="0"/>
+        <w:spacing w:after="90" w:before="180"/>
         <w:jc w:val="left"/>
       </w:pPr>
       <w:r>
         <w:rPr>
-          <w:rFonts w:ascii="Times New Roman" w:hAnsi="Times New Roman"/>
           <w:b/>
           <w:i w:val="0"/>
-          <w:sz w:val="0"/>
+          <w:sz w:val="22"/>
         </w:rPr>
         <w:t>3. APOLOGIES</w:t>
       </w:r>
     </w:p>
     <w:p>
       <w:pPr>
-        <w:spacing w:after="0" w:before="0"/>
+        <w:spacing w:after="90" w:before="0"/>
         <w:jc w:val="left"/>
       </w:pPr>
       <w:r>
         <w:rPr>
-          <w:rFonts w:ascii="Times New Roman" w:hAnsi="Times New Roman"/>
           <w:b w:val="0"/>
           <w:i w:val="0"/>
-          <w:sz w:val="0"/>
+          <w:sz w:val="20"/>
         </w:rPr>
         <w:t>No apologies were received.</w:t>
       </w:r>
     </w:p>
     <w:p>
       <w:pPr>
-        <w:spacing w:after="0" w:before="0"/>
+        <w:spacing w:after="90" w:before="90"/>
         <w:jc w:val="center"/>
         <w:pBdr>
           <w:bottom w:val="single" w:sz="4" w:space="1" w:color="000000"/>
@@ -474,37 +444,35 @@
     </w:p>
     <w:p>
       <w:pPr>
-        <w:spacing w:after="0" w:before="0"/>
+        <w:spacing w:after="90" w:before="180"/>
         <w:jc w:val="left"/>
       </w:pPr>
       <w:r>
         <w:rPr>
-          <w:rFonts w:ascii="Times New Roman" w:hAnsi="Times New Roman"/>
           <w:b/>
           <w:i w:val="0"/>
-          <w:sz w:val="0"/>
+          <w:sz w:val="22"/>
         </w:rPr>
         <w:t>4. DECLARATION OF INTEREST</w:t>
       </w:r>
     </w:p>
     <w:p>
       <w:pPr>
-        <w:spacing w:after="0" w:before="0"/>
+        <w:spacing w:after="90" w:before="0"/>
         <w:jc w:val="left"/>
       </w:pPr>
       <w:r>
         <w:rPr>
-          <w:rFonts w:ascii="Times New Roman" w:hAnsi="Times New Roman"/>
           <w:b w:val="0"/>
           <w:i w:val="0"/>
-          <w:sz w:val="0"/>
+          <w:sz w:val="20"/>
         </w:rPr>
         <w:t>All Directors present confirmed that they had no personal financial interests that conflicted with the matters tabled before the meeting.</w:t>
       </w:r>
     </w:p>
     <w:p>
       <w:pPr>
-        <w:spacing w:after="0" w:before="0"/>
+        <w:spacing w:after="90" w:before="90"/>
         <w:jc w:val="center"/>
         <w:pBdr>
           <w:bottom w:val="single" w:sz="4" w:space="1" w:color="000000"/>
@@ -513,107 +481,100 @@
     </w:p>
     <w:p>
       <w:pPr>
-        <w:spacing w:after="0" w:before="0"/>
+        <w:spacing w:after="90" w:before="180"/>
         <w:jc w:val="left"/>
       </w:pPr>
       <w:r>
         <w:rPr>
-          <w:rFonts w:ascii="Times New Roman" w:hAnsi="Times New Roman"/>
           <w:b/>
           <w:i w:val="0"/>
-          <w:sz w:val="0"/>
+          <w:sz w:val="22"/>
         </w:rPr>
         <w:t>5. PURPOSE OF THE MEETING</w:t>
       </w:r>
     </w:p>
     <w:p>
       <w:pPr>
-        <w:spacing w:after="0" w:before="0"/>
+        <w:spacing w:after="90" w:before="0"/>
         <w:jc w:val="left"/>
       </w:pPr>
       <w:r>
         <w:rPr>
-          <w:rFonts w:ascii="Times New Roman" w:hAnsi="Times New Roman"/>
           <w:b w:val="0"/>
           <w:i w:val="0"/>
-          <w:sz w:val="0"/>
+          <w:sz w:val="20"/>
         </w:rPr>
         <w:t>The Chairlady tabled the following objectives of the meeting:</w:t>
       </w:r>
     </w:p>
     <w:p>
       <w:pPr>
-        <w:spacing w:after="0"/>
+        <w:spacing w:after="90"/>
         <w:ind w:left="1829"/>
-        <w:jc w:val="both"/>
+        <w:jc w:val="left"/>
       </w:pPr>
       <w:r>
         <w:rPr>
-          <w:rFonts w:ascii="Times New Roman" w:hAnsi="Times New Roman"/>
-          <w:sz w:val="0"/>
+          <w:sz w:val="20"/>
         </w:rPr>
         <w:t>5.1  To consider the customised Memorandum of Incorporation (MOI) prepared for African Solidarity Civic Organisation NPC;</w:t>
       </w:r>
     </w:p>
     <w:p>
       <w:pPr>
-        <w:spacing w:after="0"/>
+        <w:spacing w:after="90"/>
         <w:ind w:left="1829"/>
-        <w:jc w:val="both"/>
+        <w:jc w:val="left"/>
       </w:pPr>
       <w:r>
         <w:rPr>
-          <w:rFonts w:ascii="Times New Roman" w:hAnsi="Times New Roman"/>
-          <w:sz w:val="0"/>
+          <w:sz w:val="20"/>
         </w:rPr>
         <w:t>5.2  To ensure that ASCO NPC has a governance framework aligned with the Companies Act 71 of 2008 and principles applicable to non-profit companies;</w:t>
       </w:r>
     </w:p>
     <w:p>
       <w:pPr>
-        <w:spacing w:after="0"/>
+        <w:spacing w:after="90"/>
         <w:ind w:left="1829"/>
-        <w:jc w:val="both"/>
+        <w:jc w:val="left"/>
       </w:pPr>
       <w:r>
         <w:rPr>
-          <w:rFonts w:ascii="Times New Roman" w:hAnsi="Times New Roman"/>
-          <w:sz w:val="0"/>
+          <w:sz w:val="20"/>
         </w:rPr>
         <w:t>5.3  To formally recognise the contribution of the founder in establishing ASCO NPC and preserving its founding vision;</w:t>
       </w:r>
     </w:p>
     <w:p>
       <w:pPr>
-        <w:spacing w:after="0"/>
+        <w:spacing w:after="90"/>
         <w:ind w:left="1829"/>
-        <w:jc w:val="both"/>
+        <w:jc w:val="left"/>
       </w:pPr>
       <w:r>
         <w:rPr>
-          <w:rFonts w:ascii="Times New Roman" w:hAnsi="Times New Roman"/>
-          <w:sz w:val="0"/>
+          <w:sz w:val="20"/>
         </w:rPr>
         <w:t>5.4  To strengthen governance systems required for engagement with regulators, donors, international partners and potential applications relating to Public Benefit Organisation (PBO) and Section 18A approval;</w:t>
       </w:r>
     </w:p>
     <w:p>
       <w:pPr>
-        <w:spacing w:after="0"/>
+        <w:spacing w:after="90"/>
         <w:ind w:left="1829"/>
-        <w:jc w:val="both"/>
+        <w:jc w:val="left"/>
       </w:pPr>
       <w:r>
         <w:rPr>
-          <w:rFonts w:ascii="Times New Roman" w:hAnsi="Times New Roman"/>
-          <w:sz w:val="0"/>
+          <w:sz w:val="20"/>
         </w:rPr>
         <w:t>5.5  To confirm the roles, responsibilities and authority of the Board of Directors and Executive Management.</w:t>
       </w:r>
     </w:p>
     <w:p>
       <w:pPr>
-        <w:spacing w:after="0" w:before="0"/>
+        <w:spacing w:after="90" w:before="90"/>
         <w:jc w:val="center"/>
         <w:pBdr>
           <w:bottom w:val="single" w:sz="4" w:space="1" w:color="000000"/>
@@ -622,179 +583,215 @@
     </w:p>
     <w:p>
       <w:pPr>
-        <w:spacing w:after="0" w:before="0"/>
+        <w:spacing w:after="90" w:before="180"/>
         <w:jc w:val="left"/>
       </w:pPr>
       <w:r>
         <w:rPr>
-          <w:rFonts w:ascii="Times New Roman" w:hAnsi="Times New Roman"/>
           <w:b/>
           <w:i w:val="0"/>
-          <w:sz w:val="0"/>
+          <w:sz w:val="22"/>
         </w:rPr>
         <w:t>6. BACKGROUND AND CONSIDERATION OF THE CUSTOMISED MOI</w:t>
       </w:r>
     </w:p>
     <w:p>
       <w:pPr>
-        <w:spacing w:after="0" w:before="0"/>
+        <w:spacing w:after="90" w:before="0"/>
         <w:jc w:val="left"/>
       </w:pPr>
       <w:r>
         <w:rPr>
-          <w:rFonts w:ascii="Times New Roman" w:hAnsi="Times New Roman"/>
           <w:b w:val="0"/>
           <w:i w:val="0"/>
-          <w:sz w:val="0"/>
+          <w:sz w:val="20"/>
         </w:rPr>
         <w:t>The Board considered the customised Memorandum of Incorporation prepared for ASCO NPC.</w:t>
       </w:r>
     </w:p>
     <w:p>
       <w:pPr>
-        <w:spacing w:after="0" w:before="0"/>
+        <w:spacing w:after="90" w:before="0"/>
         <w:jc w:val="left"/>
       </w:pPr>
       <w:r>
         <w:rPr>
-          <w:rFonts w:ascii="Times New Roman" w:hAnsi="Times New Roman"/>
           <w:b w:val="0"/>
           <w:i w:val="0"/>
-          <w:sz w:val="0"/>
+          <w:sz w:val="20"/>
         </w:rPr>
         <w:t>The Board noted that the MOI is intended to serve as the organisation's principal governance instrument and provides clarity on:</w:t>
       </w:r>
     </w:p>
     <w:p>
       <w:pPr>
-        <w:spacing w:after="0"/>
-        <w:ind w:left="1829"/>
-        <w:jc w:val="both"/>
+        <w:spacing w:after="35"/>
+        <w:jc w:val="left"/>
       </w:pPr>
       <w:r>
         <w:rPr>
-          <w:rFonts w:ascii="Times New Roman" w:hAnsi="Times New Roman"/>
-          <w:sz w:val="0"/>
+          <w:b/>
+          <w:sz w:val="20"/>
         </w:rPr>
-        <w:t>• The purpose and objectives of ASCO NPC;</w:t>
+        <w:t>•</w:t>
+      </w:r>
+      <w:r>
+        <w:rPr>
+          <w:sz w:val="20"/>
+        </w:rPr>
+        <w:t>The purpose and objectives of ASCO NPC;</w:t>
       </w:r>
     </w:p>
     <w:p>
       <w:pPr>
-        <w:spacing w:after="0"/>
-        <w:ind w:left="1829"/>
-        <w:jc w:val="both"/>
+        <w:spacing w:after="35"/>
+        <w:jc w:val="left"/>
       </w:pPr>
       <w:r>
         <w:rPr>
-          <w:rFonts w:ascii="Times New Roman" w:hAnsi="Times New Roman"/>
-          <w:sz w:val="0"/>
+          <w:b/>
+          <w:sz w:val="20"/>
         </w:rPr>
-        <w:t>• The organisation's non-profit character;</w:t>
+        <w:t>•</w:t>
+      </w:r>
+      <w:r>
+        <w:rPr>
+          <w:sz w:val="20"/>
+        </w:rPr>
+        <w:t>The organisation's non-profit character;</w:t>
       </w:r>
     </w:p>
     <w:p>
       <w:pPr>
-        <w:spacing w:after="0"/>
-        <w:ind w:left="1829"/>
-        <w:jc w:val="both"/>
+        <w:spacing w:after="35"/>
+        <w:jc w:val="left"/>
       </w:pPr>
       <w:r>
         <w:rPr>
-          <w:rFonts w:ascii="Times New Roman" w:hAnsi="Times New Roman"/>
-          <w:sz w:val="0"/>
+          <w:b/>
+          <w:sz w:val="20"/>
         </w:rPr>
-        <w:t>• The authority and responsibilities of the Board of Directors;</w:t>
+        <w:t>•</w:t>
+      </w:r>
+      <w:r>
+        <w:rPr>
+          <w:sz w:val="20"/>
+        </w:rPr>
+        <w:t>The authority and responsibilities of the Board of Directors;</w:t>
       </w:r>
     </w:p>
     <w:p>
       <w:pPr>
-        <w:spacing w:after="0"/>
-        <w:ind w:left="1829"/>
-        <w:jc w:val="both"/>
+        <w:spacing w:after="35"/>
+        <w:jc w:val="left"/>
       </w:pPr>
       <w:r>
         <w:rPr>
-          <w:rFonts w:ascii="Times New Roman" w:hAnsi="Times New Roman"/>
-          <w:sz w:val="0"/>
+          <w:b/>
+          <w:sz w:val="20"/>
         </w:rPr>
-        <w:t>• The separation between governance oversight and operational management;</w:t>
+        <w:t>•</w:t>
+      </w:r>
+      <w:r>
+        <w:rPr>
+          <w:sz w:val="20"/>
+        </w:rPr>
+        <w:t>The separation between governance oversight and operational management;</w:t>
       </w:r>
     </w:p>
     <w:p>
       <w:pPr>
-        <w:spacing w:after="0"/>
-        <w:ind w:left="1829"/>
-        <w:jc w:val="both"/>
+        <w:spacing w:after="35"/>
+        <w:jc w:val="left"/>
       </w:pPr>
       <w:r>
         <w:rPr>
-          <w:rFonts w:ascii="Times New Roman" w:hAnsi="Times New Roman"/>
-          <w:sz w:val="0"/>
+          <w:b/>
+          <w:sz w:val="20"/>
         </w:rPr>
-        <w:t>• Ethical leadership and accountability;</w:t>
+        <w:t>•</w:t>
+      </w:r>
+      <w:r>
+        <w:rPr>
+          <w:sz w:val="20"/>
+        </w:rPr>
+        <w:t>Ethical leadership and accountability;</w:t>
       </w:r>
     </w:p>
     <w:p>
       <w:pPr>
-        <w:spacing w:after="0"/>
-        <w:ind w:left="1829"/>
-        <w:jc w:val="both"/>
+        <w:spacing w:after="35"/>
+        <w:jc w:val="left"/>
       </w:pPr>
       <w:r>
         <w:rPr>
-          <w:rFonts w:ascii="Times New Roman" w:hAnsi="Times New Roman"/>
-          <w:sz w:val="0"/>
+          <w:b/>
+          <w:sz w:val="20"/>
         </w:rPr>
-        <w:t>• Protection of organisational assets and resources;</w:t>
+        <w:t>•</w:t>
+      </w:r>
+      <w:r>
+        <w:rPr>
+          <w:sz w:val="20"/>
+        </w:rPr>
+        <w:t>Protection of organisational assets and resources;</w:t>
       </w:r>
     </w:p>
     <w:p>
       <w:pPr>
-        <w:spacing w:after="0"/>
-        <w:ind w:left="1829"/>
-        <w:jc w:val="both"/>
+        <w:spacing w:after="35"/>
+        <w:jc w:val="left"/>
       </w:pPr>
       <w:r>
         <w:rPr>
-          <w:rFonts w:ascii="Times New Roman" w:hAnsi="Times New Roman"/>
-          <w:sz w:val="0"/>
+          <w:b/>
+          <w:sz w:val="20"/>
         </w:rPr>
-        <w:t>• Institutional continuity beyond individual office bearers;</w:t>
+        <w:t>•</w:t>
+      </w:r>
+      <w:r>
+        <w:rPr>
+          <w:sz w:val="20"/>
+        </w:rPr>
+        <w:t>Institutional continuity beyond individual office bearers;</w:t>
       </w:r>
     </w:p>
     <w:p>
       <w:pPr>
-        <w:spacing w:after="0"/>
-        <w:ind w:left="1829"/>
-        <w:jc w:val="both"/>
+        <w:spacing w:after="35"/>
+        <w:jc w:val="left"/>
       </w:pPr>
       <w:r>
         <w:rPr>
-          <w:rFonts w:ascii="Times New Roman" w:hAnsi="Times New Roman"/>
-          <w:sz w:val="0"/>
+          <w:b/>
+          <w:sz w:val="20"/>
         </w:rPr>
-        <w:t>• Compliance with legal and regulatory requirements.</w:t>
+        <w:t>•</w:t>
+      </w:r>
+      <w:r>
+        <w:rPr>
+          <w:sz w:val="20"/>
+        </w:rPr>
+        <w:t>Compliance with legal and regulatory requirements.</w:t>
       </w:r>
     </w:p>
     <w:p>
       <w:pPr>
-        <w:spacing w:after="0" w:before="0"/>
+        <w:spacing w:after="90" w:before="0"/>
         <w:jc w:val="left"/>
       </w:pPr>
       <w:r>
         <w:rPr>
-          <w:rFonts w:ascii="Times New Roman" w:hAnsi="Times New Roman"/>
           <w:b w:val="0"/>
           <w:i w:val="0"/>
-          <w:sz w:val="0"/>
+          <w:sz w:val="20"/>
         </w:rPr>
         <w:t>The Board further noted that the customised MOI strengthens ASCO NPC's readiness to engage with funding institutions, government structures, international organisations and regulatory authorities.</w:t>
       </w:r>
     </w:p>
     <w:p>
       <w:pPr>
-        <w:spacing w:after="0" w:before="0"/>
+        <w:spacing w:after="90" w:before="90"/>
         <w:jc w:val="center"/>
         <w:pBdr>
           <w:bottom w:val="single" w:sz="4" w:space="1" w:color="000000"/>
@@ -803,165 +800,172 @@
     </w:p>
     <w:p>
       <w:pPr>
-        <w:spacing w:after="0" w:before="0"/>
+        <w:spacing w:after="90" w:before="180"/>
         <w:jc w:val="left"/>
       </w:pPr>
       <w:r>
         <w:rPr>
-          <w:rFonts w:ascii="Times New Roman" w:hAnsi="Times New Roman"/>
           <w:b/>
           <w:i w:val="0"/>
-          <w:sz w:val="0"/>
+          <w:sz w:val="22"/>
         </w:rPr>
         <w:t>7. RECOGNITION OF THE FOUNDER AND FOUNDING LEGACY</w:t>
       </w:r>
     </w:p>
     <w:p>
       <w:pPr>
-        <w:spacing w:after="0" w:before="0"/>
+        <w:spacing w:after="90" w:before="0"/>
         <w:jc w:val="left"/>
       </w:pPr>
       <w:r>
         <w:rPr>
-          <w:rFonts w:ascii="Times New Roman" w:hAnsi="Times New Roman"/>
           <w:b w:val="0"/>
           <w:i w:val="0"/>
-          <w:sz w:val="0"/>
+          <w:sz w:val="20"/>
         </w:rPr>
         <w:t>The Board formally considered the recognition of Ms Busisiwe Makhosi Shandu as Founder and Custodian of the Founding Legacy of African Solidarity Civic Organisation NPC.</w:t>
       </w:r>
     </w:p>
     <w:p>
       <w:pPr>
-        <w:spacing w:after="0" w:before="0"/>
+        <w:spacing w:after="90" w:before="0"/>
         <w:jc w:val="left"/>
       </w:pPr>
       <w:r>
         <w:rPr>
-          <w:rFonts w:ascii="Times New Roman" w:hAnsi="Times New Roman"/>
           <w:b w:val="0"/>
           <w:i w:val="0"/>
-          <w:sz w:val="0"/>
+          <w:sz w:val="20"/>
         </w:rPr>
         <w:t>The Board recorded that the recognition of the Founder is intended to preserve and honour:</w:t>
       </w:r>
     </w:p>
     <w:p>
       <w:pPr>
-        <w:spacing w:after="0"/>
-        <w:ind w:left="1829"/>
-        <w:jc w:val="both"/>
+        <w:spacing w:after="35"/>
+        <w:jc w:val="left"/>
       </w:pPr>
       <w:r>
         <w:rPr>
-          <w:rFonts w:ascii="Times New Roman" w:hAnsi="Times New Roman"/>
-          <w:sz w:val="0"/>
+          <w:b/>
+          <w:sz w:val="20"/>
         </w:rPr>
-        <w:t>• The founding vision of ASCO NPC;</w:t>
+        <w:t>•</w:t>
+      </w:r>
+      <w:r>
+        <w:rPr>
+          <w:sz w:val="20"/>
+        </w:rPr>
+        <w:t>The founding vision of ASCO NPC;</w:t>
       </w:r>
     </w:p>
     <w:p>
       <w:pPr>
-        <w:spacing w:after="0"/>
-        <w:ind w:left="1829"/>
-        <w:jc w:val="both"/>
+        <w:spacing w:after="35"/>
+        <w:jc w:val="left"/>
       </w:pPr>
       <w:r>
         <w:rPr>
-          <w:rFonts w:ascii="Times New Roman" w:hAnsi="Times New Roman"/>
-          <w:sz w:val="0"/>
+          <w:b/>
+          <w:sz w:val="20"/>
         </w:rPr>
-        <w:t>• The contribution and sacrifice made during the establishment of the organisation;</w:t>
+        <w:t>•</w:t>
+      </w:r>
+      <w:r>
+        <w:rPr>
+          <w:sz w:val="20"/>
+        </w:rPr>
+        <w:t>The contribution and sacrifice made during the establishment of the organisation;</w:t>
       </w:r>
     </w:p>
     <w:p>
       <w:pPr>
-        <w:spacing w:after="0"/>
-        <w:ind w:left="1829"/>
-        <w:jc w:val="both"/>
+        <w:spacing w:after="35"/>
+        <w:jc w:val="left"/>
       </w:pPr>
       <w:r>
         <w:rPr>
-          <w:rFonts w:ascii="Times New Roman" w:hAnsi="Times New Roman"/>
-          <w:sz w:val="0"/>
+          <w:b/>
+          <w:sz w:val="20"/>
         </w:rPr>
-        <w:t>• The principles, values and objectives upon which ASCO NPC was created.</w:t>
+        <w:t>•</w:t>
+      </w:r>
+      <w:r>
+        <w:rPr>
+          <w:sz w:val="20"/>
+        </w:rPr>
+        <w:t>The principles, values and objectives upon which ASCO NPC was created.</w:t>
       </w:r>
     </w:p>
     <w:p>
       <w:pPr>
-        <w:spacing w:after="0" w:before="0"/>
+        <w:spacing w:after="90" w:before="0"/>
         <w:jc w:val="left"/>
       </w:pPr>
       <w:r>
         <w:rPr>
-          <w:rFonts w:ascii="Times New Roman" w:hAnsi="Times New Roman"/>
           <w:b w:val="0"/>
           <w:i w:val="0"/>
-          <w:sz w:val="0"/>
+          <w:sz w:val="20"/>
         </w:rPr>
         <w:t>The Board further resolved that:</w:t>
       </w:r>
     </w:p>
     <w:p>
       <w:pPr>
-        <w:spacing w:after="0"/>
+        <w:spacing w:after="90"/>
         <w:ind w:left="1829"/>
-        <w:jc w:val="both"/>
+        <w:jc w:val="left"/>
       </w:pPr>
       <w:r>
         <w:rPr>
-          <w:rFonts w:ascii="Times New Roman" w:hAnsi="Times New Roman"/>
-          <w:sz w:val="0"/>
+          <w:sz w:val="20"/>
         </w:rPr>
         <w:t>7.1  Recognition of the Founder does not create ownership rights, personal control or financial entitlement over ASCO NPC;</w:t>
       </w:r>
     </w:p>
     <w:p>
       <w:pPr>
-        <w:spacing w:after="0"/>
+        <w:spacing w:after="90"/>
         <w:ind w:left="1829"/>
-        <w:jc w:val="both"/>
+        <w:jc w:val="left"/>
       </w:pPr>
       <w:r>
         <w:rPr>
-          <w:rFonts w:ascii="Times New Roman" w:hAnsi="Times New Roman"/>
-          <w:sz w:val="0"/>
+          <w:sz w:val="20"/>
         </w:rPr>
         <w:t>7.2  ASCO NPC remains an independent non-profit company established for public benefit purposes;</w:t>
       </w:r>
     </w:p>
     <w:p>
       <w:pPr>
-        <w:spacing w:after="0"/>
+        <w:spacing w:after="90"/>
         <w:ind w:left="1829"/>
-        <w:jc w:val="both"/>
+        <w:jc w:val="left"/>
       </w:pPr>
       <w:r>
         <w:rPr>
-          <w:rFonts w:ascii="Times New Roman" w:hAnsi="Times New Roman"/>
-          <w:sz w:val="0"/>
+          <w:sz w:val="20"/>
         </w:rPr>
         <w:t>7.3  The Founder's recognition exists to protect institutional memory, history and founding values for future generations;</w:t>
       </w:r>
     </w:p>
     <w:p>
       <w:pPr>
-        <w:spacing w:after="0"/>
+        <w:spacing w:after="90"/>
         <w:ind w:left="1829"/>
-        <w:jc w:val="both"/>
+        <w:jc w:val="left"/>
       </w:pPr>
       <w:r>
         <w:rPr>
-          <w:rFonts w:ascii="Times New Roman" w:hAnsi="Times New Roman"/>
-          <w:sz w:val="0"/>
+          <w:sz w:val="20"/>
         </w:rPr>
         <w:t>7.4  Future leadership structures shall respect and uphold the founding principles of ASCO NPC.</w:t>
       </w:r>
     </w:p>
     <w:p>
       <w:pPr>
-        <w:spacing w:after="0" w:before="0"/>
+        <w:spacing w:after="90" w:before="90"/>
         <w:jc w:val="center"/>
         <w:pBdr>
           <w:bottom w:val="single" w:sz="4" w:space="1" w:color="000000"/>
@@ -970,413 +974,469 @@
     </w:p>
     <w:p>
       <w:pPr>
-        <w:spacing w:after="0" w:before="0"/>
+        <w:spacing w:after="90" w:before="180"/>
         <w:jc w:val="left"/>
       </w:pPr>
       <w:r>
         <w:rPr>
-          <w:rFonts w:ascii="Times New Roman" w:hAnsi="Times New Roman"/>
           <w:b/>
           <w:i w:val="0"/>
-          <w:sz w:val="0"/>
+          <w:sz w:val="22"/>
         </w:rPr>
         <w:t>8. CONFIRMATION OF GOVERNANCE STRUCTURE</w:t>
       </w:r>
     </w:p>
     <w:p>
       <w:pPr>
-        <w:spacing w:after="0" w:before="0"/>
+        <w:spacing w:after="90" w:before="0"/>
         <w:jc w:val="left"/>
       </w:pPr>
       <w:r>
         <w:rPr>
-          <w:rFonts w:ascii="Times New Roman" w:hAnsi="Times New Roman"/>
           <w:b w:val="0"/>
           <w:i w:val="0"/>
-          <w:sz w:val="0"/>
+          <w:sz w:val="20"/>
         </w:rPr>
         <w:t>The Board confirmed the following governance structure:</w:t>
       </w:r>
     </w:p>
     <w:p>
       <w:pPr>
-        <w:spacing w:after="0" w:before="0"/>
+        <w:spacing w:after="90" w:before="180"/>
         <w:jc w:val="left"/>
       </w:pPr>
       <w:r>
         <w:rPr>
-          <w:rFonts w:ascii="Times New Roman" w:hAnsi="Times New Roman"/>
           <w:b/>
           <w:i w:val="0"/>
-          <w:sz w:val="0"/>
+          <w:sz w:val="22"/>
         </w:rPr>
         <w:t>8.1 Chairlady of the Board</w:t>
       </w:r>
     </w:p>
     <w:p>
       <w:pPr>
-        <w:spacing w:after="0" w:before="0"/>
+        <w:spacing w:after="90" w:before="0"/>
         <w:jc w:val="left"/>
       </w:pPr>
       <w:r>
         <w:rPr>
-          <w:rFonts w:ascii="Times New Roman" w:hAnsi="Times New Roman"/>
           <w:b/>
           <w:i w:val="0"/>
-          <w:sz w:val="0"/>
+          <w:sz w:val="20"/>
         </w:rPr>
         <w:t>Ms Busisiwe Makhosi Shandu</w:t>
       </w:r>
     </w:p>
     <w:p>
       <w:pPr>
-        <w:spacing w:after="0" w:before="0"/>
+        <w:spacing w:after="90" w:before="0"/>
         <w:jc w:val="left"/>
       </w:pPr>
       <w:r>
         <w:rPr>
-          <w:rFonts w:ascii="Times New Roman" w:hAnsi="Times New Roman"/>
           <w:b w:val="0"/>
           <w:i w:val="0"/>
-          <w:sz w:val="0"/>
+          <w:sz w:val="20"/>
         </w:rPr>
         <w:t>The Chairlady shall provide leadership to the Board, ensure effective governance oversight and safeguard the founding principles and long-term vision of ASCO NPC.</w:t>
       </w:r>
     </w:p>
     <w:p>
       <w:pPr>
-        <w:spacing w:after="0" w:before="0"/>
+        <w:spacing w:after="90" w:before="180"/>
         <w:jc w:val="left"/>
       </w:pPr>
       <w:r>
         <w:rPr>
-          <w:rFonts w:ascii="Times New Roman" w:hAnsi="Times New Roman"/>
           <w:b/>
           <w:i w:val="0"/>
-          <w:sz w:val="0"/>
+          <w:sz w:val="22"/>
         </w:rPr>
         <w:t>8.2 Executive Director</w:t>
       </w:r>
     </w:p>
     <w:p>
       <w:pPr>
-        <w:spacing w:after="0" w:before="0"/>
+        <w:spacing w:after="90" w:before="0"/>
         <w:jc w:val="left"/>
       </w:pPr>
       <w:r>
         <w:rPr>
-          <w:rFonts w:ascii="Times New Roman" w:hAnsi="Times New Roman"/>
           <w:b/>
           <w:i w:val="0"/>
-          <w:sz w:val="0"/>
+          <w:sz w:val="20"/>
         </w:rPr>
         <w:t>Mr Bhekisisa Shandu</w:t>
       </w:r>
     </w:p>
     <w:p>
       <w:pPr>
-        <w:spacing w:after="0" w:before="0"/>
+        <w:spacing w:after="90" w:before="0"/>
         <w:jc w:val="left"/>
       </w:pPr>
       <w:r>
         <w:rPr>
-          <w:rFonts w:ascii="Times New Roman" w:hAnsi="Times New Roman"/>
           <w:b w:val="0"/>
           <w:i w:val="0"/>
-          <w:sz w:val="0"/>
+          <w:sz w:val="20"/>
         </w:rPr>
         <w:t>The Executive Director shall be responsible for:</w:t>
       </w:r>
     </w:p>
     <w:p>
       <w:pPr>
-        <w:spacing w:after="0"/>
-        <w:ind w:left="1829"/>
-        <w:jc w:val="both"/>
+        <w:spacing w:after="35"/>
+        <w:jc w:val="left"/>
       </w:pPr>
       <w:r>
         <w:rPr>
-          <w:rFonts w:ascii="Times New Roman" w:hAnsi="Times New Roman"/>
-          <w:sz w:val="0"/>
+          <w:b/>
+          <w:sz w:val="20"/>
         </w:rPr>
-        <w:t>• Implementation of Board resolutions;</w:t>
+        <w:t>•</w:t>
+      </w:r>
+      <w:r>
+        <w:rPr>
+          <w:sz w:val="20"/>
+        </w:rPr>
+        <w:t>Implementation of Board resolutions;</w:t>
       </w:r>
     </w:p>
     <w:p>
       <w:pPr>
-        <w:spacing w:after="0"/>
-        <w:ind w:left="1829"/>
-        <w:jc w:val="both"/>
+        <w:spacing w:after="35"/>
+        <w:jc w:val="left"/>
       </w:pPr>
       <w:r>
         <w:rPr>
-          <w:rFonts w:ascii="Times New Roman" w:hAnsi="Times New Roman"/>
-          <w:sz w:val="0"/>
+          <w:b/>
+          <w:sz w:val="20"/>
         </w:rPr>
-        <w:t>• Day-to-day executive management of ASCO NPC;</w:t>
+        <w:t>•</w:t>
+      </w:r>
+      <w:r>
+        <w:rPr>
+          <w:sz w:val="20"/>
+        </w:rPr>
+        <w:t>Day-to-day executive management of ASCO NPC;</w:t>
       </w:r>
     </w:p>
     <w:p>
       <w:pPr>
-        <w:spacing w:after="0"/>
-        <w:ind w:left="1829"/>
-        <w:jc w:val="both"/>
+        <w:spacing w:after="35"/>
+        <w:jc w:val="left"/>
       </w:pPr>
       <w:r>
         <w:rPr>
-          <w:rFonts w:ascii="Times New Roman" w:hAnsi="Times New Roman"/>
-          <w:sz w:val="0"/>
+          <w:b/>
+          <w:sz w:val="20"/>
         </w:rPr>
-        <w:t>• Coordination of organisational programmes and operations;</w:t>
+        <w:t>•</w:t>
+      </w:r>
+      <w:r>
+        <w:rPr>
+          <w:sz w:val="20"/>
+        </w:rPr>
+        <w:t>Coordination of organisational programmes and operations;</w:t>
       </w:r>
     </w:p>
     <w:p>
       <w:pPr>
-        <w:spacing w:after="0"/>
-        <w:ind w:left="1829"/>
-        <w:jc w:val="both"/>
+        <w:spacing w:after="35"/>
+        <w:jc w:val="left"/>
       </w:pPr>
       <w:r>
         <w:rPr>
-          <w:rFonts w:ascii="Times New Roman" w:hAnsi="Times New Roman"/>
-          <w:sz w:val="0"/>
+          <w:b/>
+          <w:sz w:val="20"/>
         </w:rPr>
-        <w:t>• Providing strategic leadership and institutional direction;</w:t>
+        <w:t>•</w:t>
+      </w:r>
+      <w:r>
+        <w:rPr>
+          <w:sz w:val="20"/>
+        </w:rPr>
+        <w:t>Providing strategic leadership and institutional direction;</w:t>
       </w:r>
     </w:p>
     <w:p>
       <w:pPr>
-        <w:spacing w:after="0"/>
-        <w:ind w:left="1829"/>
-        <w:jc w:val="both"/>
+        <w:spacing w:after="35"/>
+        <w:jc w:val="left"/>
       </w:pPr>
       <w:r>
         <w:rPr>
-          <w:rFonts w:ascii="Times New Roman" w:hAnsi="Times New Roman"/>
-          <w:sz w:val="0"/>
+          <w:b/>
+          <w:sz w:val="20"/>
         </w:rPr>
-        <w:t>• Ensuring effective administration and execution of organisational objectives.</w:t>
+        <w:t>•</w:t>
+      </w:r>
+      <w:r>
+        <w:rPr>
+          <w:sz w:val="20"/>
+        </w:rPr>
+        <w:t>Ensuring effective administration and execution of organisational objectives.</w:t>
       </w:r>
     </w:p>
     <w:p>
       <w:pPr>
-        <w:spacing w:after="0" w:before="0"/>
+        <w:spacing w:after="90" w:before="180"/>
         <w:jc w:val="left"/>
       </w:pPr>
       <w:r>
         <w:rPr>
-          <w:rFonts w:ascii="Times New Roman" w:hAnsi="Times New Roman"/>
           <w:b/>
           <w:i w:val="0"/>
-          <w:sz w:val="0"/>
+          <w:sz w:val="22"/>
         </w:rPr>
         <w:t>8.3 Director: Head of ICT and Communications</w:t>
       </w:r>
     </w:p>
     <w:p>
       <w:pPr>
-        <w:spacing w:after="0" w:before="0"/>
+        <w:spacing w:after="90" w:before="0"/>
         <w:jc w:val="left"/>
       </w:pPr>
       <w:r>
         <w:rPr>
-          <w:rFonts w:ascii="Times New Roman" w:hAnsi="Times New Roman"/>
           <w:b/>
           <w:i w:val="0"/>
-          <w:sz w:val="0"/>
+          <w:sz w:val="20"/>
         </w:rPr>
         <w:t>Mr Thapelo Nelson Maqalika</w:t>
       </w:r>
     </w:p>
     <w:p>
       <w:pPr>
-        <w:spacing w:after="0" w:before="0"/>
+        <w:spacing w:after="90" w:before="0"/>
         <w:jc w:val="left"/>
       </w:pPr>
       <w:r>
         <w:rPr>
-          <w:rFonts w:ascii="Times New Roman" w:hAnsi="Times New Roman"/>
           <w:b w:val="0"/>
           <w:i w:val="0"/>
-          <w:sz w:val="0"/>
+          <w:sz w:val="20"/>
         </w:rPr>
         <w:t>The Board resolved that Mr Maqalika shall:</w:t>
       </w:r>
     </w:p>
     <w:p>
       <w:pPr>
-        <w:spacing w:after="0"/>
-        <w:ind w:left="1829"/>
-        <w:jc w:val="both"/>
+        <w:spacing w:after="35"/>
+        <w:jc w:val="left"/>
       </w:pPr>
       <w:r>
         <w:rPr>
-          <w:rFonts w:ascii="Times New Roman" w:hAnsi="Times New Roman"/>
-          <w:sz w:val="0"/>
+          <w:b/>
+          <w:sz w:val="20"/>
         </w:rPr>
-        <w:t>• Coordinate ICT and communication functions of ASCO NPC;</w:t>
+        <w:t>•</w:t>
+      </w:r>
+      <w:r>
+        <w:rPr>
+          <w:sz w:val="20"/>
+        </w:rPr>
+        <w:t>Coordinate ICT and communication functions of ASCO NPC;</w:t>
       </w:r>
     </w:p>
     <w:p>
       <w:pPr>
-        <w:spacing w:after="0"/>
-        <w:ind w:left="1829"/>
-        <w:jc w:val="both"/>
+        <w:spacing w:after="35"/>
+        <w:jc w:val="left"/>
       </w:pPr>
       <w:r>
         <w:rPr>
-          <w:rFonts w:ascii="Times New Roman" w:hAnsi="Times New Roman"/>
-          <w:sz w:val="0"/>
+          <w:b/>
+          <w:sz w:val="20"/>
         </w:rPr>
-        <w:t>• Manage communication-related administrative processes;</w:t>
+        <w:t>•</w:t>
+      </w:r>
+      <w:r>
+        <w:rPr>
+          <w:sz w:val="20"/>
+        </w:rPr>
+        <w:t>Manage communication-related administrative processes;</w:t>
       </w:r>
     </w:p>
     <w:p>
       <w:pPr>
-        <w:spacing w:after="0"/>
-        <w:ind w:left="1829"/>
-        <w:jc w:val="both"/>
+        <w:spacing w:after="35"/>
+        <w:jc w:val="left"/>
       </w:pPr>
       <w:r>
         <w:rPr>
-          <w:rFonts w:ascii="Times New Roman" w:hAnsi="Times New Roman"/>
-          <w:sz w:val="0"/>
+          <w:b/>
+          <w:sz w:val="20"/>
         </w:rPr>
-        <w:t>• Be specifically mandated to coordinate the submission and registration process of the adopted MOI with the Companies and Intellectual Property Commission (CIPC);</w:t>
+        <w:t>•</w:t>
+      </w:r>
+      <w:r>
+        <w:rPr>
+          <w:sz w:val="20"/>
+        </w:rPr>
+        <w:t>Be specifically mandated to coordinate the submission and registration process of the adopted MOI with the Companies and Intellectual Property Commission (CIPC);</w:t>
       </w:r>
     </w:p>
     <w:p>
       <w:pPr>
-        <w:spacing w:after="0"/>
-        <w:ind w:left="1829"/>
-        <w:jc w:val="both"/>
+        <w:spacing w:after="35"/>
+        <w:jc w:val="left"/>
       </w:pPr>
       <w:r>
         <w:rPr>
-          <w:rFonts w:ascii="Times New Roman" w:hAnsi="Times New Roman"/>
-          <w:sz w:val="0"/>
+          <w:b/>
+          <w:sz w:val="20"/>
         </w:rPr>
-        <w:t>• Work directly with the Office of the Executive Director to ensure all required documentation, correspondence and regulatory requirements are properly managed.</w:t>
+        <w:t>•</w:t>
+      </w:r>
+      <w:r>
+        <w:rPr>
+          <w:sz w:val="20"/>
+        </w:rPr>
+        <w:t>Work directly with the Office of the Executive Director to ensure all required documentation, correspondence and regulatory requirements are properly managed.</w:t>
       </w:r>
     </w:p>
     <w:p>
       <w:pPr>
-        <w:spacing w:after="0" w:before="0"/>
+        <w:spacing w:after="90" w:before="180"/>
         <w:jc w:val="left"/>
       </w:pPr>
       <w:r>
         <w:rPr>
-          <w:rFonts w:ascii="Times New Roman" w:hAnsi="Times New Roman"/>
           <w:b/>
           <w:i w:val="0"/>
-          <w:sz w:val="0"/>
+          <w:sz w:val="22"/>
         </w:rPr>
         <w:t>8.4 Director: People and Culture</w:t>
       </w:r>
     </w:p>
     <w:p>
       <w:pPr>
-        <w:spacing w:after="0" w:before="0"/>
+        <w:spacing w:after="90" w:before="0"/>
         <w:jc w:val="left"/>
       </w:pPr>
       <w:r>
         <w:rPr>
-          <w:rFonts w:ascii="Times New Roman" w:hAnsi="Times New Roman"/>
           <w:b/>
           <w:i w:val="0"/>
-          <w:sz w:val="0"/>
+          <w:sz w:val="20"/>
         </w:rPr>
         <w:t>Mr Khulekani Gumede</w:t>
       </w:r>
     </w:p>
     <w:p>
       <w:pPr>
-        <w:spacing w:after="0" w:before="0"/>
+        <w:spacing w:after="90" w:before="0"/>
         <w:jc w:val="left"/>
       </w:pPr>
       <w:r>
         <w:rPr>
-          <w:rFonts w:ascii="Times New Roman" w:hAnsi="Times New Roman"/>
           <w:b w:val="0"/>
           <w:i w:val="0"/>
-          <w:sz w:val="0"/>
+          <w:sz w:val="20"/>
         </w:rPr>
         <w:t>The Board confirmed that Mr Gumede shall provide leadership and oversight relating to:</w:t>
       </w:r>
     </w:p>
     <w:p>
       <w:pPr>
-        <w:spacing w:after="0"/>
-        <w:ind w:left="1829"/>
-        <w:jc w:val="both"/>
+        <w:spacing w:after="35"/>
+        <w:jc w:val="left"/>
       </w:pPr>
       <w:r>
         <w:rPr>
-          <w:rFonts w:ascii="Times New Roman" w:hAnsi="Times New Roman"/>
-          <w:sz w:val="0"/>
+          <w:b/>
+          <w:sz w:val="20"/>
         </w:rPr>
-        <w:t>• People management;</w:t>
+        <w:t>•</w:t>
+      </w:r>
+      <w:r>
+        <w:rPr>
+          <w:sz w:val="20"/>
+        </w:rPr>
+        <w:t>People management;</w:t>
       </w:r>
     </w:p>
     <w:p>
       <w:pPr>
-        <w:spacing w:after="0"/>
-        <w:ind w:left="1829"/>
-        <w:jc w:val="both"/>
+        <w:spacing w:after="35"/>
+        <w:jc w:val="left"/>
       </w:pPr>
       <w:r>
         <w:rPr>
-          <w:rFonts w:ascii="Times New Roman" w:hAnsi="Times New Roman"/>
-          <w:sz w:val="0"/>
+          <w:b/>
+          <w:sz w:val="20"/>
         </w:rPr>
-        <w:t>• Organisational culture;</w:t>
+        <w:t>•</w:t>
+      </w:r>
+      <w:r>
+        <w:rPr>
+          <w:sz w:val="20"/>
+        </w:rPr>
+        <w:t>Organisational culture;</w:t>
       </w:r>
     </w:p>
     <w:p>
       <w:pPr>
-        <w:spacing w:after="0"/>
-        <w:ind w:left="1829"/>
-        <w:jc w:val="both"/>
+        <w:spacing w:after="35"/>
+        <w:jc w:val="left"/>
       </w:pPr>
       <w:r>
         <w:rPr>
-          <w:rFonts w:ascii="Times New Roman" w:hAnsi="Times New Roman"/>
-          <w:sz w:val="0"/>
+          <w:b/>
+          <w:sz w:val="20"/>
         </w:rPr>
-        <w:t>• Human capital development;</w:t>
+        <w:t>•</w:t>
+      </w:r>
+      <w:r>
+        <w:rPr>
+          <w:sz w:val="20"/>
+        </w:rPr>
+        <w:t>Human capital development;</w:t>
       </w:r>
     </w:p>
     <w:p>
       <w:pPr>
-        <w:spacing w:after="0"/>
-        <w:ind w:left="1829"/>
-        <w:jc w:val="both"/>
+        <w:spacing w:after="35"/>
+        <w:jc w:val="left"/>
       </w:pPr>
       <w:r>
         <w:rPr>
-          <w:rFonts w:ascii="Times New Roman" w:hAnsi="Times New Roman"/>
-          <w:sz w:val="0"/>
+          <w:b/>
+          <w:sz w:val="20"/>
         </w:rPr>
-        <w:t>• Governance participation;</w:t>
+        <w:t>•</w:t>
+      </w:r>
+      <w:r>
+        <w:rPr>
+          <w:sz w:val="20"/>
+        </w:rPr>
+        <w:t>Governance participation;</w:t>
       </w:r>
     </w:p>
     <w:p>
       <w:pPr>
-        <w:spacing w:after="0"/>
-        <w:ind w:left="1829"/>
-        <w:jc w:val="both"/>
+        <w:spacing w:after="35"/>
+        <w:jc w:val="left"/>
       </w:pPr>
       <w:r>
         <w:rPr>
-          <w:rFonts w:ascii="Times New Roman" w:hAnsi="Times New Roman"/>
-          <w:sz w:val="0"/>
+          <w:b/>
+          <w:sz w:val="20"/>
         </w:rPr>
-        <w:t>• Supporting effective institutional growth.</w:t>
+        <w:t>•</w:t>
+      </w:r>
+      <w:r>
+        <w:rPr>
+          <w:sz w:val="20"/>
+        </w:rPr>
+        <w:t>Supporting effective institutional growth.</w:t>
       </w:r>
     </w:p>
     <w:p>
       <w:pPr>
-        <w:spacing w:after="0" w:before="0"/>
+        <w:spacing w:after="90" w:before="90"/>
         <w:jc w:val="center"/>
         <w:pBdr>
           <w:bottom w:val="single" w:sz="4" w:space="1" w:color="000000"/>
@@ -1385,165 +1445,154 @@
     </w:p>
     <w:p>
       <w:pPr>
-        <w:spacing w:after="0" w:before="0"/>
+        <w:spacing w:after="90" w:before="180"/>
         <w:jc w:val="left"/>
       </w:pPr>
       <w:r>
         <w:rPr>
-          <w:rFonts w:ascii="Times New Roman" w:hAnsi="Times New Roman"/>
           <w:b/>
           <w:i w:val="0"/>
-          <w:sz w:val="0"/>
+          <w:sz w:val="22"/>
         </w:rPr>
         <w:t>9. BOARD RESOLUTION: ADOPTION OF CUSTOMISED MOI</w:t>
       </w:r>
     </w:p>
     <w:p>
       <w:pPr>
-        <w:spacing w:after="0" w:before="0"/>
+        <w:spacing w:after="90" w:before="0"/>
         <w:jc w:val="left"/>
       </w:pPr>
       <w:r>
         <w:rPr>
-          <w:rFonts w:ascii="Times New Roman" w:hAnsi="Times New Roman"/>
           <w:b w:val="0"/>
           <w:i w:val="0"/>
-          <w:sz w:val="0"/>
+          <w:sz w:val="20"/>
         </w:rPr>
         <w:t>After thorough consideration and discussion, the Board unanimously adopted the following resolution:</w:t>
       </w:r>
     </w:p>
     <w:p>
       <w:pPr>
-        <w:spacing w:after="0" w:before="0"/>
+        <w:spacing w:after="90" w:before="180"/>
         <w:jc w:val="left"/>
       </w:pPr>
       <w:r>
         <w:rPr>
-          <w:rFonts w:ascii="Times New Roman" w:hAnsi="Times New Roman"/>
           <w:b/>
           <w:i w:val="0"/>
-          <w:sz w:val="0"/>
+          <w:sz w:val="20"/>
         </w:rPr>
         <w:t>RESOLUTION NUMBER: ASCO/BOD/MOI/2026/01</w:t>
       </w:r>
     </w:p>
     <w:p>
       <w:pPr>
-        <w:spacing w:after="0" w:before="0"/>
+        <w:spacing w:after="90" w:before="0"/>
         <w:jc w:val="left"/>
       </w:pPr>
       <w:r>
         <w:rPr>
-          <w:rFonts w:ascii="Times New Roman" w:hAnsi="Times New Roman"/>
           <w:b/>
           <w:i w:val="0"/>
-          <w:sz w:val="0"/>
+          <w:sz w:val="20"/>
         </w:rPr>
         <w:t>IT IS HEREBY RESOLVED THAT:</w:t>
       </w:r>
     </w:p>
     <w:p>
       <w:pPr>
-        <w:spacing w:after="0"/>
+        <w:spacing w:after="90"/>
         <w:ind w:left="1829"/>
-        <w:jc w:val="both"/>
+        <w:jc w:val="left"/>
       </w:pPr>
       <w:r>
         <w:rPr>
-          <w:rFonts w:ascii="Times New Roman" w:hAnsi="Times New Roman"/>
-          <w:sz w:val="0"/>
+          <w:sz w:val="20"/>
         </w:rPr>
         <w:t>1.  The Board of Directors hereby approves and adopts the customised Memorandum of Incorporation of African Solidarity Civic Organisation NPC.</w:t>
       </w:r>
     </w:p>
     <w:p>
       <w:pPr>
-        <w:spacing w:after="0"/>
+        <w:spacing w:after="90"/>
         <w:ind w:left="1829"/>
-        <w:jc w:val="both"/>
+        <w:jc w:val="left"/>
       </w:pPr>
       <w:r>
         <w:rPr>
-          <w:rFonts w:ascii="Times New Roman" w:hAnsi="Times New Roman"/>
-          <w:sz w:val="0"/>
+          <w:sz w:val="20"/>
         </w:rPr>
         <w:t>2.  The adopted MOI shall become the governing constitutional document of ASCO NPC and shall regulate the affairs, governance and administration of the organisation.</w:t>
       </w:r>
     </w:p>
     <w:p>
       <w:pPr>
-        <w:spacing w:after="0"/>
+        <w:spacing w:after="90"/>
         <w:ind w:left="1829"/>
-        <w:jc w:val="both"/>
+        <w:jc w:val="left"/>
       </w:pPr>
       <w:r>
         <w:rPr>
-          <w:rFonts w:ascii="Times New Roman" w:hAnsi="Times New Roman"/>
-          <w:sz w:val="0"/>
+          <w:sz w:val="20"/>
         </w:rPr>
         <w:t>3.  The Board confirms that the customised MOI reflects ASCO NPC's commitment to good governance, accountability, transparency, sustainability and compliance with applicable legislation.</w:t>
       </w:r>
     </w:p>
     <w:p>
       <w:pPr>
-        <w:spacing w:after="0"/>
+        <w:spacing w:after="90"/>
         <w:ind w:left="1829"/>
-        <w:jc w:val="both"/>
+        <w:jc w:val="left"/>
       </w:pPr>
       <w:r>
         <w:rPr>
-          <w:rFonts w:ascii="Times New Roman" w:hAnsi="Times New Roman"/>
-          <w:sz w:val="0"/>
+          <w:sz w:val="20"/>
         </w:rPr>
         <w:t>4.  Mr Thapelo Nelson Maqalika, Director: Head of ICT and Communications, is hereby authorised and mandated to coordinate the registration and submission process of the adopted MOI with CIPC.</w:t>
       </w:r>
     </w:p>
     <w:p>
       <w:pPr>
-        <w:spacing w:after="0"/>
+        <w:spacing w:after="90"/>
         <w:ind w:left="1829"/>
-        <w:jc w:val="both"/>
+        <w:jc w:val="left"/>
       </w:pPr>
       <w:r>
         <w:rPr>
-          <w:rFonts w:ascii="Times New Roman" w:hAnsi="Times New Roman"/>
-          <w:sz w:val="0"/>
+          <w:sz w:val="20"/>
         </w:rPr>
         <w:t>5.  Mr Thapelo Nelson Maqalika shall work directly with the Office of the Executive Director, Mr Bhekisisa Shandu, to ensure successful completion of all administrative and regulatory requirements.</w:t>
       </w:r>
     </w:p>
     <w:p>
       <w:pPr>
-        <w:spacing w:after="0"/>
+        <w:spacing w:after="90"/>
         <w:ind w:left="1829"/>
-        <w:jc w:val="both"/>
+        <w:jc w:val="left"/>
       </w:pPr>
       <w:r>
         <w:rPr>
-          <w:rFonts w:ascii="Times New Roman" w:hAnsi="Times New Roman"/>
-          <w:sz w:val="0"/>
+          <w:sz w:val="20"/>
         </w:rPr>
         <w:t>6.  The Executive Director shall provide executive oversight, institutional support and coordination necessary to implement this resolution.</w:t>
       </w:r>
     </w:p>
     <w:p>
       <w:pPr>
-        <w:spacing w:after="0"/>
+        <w:spacing w:after="90"/>
         <w:ind w:left="1829"/>
-        <w:jc w:val="both"/>
+        <w:jc w:val="left"/>
       </w:pPr>
       <w:r>
         <w:rPr>
-          <w:rFonts w:ascii="Times New Roman" w:hAnsi="Times New Roman"/>
-          <w:sz w:val="0"/>
+          <w:sz w:val="20"/>
         </w:rPr>
         <w:t>7.  The Chairlady of the Board and any authorised Director are empowered to sign documents necessary to give effect to this resolution.</w:t>
       </w:r>
     </w:p>
     <w:p>
       <w:pPr>
-        <w:spacing w:after="0" w:before="0"/>
+        <w:spacing w:after="90" w:before="90"/>
         <w:jc w:val="center"/>
         <w:pBdr>
           <w:bottom w:val="single" w:sz="4" w:space="1" w:color="000000"/>
@@ -1552,79 +1601,74 @@
     </w:p>
     <w:p>
       <w:pPr>
-        <w:spacing w:after="0" w:before="0"/>
+        <w:spacing w:after="90" w:before="180"/>
         <w:jc w:val="left"/>
       </w:pPr>
       <w:r>
         <w:rPr>
-          <w:rFonts w:ascii="Times New Roman" w:hAnsi="Times New Roman"/>
           <w:b/>
           <w:i w:val="0"/>
-          <w:sz w:val="0"/>
+          <w:sz w:val="22"/>
         </w:rPr>
         <w:t>10. IMPLEMENTATION OF THE RESOLUTION</w:t>
       </w:r>
     </w:p>
     <w:p>
       <w:pPr>
-        <w:spacing w:after="0" w:before="0"/>
+        <w:spacing w:after="90" w:before="0"/>
         <w:jc w:val="left"/>
       </w:pPr>
       <w:r>
         <w:rPr>
-          <w:rFonts w:ascii="Times New Roman" w:hAnsi="Times New Roman"/>
           <w:b w:val="0"/>
           <w:i w:val="0"/>
-          <w:sz w:val="0"/>
+          <w:sz w:val="20"/>
         </w:rPr>
         <w:t>The Board directed that:</w:t>
       </w:r>
     </w:p>
     <w:p>
       <w:pPr>
-        <w:spacing w:after="0"/>
+        <w:spacing w:after="90"/>
         <w:ind w:left="1829"/>
-        <w:jc w:val="both"/>
+        <w:jc w:val="left"/>
       </w:pPr>
       <w:r>
         <w:rPr>
-          <w:rFonts w:ascii="Times New Roman" w:hAnsi="Times New Roman"/>
-          <w:sz w:val="0"/>
+          <w:sz w:val="20"/>
         </w:rPr>
         <w:t>10.1  The adopted MOI shall be submitted to CIPC through the appropriate channels;</w:t>
       </w:r>
     </w:p>
     <w:p>
       <w:pPr>
-        <w:spacing w:after="0"/>
+        <w:spacing w:after="90"/>
         <w:ind w:left="1829"/>
-        <w:jc w:val="both"/>
+        <w:jc w:val="left"/>
       </w:pPr>
       <w:r>
         <w:rPr>
-          <w:rFonts w:ascii="Times New Roman" w:hAnsi="Times New Roman"/>
-          <w:sz w:val="0"/>
+          <w:sz w:val="20"/>
         </w:rPr>
         <w:t>10.2  All organisational policies, governance documents and operational frameworks shall be reviewed for alignment with the adopted MOI;</w:t>
       </w:r>
     </w:p>
     <w:p>
       <w:pPr>
-        <w:spacing w:after="0"/>
+        <w:spacing w:after="90"/>
         <w:ind w:left="1829"/>
-        <w:jc w:val="both"/>
+        <w:jc w:val="left"/>
       </w:pPr>
       <w:r>
         <w:rPr>
-          <w:rFonts w:ascii="Times New Roman" w:hAnsi="Times New Roman"/>
-          <w:sz w:val="0"/>
+          <w:sz w:val="20"/>
         </w:rPr>
         <w:t>10.3  The governance framework shall support ASCO NPC's future applications, including engagements relating to SARS PBO status, Section 18A approval, donor compliance and international partnerships.</w:t>
       </w:r>
     </w:p>
     <w:p>
       <w:pPr>
-        <w:spacing w:after="0" w:before="0"/>
+        <w:spacing w:after="90" w:before="90"/>
         <w:jc w:val="center"/>
         <w:pBdr>
           <w:bottom w:val="single" w:sz="4" w:space="1" w:color="000000"/>
@@ -1633,52 +1677,49 @@
     </w:p>
     <w:p>
       <w:pPr>
-        <w:spacing w:after="0" w:before="0"/>
+        <w:spacing w:after="90" w:before="180"/>
         <w:jc w:val="left"/>
       </w:pPr>
       <w:r>
         <w:rPr>
-          <w:rFonts w:ascii="Times New Roman" w:hAnsi="Times New Roman"/>
           <w:b/>
           <w:i w:val="0"/>
-          <w:sz w:val="0"/>
+          <w:sz w:val="22"/>
         </w:rPr>
         <w:t>11. CLOSURE</w:t>
       </w:r>
     </w:p>
     <w:p>
       <w:pPr>
-        <w:spacing w:after="0" w:before="0"/>
+        <w:spacing w:after="90" w:before="0"/>
         <w:jc w:val="left"/>
       </w:pPr>
       <w:r>
         <w:rPr>
-          <w:rFonts w:ascii="Times New Roman" w:hAnsi="Times New Roman"/>
           <w:b w:val="0"/>
           <w:i w:val="0"/>
-          <w:sz w:val="0"/>
+          <w:sz w:val="20"/>
         </w:rPr>
         <w:t>There being no further matters for consideration, the Chairlady thanked all Directors for their participation and declared the meeting officially closed.</w:t>
       </w:r>
     </w:p>
     <w:p>
       <w:pPr>
-        <w:spacing w:after="0" w:before="0"/>
+        <w:spacing w:after="90" w:before="180"/>
         <w:jc w:val="left"/>
       </w:pPr>
       <w:r>
         <w:rPr>
-          <w:rFonts w:ascii="Times New Roman" w:hAnsi="Times New Roman"/>
           <w:b w:val="0"/>
           <w:i w:val="0"/>
-          <w:sz w:val="0"/>
+          <w:sz w:val="20"/>
         </w:rPr>
         <w:t>Time closed: ____________________</w:t>
       </w:r>
     </w:p>
     <w:p>
       <w:pPr>
-        <w:spacing w:after="0" w:before="0"/>
+        <w:spacing w:after="90" w:before="90"/>
         <w:jc w:val="center"/>
         <w:pBdr>
           <w:bottom w:val="single" w:sz="4" w:space="1" w:color="000000"/>
@@ -1687,15 +1728,14 @@
     </w:p>
     <w:p>
       <w:pPr>
-        <w:spacing w:after="0" w:before="0"/>
+        <w:spacing w:after="90" w:before="180"/>
         <w:jc w:val="center"/>
       </w:pPr>
       <w:r>
         <w:rPr>
-          <w:rFonts w:ascii="Times New Roman" w:hAnsi="Times New Roman"/>
           <w:b/>
           <w:i w:val="0"/>
-          <w:sz w:val="0"/>
+          <w:sz w:val="22"/>
         </w:rPr>
         <w:t>SIGNATURES OF DIRECTORS</w:t>
       </w:r>

</xml_diff>

<commit_message>
Update Board Minutes - copy template from Constitution document
</commit_message>
<xml_diff>
--- a/ASCO Board Minutes 2026.docx
+++ b/ASCO Board Minutes 2026.docx
@@ -11,7 +11,7 @@
         <w:rPr>
           <w:b/>
           <w:i w:val="0"/>
-          <w:sz w:val="34"/>
+          <w:sz w:val="32"/>
         </w:rPr>
         <w:t>MINUTES OF THE MEETING OF THE BOARD OF DIRECTORS</w:t>
       </w:r>
@@ -25,7 +25,7 @@
         <w:rPr>
           <w:b w:val="0"/>
           <w:i w:val="0"/>
-          <w:sz w:val="22"/>
+          <w:sz w:val="20"/>
         </w:rPr>
         <w:t>OF</w:t>
       </w:r>
@@ -39,21 +39,21 @@
         <w:rPr>
           <w:b/>
           <w:i w:val="0"/>
-          <w:sz w:val="22"/>
+          <w:sz w:val="20"/>
         </w:rPr>
         <w:t>AFRICAN SOLIDARITY CIVIC ORGANISATION NPC</w:t>
       </w:r>
     </w:p>
     <w:p>
       <w:pPr>
-        <w:spacing w:after="220" w:before="0"/>
+        <w:spacing w:after="240" w:before="0"/>
         <w:jc w:val="center"/>
       </w:pPr>
       <w:r>
         <w:rPr>
           <w:b/>
           <w:i w:val="0"/>
-          <w:sz w:val="22"/>
+          <w:sz w:val="20"/>
         </w:rPr>
         <w:t>(ASCO NPC)</w:t>
       </w:r>
@@ -154,7 +154,7 @@
     </w:p>
     <w:p>
       <w:pPr>
-        <w:spacing w:after="90" w:before="180"/>
+        <w:spacing w:after="80" w:before="180"/>
         <w:jc w:val="left"/>
       </w:pPr>
       <w:r>
@@ -219,7 +219,7 @@
     </w:p>
     <w:p>
       <w:pPr>
-        <w:spacing w:after="90" w:before="180"/>
+        <w:spacing w:after="80" w:before="180"/>
         <w:jc w:val="left"/>
       </w:pPr>
       <w:r>
@@ -252,13 +252,13 @@
         <w:tblLook w:firstColumn="1" w:firstRow="1" w:lastColumn="0" w:lastRow="0" w:noHBand="0" w:noVBand="1" w:val="04A0"/>
       </w:tblPr>
       <w:tblGrid>
-        <w:gridCol w:w="4968"/>
-        <w:gridCol w:w="4968"/>
+        <w:gridCol w:w="4513"/>
+        <w:gridCol w:w="4513"/>
       </w:tblGrid>
       <w:tr>
         <w:tc>
           <w:tcPr>
-            <w:tcW w:type="dxa" w:w="4968"/>
+            <w:tcW w:type="dxa" w:w="4513"/>
             <w:shd w:val="clear" w:color="auto" w:fill="145A32"/>
           </w:tcPr>
           <w:p>
@@ -273,7 +273,7 @@
         </w:tc>
         <w:tc>
           <w:tcPr>
-            <w:tcW w:type="dxa" w:w="4968"/>
+            <w:tcW w:type="dxa" w:w="4513"/>
             <w:shd w:val="clear" w:color="auto" w:fill="145A32"/>
           </w:tcPr>
           <w:p>
@@ -290,7 +290,7 @@
       <w:tr>
         <w:tc>
           <w:tcPr>
-            <w:tcW w:type="dxa" w:w="4968"/>
+            <w:tcW w:type="dxa" w:w="4513"/>
           </w:tcPr>
           <w:p>
             <w:r>
@@ -303,7 +303,7 @@
         </w:tc>
         <w:tc>
           <w:tcPr>
-            <w:tcW w:type="dxa" w:w="4968"/>
+            <w:tcW w:type="dxa" w:w="4513"/>
           </w:tcPr>
           <w:p>
             <w:r>
@@ -318,7 +318,7 @@
       <w:tr>
         <w:tc>
           <w:tcPr>
-            <w:tcW w:type="dxa" w:w="4968"/>
+            <w:tcW w:type="dxa" w:w="4513"/>
             <w:shd w:val="clear" w:color="auto" w:fill="F7F8F5"/>
           </w:tcPr>
           <w:p>
@@ -332,7 +332,7 @@
         </w:tc>
         <w:tc>
           <w:tcPr>
-            <w:tcW w:type="dxa" w:w="4968"/>
+            <w:tcW w:type="dxa" w:w="4513"/>
             <w:shd w:val="clear" w:color="auto" w:fill="F7F8F5"/>
           </w:tcPr>
           <w:p>
@@ -348,7 +348,7 @@
       <w:tr>
         <w:tc>
           <w:tcPr>
-            <w:tcW w:type="dxa" w:w="4968"/>
+            <w:tcW w:type="dxa" w:w="4513"/>
           </w:tcPr>
           <w:p>
             <w:r>
@@ -361,7 +361,7 @@
         </w:tc>
         <w:tc>
           <w:tcPr>
-            <w:tcW w:type="dxa" w:w="4968"/>
+            <w:tcW w:type="dxa" w:w="4513"/>
           </w:tcPr>
           <w:p>
             <w:r>
@@ -376,7 +376,7 @@
       <w:tr>
         <w:tc>
           <w:tcPr>
-            <w:tcW w:type="dxa" w:w="4968"/>
+            <w:tcW w:type="dxa" w:w="4513"/>
             <w:shd w:val="clear" w:color="auto" w:fill="F7F8F5"/>
           </w:tcPr>
           <w:p>
@@ -390,7 +390,7 @@
         </w:tc>
         <w:tc>
           <w:tcPr>
-            <w:tcW w:type="dxa" w:w="4968"/>
+            <w:tcW w:type="dxa" w:w="4513"/>
             <w:shd w:val="clear" w:color="auto" w:fill="F7F8F5"/>
           </w:tcPr>
           <w:p>
@@ -407,7 +407,7 @@
     <w:p/>
     <w:p>
       <w:pPr>
-        <w:spacing w:after="90" w:before="180"/>
+        <w:spacing w:after="80" w:before="180"/>
         <w:jc w:val="left"/>
       </w:pPr>
       <w:r>
@@ -444,7 +444,7 @@
     </w:p>
     <w:p>
       <w:pPr>
-        <w:spacing w:after="90" w:before="180"/>
+        <w:spacing w:after="80" w:before="180"/>
         <w:jc w:val="left"/>
       </w:pPr>
       <w:r>
@@ -481,7 +481,7 @@
     </w:p>
     <w:p>
       <w:pPr>
-        <w:spacing w:after="90" w:before="180"/>
+        <w:spacing w:after="80" w:before="180"/>
         <w:jc w:val="left"/>
       </w:pPr>
       <w:r>
@@ -583,7 +583,7 @@
     </w:p>
     <w:p>
       <w:pPr>
-        <w:spacing w:after="90" w:before="180"/>
+        <w:spacing w:after="80" w:before="180"/>
         <w:jc w:val="left"/>
       </w:pPr>
       <w:r>
@@ -625,7 +625,7 @@
     </w:p>
     <w:p>
       <w:pPr>
-        <w:spacing w:after="35"/>
+        <w:spacing w:after="40"/>
         <w:jc w:val="left"/>
       </w:pPr>
       <w:r>
@@ -644,7 +644,7 @@
     </w:p>
     <w:p>
       <w:pPr>
-        <w:spacing w:after="35"/>
+        <w:spacing w:after="40"/>
         <w:jc w:val="left"/>
       </w:pPr>
       <w:r>
@@ -663,7 +663,7 @@
     </w:p>
     <w:p>
       <w:pPr>
-        <w:spacing w:after="35"/>
+        <w:spacing w:after="40"/>
         <w:jc w:val="left"/>
       </w:pPr>
       <w:r>
@@ -682,7 +682,7 @@
     </w:p>
     <w:p>
       <w:pPr>
-        <w:spacing w:after="35"/>
+        <w:spacing w:after="40"/>
         <w:jc w:val="left"/>
       </w:pPr>
       <w:r>
@@ -701,7 +701,7 @@
     </w:p>
     <w:p>
       <w:pPr>
-        <w:spacing w:after="35"/>
+        <w:spacing w:after="40"/>
         <w:jc w:val="left"/>
       </w:pPr>
       <w:r>
@@ -720,7 +720,7 @@
     </w:p>
     <w:p>
       <w:pPr>
-        <w:spacing w:after="35"/>
+        <w:spacing w:after="40"/>
         <w:jc w:val="left"/>
       </w:pPr>
       <w:r>
@@ -739,7 +739,7 @@
     </w:p>
     <w:p>
       <w:pPr>
-        <w:spacing w:after="35"/>
+        <w:spacing w:after="40"/>
         <w:jc w:val="left"/>
       </w:pPr>
       <w:r>
@@ -758,7 +758,7 @@
     </w:p>
     <w:p>
       <w:pPr>
-        <w:spacing w:after="35"/>
+        <w:spacing w:after="40"/>
         <w:jc w:val="left"/>
       </w:pPr>
       <w:r>
@@ -800,7 +800,7 @@
     </w:p>
     <w:p>
       <w:pPr>
-        <w:spacing w:after="90" w:before="180"/>
+        <w:spacing w:after="80" w:before="180"/>
         <w:jc w:val="left"/>
       </w:pPr>
       <w:r>
@@ -842,7 +842,7 @@
     </w:p>
     <w:p>
       <w:pPr>
-        <w:spacing w:after="35"/>
+        <w:spacing w:after="40"/>
         <w:jc w:val="left"/>
       </w:pPr>
       <w:r>
@@ -861,7 +861,7 @@
     </w:p>
     <w:p>
       <w:pPr>
-        <w:spacing w:after="35"/>
+        <w:spacing w:after="40"/>
         <w:jc w:val="left"/>
       </w:pPr>
       <w:r>
@@ -880,7 +880,7 @@
     </w:p>
     <w:p>
       <w:pPr>
-        <w:spacing w:after="35"/>
+        <w:spacing w:after="40"/>
         <w:jc w:val="left"/>
       </w:pPr>
       <w:r>
@@ -974,7 +974,7 @@
     </w:p>
     <w:p>
       <w:pPr>
-        <w:spacing w:after="90" w:before="180"/>
+        <w:spacing w:after="80" w:before="180"/>
         <w:jc w:val="left"/>
       </w:pPr>
       <w:r>
@@ -1002,7 +1002,7 @@
     </w:p>
     <w:p>
       <w:pPr>
-        <w:spacing w:after="90" w:before="180"/>
+        <w:spacing w:after="80" w:before="180"/>
         <w:jc w:val="left"/>
       </w:pPr>
       <w:r>
@@ -1044,7 +1044,7 @@
     </w:p>
     <w:p>
       <w:pPr>
-        <w:spacing w:after="90" w:before="180"/>
+        <w:spacing w:after="80" w:before="180"/>
         <w:jc w:val="left"/>
       </w:pPr>
       <w:r>
@@ -1086,7 +1086,7 @@
     </w:p>
     <w:p>
       <w:pPr>
-        <w:spacing w:after="35"/>
+        <w:spacing w:after="40"/>
         <w:jc w:val="left"/>
       </w:pPr>
       <w:r>
@@ -1105,7 +1105,7 @@
     </w:p>
     <w:p>
       <w:pPr>
-        <w:spacing w:after="35"/>
+        <w:spacing w:after="40"/>
         <w:jc w:val="left"/>
       </w:pPr>
       <w:r>
@@ -1124,7 +1124,7 @@
     </w:p>
     <w:p>
       <w:pPr>
-        <w:spacing w:after="35"/>
+        <w:spacing w:after="40"/>
         <w:jc w:val="left"/>
       </w:pPr>
       <w:r>
@@ -1143,7 +1143,7 @@
     </w:p>
     <w:p>
       <w:pPr>
-        <w:spacing w:after="35"/>
+        <w:spacing w:after="40"/>
         <w:jc w:val="left"/>
       </w:pPr>
       <w:r>
@@ -1162,7 +1162,7 @@
     </w:p>
     <w:p>
       <w:pPr>
-        <w:spacing w:after="35"/>
+        <w:spacing w:after="40"/>
         <w:jc w:val="left"/>
       </w:pPr>
       <w:r>
@@ -1181,7 +1181,7 @@
     </w:p>
     <w:p>
       <w:pPr>
-        <w:spacing w:after="90" w:before="180"/>
+        <w:spacing w:after="80" w:before="180"/>
         <w:jc w:val="left"/>
       </w:pPr>
       <w:r>
@@ -1223,7 +1223,7 @@
     </w:p>
     <w:p>
       <w:pPr>
-        <w:spacing w:after="35"/>
+        <w:spacing w:after="40"/>
         <w:jc w:val="left"/>
       </w:pPr>
       <w:r>
@@ -1242,7 +1242,7 @@
     </w:p>
     <w:p>
       <w:pPr>
-        <w:spacing w:after="35"/>
+        <w:spacing w:after="40"/>
         <w:jc w:val="left"/>
       </w:pPr>
       <w:r>
@@ -1261,7 +1261,7 @@
     </w:p>
     <w:p>
       <w:pPr>
-        <w:spacing w:after="35"/>
+        <w:spacing w:after="40"/>
         <w:jc w:val="left"/>
       </w:pPr>
       <w:r>
@@ -1280,7 +1280,7 @@
     </w:p>
     <w:p>
       <w:pPr>
-        <w:spacing w:after="35"/>
+        <w:spacing w:after="40"/>
         <w:jc w:val="left"/>
       </w:pPr>
       <w:r>
@@ -1299,7 +1299,7 @@
     </w:p>
     <w:p>
       <w:pPr>
-        <w:spacing w:after="90" w:before="180"/>
+        <w:spacing w:after="80" w:before="180"/>
         <w:jc w:val="left"/>
       </w:pPr>
       <w:r>
@@ -1341,7 +1341,7 @@
     </w:p>
     <w:p>
       <w:pPr>
-        <w:spacing w:after="35"/>
+        <w:spacing w:after="40"/>
         <w:jc w:val="left"/>
       </w:pPr>
       <w:r>
@@ -1360,7 +1360,7 @@
     </w:p>
     <w:p>
       <w:pPr>
-        <w:spacing w:after="35"/>
+        <w:spacing w:after="40"/>
         <w:jc w:val="left"/>
       </w:pPr>
       <w:r>
@@ -1379,7 +1379,7 @@
     </w:p>
     <w:p>
       <w:pPr>
-        <w:spacing w:after="35"/>
+        <w:spacing w:after="40"/>
         <w:jc w:val="left"/>
       </w:pPr>
       <w:r>
@@ -1398,7 +1398,7 @@
     </w:p>
     <w:p>
       <w:pPr>
-        <w:spacing w:after="35"/>
+        <w:spacing w:after="40"/>
         <w:jc w:val="left"/>
       </w:pPr>
       <w:r>
@@ -1417,7 +1417,7 @@
     </w:p>
     <w:p>
       <w:pPr>
-        <w:spacing w:after="35"/>
+        <w:spacing w:after="40"/>
         <w:jc w:val="left"/>
       </w:pPr>
       <w:r>
@@ -1445,7 +1445,7 @@
     </w:p>
     <w:p>
       <w:pPr>
-        <w:spacing w:after="90" w:before="180"/>
+        <w:spacing w:after="80" w:before="180"/>
         <w:jc w:val="left"/>
       </w:pPr>
       <w:r>
@@ -1601,7 +1601,7 @@
     </w:p>
     <w:p>
       <w:pPr>
-        <w:spacing w:after="90" w:before="180"/>
+        <w:spacing w:after="80" w:before="180"/>
         <w:jc w:val="left"/>
       </w:pPr>
       <w:r>
@@ -1677,7 +1677,7 @@
     </w:p>
     <w:p>
       <w:pPr>
-        <w:spacing w:after="90" w:before="180"/>
+        <w:spacing w:after="80" w:before="180"/>
         <w:jc w:val="left"/>
       </w:pPr>
       <w:r>
@@ -1743,9 +1743,9 @@
     <w:sectPr>
       <w:headerReference w:type="default" r:id="rId12"/>
       <w:footerReference w:type="default" r:id="rId13"/>
-      <w:pgSz w:w="12240" w:h="15840"/>
-      <w:pgMar w:top="1656" w:right="1152" w:bottom="1008" w:left="1152" w:header="432" w:footer="432" w:gutter="0"/>
-      <w:cols w:space="720"/>
+      <w:pgSz w:w="11906" w:h="16838"/>
+      <w:pgMar w:top="1440" w:right="1440" w:bottom="1440" w:left="1440" w:header="708" w:footer="708" w:gutter="0"/>
+      <w:cols w:space="708"/>
       <w:docGrid w:linePitch="360"/>
     </w:sectPr>
     <w:tbl>
@@ -1919,9 +1919,6 @@
       <w:fldChar w:fldCharType="separate"/>
     </w:r>
     <w:r>
-      <w:rPr>
-        <w:noProof/>
-      </w:rPr>
       <w:t>1</w:t>
     </w:r>
     <w:r>
@@ -1932,7 +1929,14 @@
         <w:color w:val="5F6B63"/>
         <w:sz w:val="16"/>
       </w:rPr>
-      <w:t xml:space="preserve">  |  OFFICIAL POLICY</w:t>
+      <w:t xml:space="preserve">  |  OFFICIAL </w:t>
+    </w:r>
+    <w:r>
+      <w:rPr>
+        <w:color w:val="5F6B63"/>
+        <w:sz w:val="16"/>
+      </w:rPr>
+      <w:t>CONSTITUTION</w:t>
     </w:r>
   </w:p>
 </w:ftr>
@@ -1965,19 +1969,14 @@
 
 <file path=word/header1.xml><?xml version="1.0" encoding="utf-8"?>
 <w:hdr xmlns:wpc="http://schemas.microsoft.com/office/word/2010/wordprocessingCanvas" xmlns:cx="http://schemas.microsoft.com/office/drawing/2014/chartex" xmlns:cx1="http://schemas.microsoft.com/office/drawing/2015/9/8/chartex" xmlns:cx2="http://schemas.microsoft.com/office/drawing/2015/10/21/chartex" xmlns:cx3="http://schemas.microsoft.com/office/drawing/2016/5/9/chartex" xmlns:cx4="http://schemas.microsoft.com/office/drawing/2016/5/10/chartex" xmlns:cx5="http://schemas.microsoft.com/office/drawing/2016/5/11/chartex" xmlns:cx6="http://schemas.microsoft.com/office/drawing/2016/5/12/chartex" xmlns:cx7="http://schemas.microsoft.com/office/drawing/2016/5/13/chartex" xmlns:cx8="http://schemas.microsoft.com/office/drawing/2016/5/14/chartex" xmlns:mc="http://schemas.openxmlformats.org/markup-compatibility/2006" xmlns:aink="http://schemas.microsoft.com/office/drawing/2016/ink" xmlns:am3d="http://schemas.microsoft.com/office/drawing/2017/model3d" xmlns:o="urn:schemas-microsoft-com:office:office" xmlns:oel="http://schemas.microsoft.com/office/2019/extlst" xmlns:r="http://schemas.openxmlformats.org/officeDocument/2006/relationships" xmlns:m="http://schemas.openxmlformats.org/officeDocument/2006/math" xmlns:v="urn:schemas-microsoft-com:vml" xmlns:wp14="http://schemas.microsoft.com/office/word/2010/wordprocessingDrawing" xmlns:wp="http://schemas.openxmlformats.org/drawingml/2006/wordprocessingDrawing" xmlns:w10="urn:schemas-microsoft-com:office:word" xmlns:w="http://schemas.openxmlformats.org/wordprocessingml/2006/main" xmlns:w14="http://schemas.microsoft.com/office/word/2010/wordml" xmlns:w15="http://schemas.microsoft.com/office/word/2012/wordml" xmlns:w16cex="http://schemas.microsoft.com/office/word/2018/wordml/cex" xmlns:w16cid="http://schemas.microsoft.com/office/word/2016/wordml/cid" xmlns:w16="http://schemas.microsoft.com/office/word/2018/wordml" xmlns:w16du="http://schemas.microsoft.com/office/word/2023/wordml/word16du" xmlns:w16sdtdh="http://schemas.microsoft.com/office/word/2020/wordml/sdtdatahash" xmlns:w16sdtfl="http://schemas.microsoft.com/office/word/2024/wordml/sdtformatlock" xmlns:w16se="http://schemas.microsoft.com/office/word/2015/wordml/symex" xmlns:wpg="http://schemas.microsoft.com/office/word/2010/wordprocessingGroup" xmlns:wpi="http://schemas.microsoft.com/office/word/2010/wordprocessingInk" xmlns:wne="http://schemas.microsoft.com/office/word/2006/wordml" xmlns:wps="http://schemas.microsoft.com/office/word/2010/wordprocessingShape" mc:Ignorable="w14 w15 w16se w16cid w16 w16cex w16sdtdh w16sdtfl w16du wp14">
-  <w:p>
-    <w:pPr>
-      <w:pStyle w:val="Header"/>
-    </w:pPr>
-  </w:p>
   <w:tbl>
     <w:tblPr>
       <w:tblW w:w="0" w:type="auto"/>
       <w:tblLook w:val="04A0" w:firstRow="1" w:lastRow="0" w:firstColumn="1" w:lastColumn="0" w:noHBand="0" w:noVBand="1"/>
     </w:tblPr>
     <w:tblGrid>
-      <w:gridCol w:w="5040"/>
-      <w:gridCol w:w="5040"/>
+      <w:gridCol w:w="4845"/>
+      <w:gridCol w:w="4397"/>
     </w:tblGrid>
     <w:tr>
       <w:trPr>
@@ -1994,6 +1993,9 @@
           </w:tcBorders>
         </w:tcPr>
         <w:p>
+          <w:pPr>
+            <w:spacing w:line="254" w:lineRule="auto"/>
+          </w:pPr>
           <w:r>
             <w:rPr>
               <w:noProof/>
@@ -2001,7 +2003,7 @@
             <mc:AlternateContent>
               <mc:Choice Requires="wps">
                 <w:drawing>
-                  <wp:anchor distT="45720" distB="45720" distL="114300" distR="114300" simplePos="0" relativeHeight="251662848" behindDoc="0" locked="0" layoutInCell="1" allowOverlap="1" wp14:anchorId="451D4ADE" wp14:editId="64828AEB">
+                  <wp:anchor distT="45720" distB="45720" distL="114300" distR="114300" simplePos="0" relativeHeight="251659264" behindDoc="0" locked="0" layoutInCell="1" allowOverlap="1" wp14:anchorId="63CB8430" wp14:editId="119B0892">
                     <wp:simplePos x="0" y="0"/>
                     <wp:positionH relativeFrom="column">
                       <wp:posOffset>268605</wp:posOffset>
@@ -2051,7 +2053,7 @@
                                     <w:noProof/>
                                   </w:rPr>
                                   <w:drawing>
-                                    <wp:inline distT="0" distB="0" distL="0" distR="0" wp14:anchorId="61EA5CEF" wp14:editId="0AD47FA3">
+                                    <wp:inline distT="0" distB="0" distL="0" distR="0" wp14:anchorId="3FB3518D" wp14:editId="5D4C70FA">
                                       <wp:extent cx="1238250" cy="1238250"/>
                                       <wp:effectExtent l="0" t="0" r="0" b="0"/>
                                       <wp:docPr id="472585581" name="Picture 3"/>
@@ -2106,11 +2108,11 @@
               </mc:Choice>
               <mc:Fallback>
                 <w:pict>
-                  <v:shapetype w14:anchorId="451D4ADE" id="_x0000_t202" coordsize="21600,21600" o:spt="202" path="m,l,21600r21600,l21600,xe">
+                  <v:shapetype w14:anchorId="63CB8430" id="_x0000_t202" coordsize="21600,21600" o:spt="202" path="m,l,21600r21600,l21600,xe">
                     <v:stroke joinstyle="miter"/>
                     <v:path gradientshapeok="t" o:connecttype="rect"/>
                   </v:shapetype>
-                  <v:shape id="Text Box 2" o:spid="_x0000_s1026" type="#_x0000_t202" style="position:absolute;margin-left:21.15pt;margin-top:14.35pt;width:197.95pt;height:109.5pt;z-index:251662848;visibility:visible;mso-wrap-style:square;mso-width-percent:0;mso-height-percent:0;mso-wrap-distance-left:9pt;mso-wrap-distance-top:3.6pt;mso-wrap-distance-right:9pt;mso-wrap-distance-bottom:3.6pt;mso-position-horizontal:absolute;mso-position-horizontal-relative:text;mso-position-vertical:absolute;mso-position-vertical-relative:text;mso-width-percent:0;mso-height-percent:0;mso-width-relative:margin;mso-height-relative:margin;v-text-anchor:top" o:gfxdata="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" stroked="f">
+                  <v:shape id="Text Box 2" o:spid="_x0000_s1026" type="#_x0000_t202" style="position:absolute;margin-left:21.15pt;margin-top:14.35pt;width:197.95pt;height:109.5pt;z-index:251659264;visibility:visible;mso-wrap-style:square;mso-width-percent:0;mso-height-percent:0;mso-wrap-distance-left:9pt;mso-wrap-distance-top:3.6pt;mso-wrap-distance-right:9pt;mso-wrap-distance-bottom:3.6pt;mso-position-horizontal:absolute;mso-position-horizontal-relative:text;mso-position-vertical:absolute;mso-position-vertical-relative:text;mso-width-percent:0;mso-height-percent:0;mso-width-relative:margin;mso-height-relative:margin;v-text-anchor:top" o:gfxdata="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" stroked="f">
                     <v:textbox>
                       <w:txbxContent>
                         <w:p>
@@ -2122,7 +2124,7 @@
                               <w:noProof/>
                             </w:rPr>
                             <w:drawing>
-                              <wp:inline distT="0" distB="0" distL="0" distR="0" wp14:anchorId="61EA5CEF" wp14:editId="0AD47FA3">
+                              <wp:inline distT="0" distB="0" distL="0" distR="0" wp14:anchorId="3FB3518D" wp14:editId="5D4C70FA">
                                 <wp:extent cx="1238250" cy="1238250"/>
                                 <wp:effectExtent l="0" t="0" r="0" b="0"/>
                                 <wp:docPr id="472585581" name="Picture 3"/>
@@ -2180,6 +2182,7 @@
         </w:tcPr>
         <w:p>
           <w:pPr>
+            <w:spacing w:line="254" w:lineRule="auto"/>
             <w:jc w:val="right"/>
             <w:rPr>
               <w:sz w:val="15"/>
@@ -2197,19 +2200,7 @@
               <w:sz w:val="16"/>
             </w:rPr>
             <w:br/>
-            <w:t>Registered NPC: 2026/521895/</w:t>
-          </w:r>
-          <w:r>
-            <w:rPr>
-              <w:sz w:val="16"/>
-            </w:rPr>
-            <w:t>08 | Tax</w:t>
-          </w:r>
-          <w:r>
-            <w:rPr>
-              <w:sz w:val="16"/>
-            </w:rPr>
-            <w:t xml:space="preserve"> Reference: 9322812265</w:t>
+            <w:t>Registered NPC: 2026/521895/08 | Tax Reference: 9322812265</w:t>
           </w:r>
           <w:r>
             <w:rPr>
@@ -2221,6 +2212,7 @@
         </w:p>
         <w:p>
           <w:pPr>
+            <w:spacing w:line="254" w:lineRule="auto"/>
             <w:jc w:val="right"/>
             <w:rPr>
               <w:sz w:val="15"/>
@@ -2235,6 +2227,7 @@
         </w:p>
         <w:p>
           <w:pPr>
+            <w:spacing w:line="254" w:lineRule="auto"/>
             <w:jc w:val="right"/>
           </w:pPr>
           <w:r>
@@ -2248,17 +2241,17 @@
               <w:sz w:val="15"/>
             </w:rPr>
             <w:br/>
-          </w:r>
-          <w:r>
-            <w:rPr>
-              <w:sz w:val="15"/>
-            </w:rPr>
             <w:t>info@africansolidaritycivic.org | www.africansolidaritycivic.org</w:t>
           </w:r>
         </w:p>
       </w:tc>
     </w:tr>
   </w:tbl>
+  <w:p>
+    <w:pPr>
+      <w:pStyle w:val="Header"/>
+    </w:pPr>
+  </w:p>
 </w:hdr>
 </file>
 
@@ -2856,7 +2849,7 @@
     <w:qFormat/>
     <w:rsid w:val="00FC693F"/>
     <w:pPr>
-      <w:spacing w:after="100" w:line="254" w:lineRule="auto"/>
+      <w:spacing w:after="100" w:line="259" w:lineRule="auto"/>
     </w:pPr>
     <w:rPr>
       <w:rFonts w:ascii="Aptos" w:hAnsi="Aptos"/>

</xml_diff>

<commit_message>
Fix Board Minutes - add green/gold colors matching Constitution
</commit_message>
<xml_diff>
--- a/ASCO Board Minutes 2026.docx
+++ b/ASCO Board Minutes 2026.docx
@@ -10,7 +10,7 @@
       <w:r>
         <w:rPr>
           <w:b/>
-          <w:i w:val="0"/>
+          <w:color w:val="145A32"/>
           <w:sz w:val="32"/>
         </w:rPr>
         <w:t>MINUTES OF THE MEETING OF THE BOARD OF DIRECTORS</w:t>
@@ -24,7 +24,6 @@
       <w:r>
         <w:rPr>
           <w:b w:val="0"/>
-          <w:i w:val="0"/>
           <w:sz w:val="20"/>
         </w:rPr>
         <w:t>OF</w:t>
@@ -38,7 +37,7 @@
       <w:r>
         <w:rPr>
           <w:b/>
-          <w:i w:val="0"/>
+          <w:color w:val="145A32"/>
           <w:sz w:val="20"/>
         </w:rPr>
         <w:t>AFRICAN SOLIDARITY CIVIC ORGANISATION NPC</w:t>
@@ -52,7 +51,7 @@
       <w:r>
         <w:rPr>
           <w:b/>
-          <w:i w:val="0"/>
+          <w:color w:val="C9A227"/>
           <w:sz w:val="20"/>
         </w:rPr>
         <w:t>(ASCO NPC)</w:t>
@@ -160,7 +159,7 @@
       <w:r>
         <w:rPr>
           <w:b/>
-          <w:i w:val="0"/>
+          <w:color w:val="145A32"/>
           <w:sz w:val="22"/>
         </w:rPr>
         <w:t>1. OPENING AND WELCOME</w:t>
@@ -174,7 +173,6 @@
       <w:r>
         <w:rPr>
           <w:b w:val="0"/>
-          <w:i w:val="0"/>
           <w:sz w:val="20"/>
         </w:rPr>
         <w:t>The meeting of the Board of Directors of African Solidarity Civic Organisation NPC (ASCO NPC) was called to order by the Chairlady of the Board, Ms Busisiwe Makhosi Shandu.</w:t>
@@ -188,7 +186,6 @@
       <w:r>
         <w:rPr>
           <w:b w:val="0"/>
-          <w:i w:val="0"/>
           <w:sz w:val="20"/>
         </w:rPr>
         <w:t>The Chairlady welcomed all Directors and confirmed that the meeting was properly constituted, with the required quorum present to deliberate and adopt resolutions binding on the organisation.</w:t>
@@ -202,7 +199,6 @@
       <w:r>
         <w:rPr>
           <w:b w:val="0"/>
-          <w:i w:val="0"/>
           <w:sz w:val="20"/>
         </w:rPr>
         <w:t>The Chairlady stated that the purpose of the meeting was to consider and formally adopt the customised Memorandum of Incorporation (MOI) of ASCO NPC, ensuring that the organisation's governance framework reflects its founding principles, non-profit objectives, institutional values and future sustainability.</w:t>
@@ -225,7 +221,7 @@
       <w:r>
         <w:rPr>
           <w:b/>
-          <w:i w:val="0"/>
+          <w:color w:val="145A32"/>
           <w:sz w:val="22"/>
         </w:rPr>
         <w:t>2. ATTENDANCE</w:t>
@@ -239,7 +235,6 @@
       <w:r>
         <w:rPr>
           <w:b w:val="0"/>
-          <w:i w:val="0"/>
           <w:sz w:val="20"/>
         </w:rPr>
         <w:t>The following Directors were present:</w:t>
@@ -413,7 +408,7 @@
       <w:r>
         <w:rPr>
           <w:b/>
-          <w:i w:val="0"/>
+          <w:color w:val="145A32"/>
           <w:sz w:val="22"/>
         </w:rPr>
         <w:t>3. APOLOGIES</w:t>
@@ -427,7 +422,6 @@
       <w:r>
         <w:rPr>
           <w:b w:val="0"/>
-          <w:i w:val="0"/>
           <w:sz w:val="20"/>
         </w:rPr>
         <w:t>No apologies were received.</w:t>
@@ -450,7 +444,7 @@
       <w:r>
         <w:rPr>
           <w:b/>
-          <w:i w:val="0"/>
+          <w:color w:val="145A32"/>
           <w:sz w:val="22"/>
         </w:rPr>
         <w:t>4. DECLARATION OF INTEREST</w:t>
@@ -464,7 +458,6 @@
       <w:r>
         <w:rPr>
           <w:b w:val="0"/>
-          <w:i w:val="0"/>
           <w:sz w:val="20"/>
         </w:rPr>
         <w:t>All Directors present confirmed that they had no personal financial interests that conflicted with the matters tabled before the meeting.</w:t>
@@ -487,7 +480,7 @@
       <w:r>
         <w:rPr>
           <w:b/>
-          <w:i w:val="0"/>
+          <w:color w:val="145A32"/>
           <w:sz w:val="22"/>
         </w:rPr>
         <w:t>5. PURPOSE OF THE MEETING</w:t>
@@ -501,7 +494,6 @@
       <w:r>
         <w:rPr>
           <w:b w:val="0"/>
-          <w:i w:val="0"/>
           <w:sz w:val="20"/>
         </w:rPr>
         <w:t>The Chairlady tabled the following objectives of the meeting:</w:t>
@@ -589,7 +581,7 @@
       <w:r>
         <w:rPr>
           <w:b/>
-          <w:i w:val="0"/>
+          <w:color w:val="145A32"/>
           <w:sz w:val="22"/>
         </w:rPr>
         <w:t>6. BACKGROUND AND CONSIDERATION OF THE CUSTOMISED MOI</w:t>
@@ -603,7 +595,6 @@
       <w:r>
         <w:rPr>
           <w:b w:val="0"/>
-          <w:i w:val="0"/>
           <w:sz w:val="20"/>
         </w:rPr>
         <w:t>The Board considered the customised Memorandum of Incorporation prepared for ASCO NPC.</w:t>
@@ -617,7 +608,6 @@
       <w:r>
         <w:rPr>
           <w:b w:val="0"/>
-          <w:i w:val="0"/>
           <w:sz w:val="20"/>
         </w:rPr>
         <w:t>The Board noted that the MOI is intended to serve as the organisation's principal governance instrument and provides clarity on:</w:t>
@@ -631,6 +621,7 @@
       <w:r>
         <w:rPr>
           <w:b/>
+          <w:color w:val="000000"/>
           <w:sz w:val="20"/>
         </w:rPr>
         <w:t>•</w:t>
@@ -650,6 +641,7 @@
       <w:r>
         <w:rPr>
           <w:b/>
+          <w:color w:val="000000"/>
           <w:sz w:val="20"/>
         </w:rPr>
         <w:t>•</w:t>
@@ -669,6 +661,7 @@
       <w:r>
         <w:rPr>
           <w:b/>
+          <w:color w:val="000000"/>
           <w:sz w:val="20"/>
         </w:rPr>
         <w:t>•</w:t>
@@ -688,6 +681,7 @@
       <w:r>
         <w:rPr>
           <w:b/>
+          <w:color w:val="000000"/>
           <w:sz w:val="20"/>
         </w:rPr>
         <w:t>•</w:t>
@@ -707,6 +701,7 @@
       <w:r>
         <w:rPr>
           <w:b/>
+          <w:color w:val="000000"/>
           <w:sz w:val="20"/>
         </w:rPr>
         <w:t>•</w:t>
@@ -726,6 +721,7 @@
       <w:r>
         <w:rPr>
           <w:b/>
+          <w:color w:val="000000"/>
           <w:sz w:val="20"/>
         </w:rPr>
         <w:t>•</w:t>
@@ -745,6 +741,7 @@
       <w:r>
         <w:rPr>
           <w:b/>
+          <w:color w:val="000000"/>
           <w:sz w:val="20"/>
         </w:rPr>
         <w:t>•</w:t>
@@ -764,6 +761,7 @@
       <w:r>
         <w:rPr>
           <w:b/>
+          <w:color w:val="000000"/>
           <w:sz w:val="20"/>
         </w:rPr>
         <w:t>•</w:t>
@@ -783,7 +781,6 @@
       <w:r>
         <w:rPr>
           <w:b w:val="0"/>
-          <w:i w:val="0"/>
           <w:sz w:val="20"/>
         </w:rPr>
         <w:t>The Board further noted that the customised MOI strengthens ASCO NPC's readiness to engage with funding institutions, government structures, international organisations and regulatory authorities.</w:t>
@@ -806,7 +803,7 @@
       <w:r>
         <w:rPr>
           <w:b/>
-          <w:i w:val="0"/>
+          <w:color w:val="145A32"/>
           <w:sz w:val="22"/>
         </w:rPr>
         <w:t>7. RECOGNITION OF THE FOUNDER AND FOUNDING LEGACY</w:t>
@@ -820,7 +817,6 @@
       <w:r>
         <w:rPr>
           <w:b w:val="0"/>
-          <w:i w:val="0"/>
           <w:sz w:val="20"/>
         </w:rPr>
         <w:t>The Board formally considered the recognition of Ms Busisiwe Makhosi Shandu as Founder and Custodian of the Founding Legacy of African Solidarity Civic Organisation NPC.</w:t>
@@ -834,7 +830,6 @@
       <w:r>
         <w:rPr>
           <w:b w:val="0"/>
-          <w:i w:val="0"/>
           <w:sz w:val="20"/>
         </w:rPr>
         <w:t>The Board recorded that the recognition of the Founder is intended to preserve and honour:</w:t>
@@ -848,6 +843,7 @@
       <w:r>
         <w:rPr>
           <w:b/>
+          <w:color w:val="000000"/>
           <w:sz w:val="20"/>
         </w:rPr>
         <w:t>•</w:t>
@@ -867,6 +863,7 @@
       <w:r>
         <w:rPr>
           <w:b/>
+          <w:color w:val="000000"/>
           <w:sz w:val="20"/>
         </w:rPr>
         <w:t>•</w:t>
@@ -886,6 +883,7 @@
       <w:r>
         <w:rPr>
           <w:b/>
+          <w:color w:val="000000"/>
           <w:sz w:val="20"/>
         </w:rPr>
         <w:t>•</w:t>
@@ -905,7 +903,6 @@
       <w:r>
         <w:rPr>
           <w:b w:val="0"/>
-          <w:i w:val="0"/>
           <w:sz w:val="20"/>
         </w:rPr>
         <w:t>The Board further resolved that:</w:t>
@@ -980,7 +977,7 @@
       <w:r>
         <w:rPr>
           <w:b/>
-          <w:i w:val="0"/>
+          <w:color w:val="145A32"/>
           <w:sz w:val="22"/>
         </w:rPr>
         <w:t>8. CONFIRMATION OF GOVERNANCE STRUCTURE</w:t>
@@ -994,7 +991,6 @@
       <w:r>
         <w:rPr>
           <w:b w:val="0"/>
-          <w:i w:val="0"/>
           <w:sz w:val="20"/>
         </w:rPr>
         <w:t>The Board confirmed the following governance structure:</w:t>
@@ -1008,7 +1004,7 @@
       <w:r>
         <w:rPr>
           <w:b/>
-          <w:i w:val="0"/>
+          <w:color w:val="145A32"/>
           <w:sz w:val="22"/>
         </w:rPr>
         <w:t>8.1 Chairlady of the Board</w:t>
@@ -1022,7 +1018,7 @@
       <w:r>
         <w:rPr>
           <w:b/>
-          <w:i w:val="0"/>
+          <w:color w:val="145A32"/>
           <w:sz w:val="20"/>
         </w:rPr>
         <w:t>Ms Busisiwe Makhosi Shandu</w:t>
@@ -1036,7 +1032,6 @@
       <w:r>
         <w:rPr>
           <w:b w:val="0"/>
-          <w:i w:val="0"/>
           <w:sz w:val="20"/>
         </w:rPr>
         <w:t>The Chairlady shall provide leadership to the Board, ensure effective governance oversight and safeguard the founding principles and long-term vision of ASCO NPC.</w:t>
@@ -1050,7 +1045,7 @@
       <w:r>
         <w:rPr>
           <w:b/>
-          <w:i w:val="0"/>
+          <w:color w:val="145A32"/>
           <w:sz w:val="22"/>
         </w:rPr>
         <w:t>8.2 Executive Director</w:t>
@@ -1064,7 +1059,7 @@
       <w:r>
         <w:rPr>
           <w:b/>
-          <w:i w:val="0"/>
+          <w:color w:val="145A32"/>
           <w:sz w:val="20"/>
         </w:rPr>
         <w:t>Mr Bhekisisa Shandu</w:t>
@@ -1078,7 +1073,6 @@
       <w:r>
         <w:rPr>
           <w:b w:val="0"/>
-          <w:i w:val="0"/>
           <w:sz w:val="20"/>
         </w:rPr>
         <w:t>The Executive Director shall be responsible for:</w:t>
@@ -1092,6 +1086,7 @@
       <w:r>
         <w:rPr>
           <w:b/>
+          <w:color w:val="000000"/>
           <w:sz w:val="20"/>
         </w:rPr>
         <w:t>•</w:t>
@@ -1111,6 +1106,7 @@
       <w:r>
         <w:rPr>
           <w:b/>
+          <w:color w:val="000000"/>
           <w:sz w:val="20"/>
         </w:rPr>
         <w:t>•</w:t>
@@ -1130,6 +1126,7 @@
       <w:r>
         <w:rPr>
           <w:b/>
+          <w:color w:val="000000"/>
           <w:sz w:val="20"/>
         </w:rPr>
         <w:t>•</w:t>
@@ -1149,6 +1146,7 @@
       <w:r>
         <w:rPr>
           <w:b/>
+          <w:color w:val="000000"/>
           <w:sz w:val="20"/>
         </w:rPr>
         <w:t>•</w:t>
@@ -1168,6 +1166,7 @@
       <w:r>
         <w:rPr>
           <w:b/>
+          <w:color w:val="000000"/>
           <w:sz w:val="20"/>
         </w:rPr>
         <w:t>•</w:t>
@@ -1187,7 +1186,7 @@
       <w:r>
         <w:rPr>
           <w:b/>
-          <w:i w:val="0"/>
+          <w:color w:val="145A32"/>
           <w:sz w:val="22"/>
         </w:rPr>
         <w:t>8.3 Director: Head of ICT and Communications</w:t>
@@ -1201,7 +1200,7 @@
       <w:r>
         <w:rPr>
           <w:b/>
-          <w:i w:val="0"/>
+          <w:color w:val="145A32"/>
           <w:sz w:val="20"/>
         </w:rPr>
         <w:t>Mr Thapelo Nelson Maqalika</w:t>
@@ -1215,7 +1214,6 @@
       <w:r>
         <w:rPr>
           <w:b w:val="0"/>
-          <w:i w:val="0"/>
           <w:sz w:val="20"/>
         </w:rPr>
         <w:t>The Board resolved that Mr Maqalika shall:</w:t>
@@ -1229,6 +1227,7 @@
       <w:r>
         <w:rPr>
           <w:b/>
+          <w:color w:val="000000"/>
           <w:sz w:val="20"/>
         </w:rPr>
         <w:t>•</w:t>
@@ -1248,6 +1247,7 @@
       <w:r>
         <w:rPr>
           <w:b/>
+          <w:color w:val="000000"/>
           <w:sz w:val="20"/>
         </w:rPr>
         <w:t>•</w:t>
@@ -1267,6 +1267,7 @@
       <w:r>
         <w:rPr>
           <w:b/>
+          <w:color w:val="000000"/>
           <w:sz w:val="20"/>
         </w:rPr>
         <w:t>•</w:t>
@@ -1286,6 +1287,7 @@
       <w:r>
         <w:rPr>
           <w:b/>
+          <w:color w:val="000000"/>
           <w:sz w:val="20"/>
         </w:rPr>
         <w:t>•</w:t>
@@ -1305,7 +1307,7 @@
       <w:r>
         <w:rPr>
           <w:b/>
-          <w:i w:val="0"/>
+          <w:color w:val="145A32"/>
           <w:sz w:val="22"/>
         </w:rPr>
         <w:t>8.4 Director: People and Culture</w:t>
@@ -1319,7 +1321,7 @@
       <w:r>
         <w:rPr>
           <w:b/>
-          <w:i w:val="0"/>
+          <w:color w:val="145A32"/>
           <w:sz w:val="20"/>
         </w:rPr>
         <w:t>Mr Khulekani Gumede</w:t>
@@ -1333,7 +1335,6 @@
       <w:r>
         <w:rPr>
           <w:b w:val="0"/>
-          <w:i w:val="0"/>
           <w:sz w:val="20"/>
         </w:rPr>
         <w:t>The Board confirmed that Mr Gumede shall provide leadership and oversight relating to:</w:t>
@@ -1347,6 +1348,7 @@
       <w:r>
         <w:rPr>
           <w:b/>
+          <w:color w:val="000000"/>
           <w:sz w:val="20"/>
         </w:rPr>
         <w:t>•</w:t>
@@ -1366,6 +1368,7 @@
       <w:r>
         <w:rPr>
           <w:b/>
+          <w:color w:val="000000"/>
           <w:sz w:val="20"/>
         </w:rPr>
         <w:t>•</w:t>
@@ -1385,6 +1388,7 @@
       <w:r>
         <w:rPr>
           <w:b/>
+          <w:color w:val="000000"/>
           <w:sz w:val="20"/>
         </w:rPr>
         <w:t>•</w:t>
@@ -1404,6 +1408,7 @@
       <w:r>
         <w:rPr>
           <w:b/>
+          <w:color w:val="000000"/>
           <w:sz w:val="20"/>
         </w:rPr>
         <w:t>•</w:t>
@@ -1423,6 +1428,7 @@
       <w:r>
         <w:rPr>
           <w:b/>
+          <w:color w:val="000000"/>
           <w:sz w:val="20"/>
         </w:rPr>
         <w:t>•</w:t>
@@ -1451,7 +1457,7 @@
       <w:r>
         <w:rPr>
           <w:b/>
-          <w:i w:val="0"/>
+          <w:color w:val="145A32"/>
           <w:sz w:val="22"/>
         </w:rPr>
         <w:t>9. BOARD RESOLUTION: ADOPTION OF CUSTOMISED MOI</w:t>
@@ -1465,7 +1471,6 @@
       <w:r>
         <w:rPr>
           <w:b w:val="0"/>
-          <w:i w:val="0"/>
           <w:sz w:val="20"/>
         </w:rPr>
         <w:t>After thorough consideration and discussion, the Board unanimously adopted the following resolution:</w:t>
@@ -1479,7 +1484,7 @@
       <w:r>
         <w:rPr>
           <w:b/>
-          <w:i w:val="0"/>
+          <w:color w:val="145A32"/>
           <w:sz w:val="20"/>
         </w:rPr>
         <w:t>RESOLUTION NUMBER: ASCO/BOD/MOI/2026/01</w:t>
@@ -1493,7 +1498,6 @@
       <w:r>
         <w:rPr>
           <w:b/>
-          <w:i w:val="0"/>
           <w:sz w:val="20"/>
         </w:rPr>
         <w:t>IT IS HEREBY RESOLVED THAT:</w:t>
@@ -1607,7 +1611,7 @@
       <w:r>
         <w:rPr>
           <w:b/>
-          <w:i w:val="0"/>
+          <w:color w:val="145A32"/>
           <w:sz w:val="22"/>
         </w:rPr>
         <w:t>10. IMPLEMENTATION OF THE RESOLUTION</w:t>
@@ -1621,7 +1625,6 @@
       <w:r>
         <w:rPr>
           <w:b w:val="0"/>
-          <w:i w:val="0"/>
           <w:sz w:val="20"/>
         </w:rPr>
         <w:t>The Board directed that:</w:t>
@@ -1683,7 +1686,7 @@
       <w:r>
         <w:rPr>
           <w:b/>
-          <w:i w:val="0"/>
+          <w:color w:val="145A32"/>
           <w:sz w:val="22"/>
         </w:rPr>
         <w:t>11. CLOSURE</w:t>
@@ -1697,7 +1700,6 @@
       <w:r>
         <w:rPr>
           <w:b w:val="0"/>
-          <w:i w:val="0"/>
           <w:sz w:val="20"/>
         </w:rPr>
         <w:t>There being no further matters for consideration, the Chairlady thanked all Directors for their participation and declared the meeting officially closed.</w:t>
@@ -1711,7 +1713,6 @@
       <w:r>
         <w:rPr>
           <w:b w:val="0"/>
-          <w:i w:val="0"/>
           <w:sz w:val="20"/>
         </w:rPr>
         <w:t>Time closed: ____________________</w:t>
@@ -1734,7 +1735,7 @@
       <w:r>
         <w:rPr>
           <w:b/>
-          <w:i w:val="0"/>
+          <w:color w:val="145A32"/>
           <w:sz w:val="22"/>
         </w:rPr>
         <w:t>SIGNATURES OF DIRECTORS</w:t>

</xml_diff>

<commit_message>
Fix Board Minutes - remove separator lines, set 1.15 line spacing
</commit_message>
<xml_diff>
--- a/ASCO Board Minutes 2026.docx
+++ b/ASCO Board Minutes 2026.docx
@@ -4,7 +4,7 @@
   <w:body>
     <w:p>
       <w:pPr>
-        <w:spacing w:after="80" w:before="80"/>
+        <w:spacing w:before="80" w:after="80" w:line="276" w:lineRule="auto"/>
         <w:jc w:val="center"/>
       </w:pPr>
       <w:r>
@@ -18,12 +18,11 @@
     </w:p>
     <w:p>
       <w:pPr>
-        <w:spacing w:after="80" w:before="0"/>
+        <w:spacing w:after="80" w:line="276" w:lineRule="auto"/>
         <w:jc w:val="center"/>
       </w:pPr>
       <w:r>
         <w:rPr>
-          <w:b w:val="0"/>
           <w:sz w:val="20"/>
         </w:rPr>
         <w:t>OF</w:t>
@@ -31,7 +30,7 @@
     </w:p>
     <w:p>
       <w:pPr>
-        <w:spacing w:after="80" w:before="0"/>
+        <w:spacing w:after="80" w:line="276" w:lineRule="auto"/>
         <w:jc w:val="center"/>
       </w:pPr>
       <w:r>
@@ -45,8 +44,13 @@
     </w:p>
     <w:p>
       <w:pPr>
-        <w:spacing w:after="240" w:before="0"/>
+        <w:spacing w:after="240" w:line="276" w:lineRule="auto"/>
         <w:jc w:val="center"/>
+        <w:rPr>
+          <w:b/>
+          <w:color w:val="C9A227"/>
+          <w:sz w:val="20"/>
+        </w:rPr>
       </w:pPr>
       <w:r>
         <w:rPr>
@@ -59,35 +63,8 @@
     </w:p>
     <w:p>
       <w:pPr>
-        <w:spacing w:after="90" w:before="90"/>
+        <w:spacing w:before="180" w:after="90" w:line="276" w:lineRule="auto"/>
         <w:jc w:val="center"/>
-        <w:pBdr>
-          <w:bottom w:val="single" w:sz="4" w:space="1" w:color="000000"/>
-        </w:pBdr>
-      </w:pPr>
-    </w:p>
-    <w:p>
-      <w:pPr>
-        <w:spacing w:after="90"/>
-      </w:pPr>
-      <w:r>
-        <w:rPr>
-          <w:b/>
-          <w:sz w:val="20"/>
-        </w:rPr>
-        <w:t>Registration Number:</w:t>
-        <w:tab/>
-      </w:r>
-      <w:r>
-        <w:rPr>
-          <w:sz w:val="20"/>
-        </w:rPr>
-        <w:t>____________________</w:t>
-      </w:r>
-    </w:p>
-    <w:p>
-      <w:pPr>
-        <w:spacing w:after="90"/>
       </w:pPr>
       <w:r>
         <w:rPr>
@@ -95,37 +72,61 @@
           <w:sz w:val="20"/>
         </w:rPr>
         <w:t>Date of Meeting:</w:t>
-        <w:tab/>
+      </w:r>
+      <w:r>
+        <w:rPr>
+          <w:b/>
+          <w:sz w:val="20"/>
+        </w:rPr>
+        <w:t xml:space="preserve"> </w:t>
       </w:r>
       <w:r>
         <w:rPr>
           <w:sz w:val="20"/>
         </w:rPr>
-        <w:t>____________________</w:t>
-      </w:r>
-    </w:p>
-    <w:p>
-      <w:pPr>
-        <w:spacing w:after="90"/>
-      </w:pPr>
-      <w:r>
-        <w:rPr>
-          <w:b/>
-          <w:sz w:val="20"/>
-        </w:rPr>
-        <w:t>Time:</w:t>
-        <w:tab/>
+        <w:t>9/8/2026 1</w:t>
       </w:r>
       <w:r>
         <w:rPr>
           <w:sz w:val="20"/>
         </w:rPr>
-        <w:t>____________________</w:t>
+        <w:t>3</w:t>
+      </w:r>
+      <w:r>
+        <w:rPr>
+          <w:sz w:val="20"/>
+        </w:rPr>
+        <w:t>:</w:t>
+      </w:r>
+      <w:r>
+        <w:rPr>
+          <w:sz w:val="20"/>
+        </w:rPr>
+        <w:t>00</w:t>
+      </w:r>
+      <w:r>
+        <w:rPr>
+          <w:sz w:val="20"/>
+        </w:rPr>
+        <w:t>:0</w:t>
+      </w:r>
+      <w:r>
+        <w:rPr>
+          <w:sz w:val="20"/>
+        </w:rPr>
+        <w:t>2</w:t>
+      </w:r>
+      <w:r>
+        <w:rPr>
+          <w:sz w:val="20"/>
+        </w:rPr>
+        <w:t xml:space="preserve"> PM</w:t>
       </w:r>
     </w:p>
     <w:p>
       <w:pPr>
-        <w:spacing w:after="90"/>
+        <w:spacing w:after="90" w:line="276" w:lineRule="auto"/>
+        <w:jc w:val="center"/>
       </w:pPr>
       <w:r>
         <w:rPr>
@@ -133,28 +134,17 @@
           <w:sz w:val="20"/>
         </w:rPr>
         <w:t>Venue:</w:t>
-        <w:tab/>
       </w:r>
       <w:r>
         <w:rPr>
           <w:sz w:val="20"/>
         </w:rPr>
-        <w:t>____________________</w:t>
+        <w:t xml:space="preserve"> Durban, Kwazulu-Natal</w:t>
       </w:r>
     </w:p>
     <w:p>
       <w:pPr>
-        <w:spacing w:after="90" w:before="90"/>
-        <w:jc w:val="center"/>
-        <w:pBdr>
-          <w:bottom w:val="single" w:sz="4" w:space="1" w:color="000000"/>
-        </w:pBdr>
-      </w:pPr>
-    </w:p>
-    <w:p>
-      <w:pPr>
-        <w:spacing w:after="80" w:before="180"/>
-        <w:jc w:val="left"/>
+        <w:spacing w:before="180" w:after="80" w:line="276" w:lineRule="auto"/>
       </w:pPr>
       <w:r>
         <w:rPr>
@@ -167,12 +157,10 @@
     </w:p>
     <w:p>
       <w:pPr>
-        <w:spacing w:after="90" w:before="0"/>
-        <w:jc w:val="left"/>
+        <w:spacing w:after="90" w:line="276" w:lineRule="auto"/>
       </w:pPr>
       <w:r>
         <w:rPr>
-          <w:b w:val="0"/>
           <w:sz w:val="20"/>
         </w:rPr>
         <w:t>The meeting of the Board of Directors of African Solidarity Civic Organisation NPC (ASCO NPC) was called to order by the Chairlady of the Board, Ms Busisiwe Makhosi Shandu.</w:t>
@@ -180,12 +168,10 @@
     </w:p>
     <w:p>
       <w:pPr>
-        <w:spacing w:after="90" w:before="0"/>
-        <w:jc w:val="left"/>
+        <w:spacing w:after="90" w:line="276" w:lineRule="auto"/>
       </w:pPr>
       <w:r>
         <w:rPr>
-          <w:b w:val="0"/>
           <w:sz w:val="20"/>
         </w:rPr>
         <w:t>The Chairlady welcomed all Directors and confirmed that the meeting was properly constituted, with the required quorum present to deliberate and adopt resolutions binding on the organisation.</w:t>
@@ -193,12 +179,10 @@
     </w:p>
     <w:p>
       <w:pPr>
-        <w:spacing w:after="90" w:before="0"/>
-        <w:jc w:val="left"/>
+        <w:spacing w:after="90" w:line="276" w:lineRule="auto"/>
       </w:pPr>
       <w:r>
         <w:rPr>
-          <w:b w:val="0"/>
           <w:sz w:val="20"/>
         </w:rPr>
         <w:t>The Chairlady stated that the purpose of the meeting was to consider and formally adopt the customised Memorandum of Incorporation (MOI) of ASCO NPC, ensuring that the organisation's governance framework reflects its founding principles, non-profit objectives, institutional values and future sustainability.</w:t>
@@ -206,17 +190,7 @@
     </w:p>
     <w:p>
       <w:pPr>
-        <w:spacing w:after="90" w:before="90"/>
-        <w:jc w:val="center"/>
-        <w:pBdr>
-          <w:bottom w:val="single" w:sz="4" w:space="1" w:color="000000"/>
-        </w:pBdr>
-      </w:pPr>
-    </w:p>
-    <w:p>
-      <w:pPr>
-        <w:spacing w:after="80" w:before="180"/>
-        <w:jc w:val="left"/>
+        <w:spacing w:before="180" w:after="80" w:line="276" w:lineRule="auto"/>
       </w:pPr>
       <w:r>
         <w:rPr>
@@ -229,12 +203,10 @@
     </w:p>
     <w:p>
       <w:pPr>
-        <w:spacing w:after="90" w:before="0"/>
-        <w:jc w:val="left"/>
+        <w:spacing w:after="90" w:line="276" w:lineRule="auto"/>
       </w:pPr>
       <w:r>
         <w:rPr>
-          <w:b w:val="0"/>
           <w:sz w:val="20"/>
         </w:rPr>
         <w:t>The following Directors were present:</w:t>
@@ -242,25 +214,36 @@
     </w:p>
     <w:tbl>
       <w:tblPr>
-        <w:tblW w:type="auto" w:w="0"/>
+        <w:tblW w:w="0" w:type="auto"/>
         <w:jc w:val="center"/>
-        <w:tblLook w:firstColumn="1" w:firstRow="1" w:lastColumn="0" w:lastRow="0" w:noHBand="0" w:noVBand="1" w:val="04A0"/>
+        <w:tblLook w:val="04A0" w:firstRow="1" w:lastRow="0" w:firstColumn="1" w:lastColumn="0" w:noHBand="0" w:noVBand="1"/>
       </w:tblPr>
       <w:tblGrid>
-        <w:gridCol w:w="4513"/>
-        <w:gridCol w:w="4513"/>
+        <w:gridCol w:w="4599"/>
+        <w:gridCol w:w="4599"/>
       </w:tblGrid>
       <w:tr>
+        <w:trPr>
+          <w:trHeight w:val="478"/>
+          <w:jc w:val="center"/>
+        </w:trPr>
         <w:tc>
           <w:tcPr>
-            <w:tcW w:type="dxa" w:w="4513"/>
+            <w:tcW w:w="4599" w:type="dxa"/>
             <w:shd w:val="clear" w:color="auto" w:fill="145A32"/>
           </w:tcPr>
           <w:p>
+            <w:pPr>
+              <w:rPr>
+                <w:sz w:val="20"/>
+                <w:szCs w:val="20"/>
+              </w:rPr>
+            </w:pPr>
             <w:r>
               <w:rPr>
                 <w:b/>
-                <w:sz w:val="0"/>
+                <w:sz w:val="20"/>
+                <w:szCs w:val="20"/>
               </w:rPr>
               <w:t>Name</w:t>
             </w:r>
@@ -268,14 +251,21 @@
         </w:tc>
         <w:tc>
           <w:tcPr>
-            <w:tcW w:type="dxa" w:w="4513"/>
+            <w:tcW w:w="4599" w:type="dxa"/>
             <w:shd w:val="clear" w:color="auto" w:fill="145A32"/>
           </w:tcPr>
           <w:p>
+            <w:pPr>
+              <w:rPr>
+                <w:sz w:val="20"/>
+                <w:szCs w:val="20"/>
+              </w:rPr>
+            </w:pPr>
             <w:r>
               <w:rPr>
                 <w:b/>
-                <w:sz w:val="0"/>
+                <w:sz w:val="20"/>
+                <w:szCs w:val="20"/>
               </w:rPr>
               <w:t>Position</w:t>
             </w:r>
@@ -283,14 +273,25 @@
         </w:tc>
       </w:tr>
       <w:tr>
+        <w:trPr>
+          <w:trHeight w:val="478"/>
+          <w:jc w:val="center"/>
+        </w:trPr>
         <w:tc>
           <w:tcPr>
-            <w:tcW w:type="dxa" w:w="4513"/>
+            <w:tcW w:w="4599" w:type="dxa"/>
           </w:tcPr>
           <w:p>
+            <w:pPr>
+              <w:rPr>
+                <w:sz w:val="20"/>
+                <w:szCs w:val="20"/>
+              </w:rPr>
+            </w:pPr>
             <w:r>
               <w:rPr>
-                <w:sz w:val="0"/>
+                <w:sz w:val="20"/>
+                <w:szCs w:val="20"/>
               </w:rPr>
               <w:t>Ms Busisiwe Makhosi Shandu</w:t>
             </w:r>
@@ -298,12 +299,19 @@
         </w:tc>
         <w:tc>
           <w:tcPr>
-            <w:tcW w:type="dxa" w:w="4513"/>
+            <w:tcW w:w="4599" w:type="dxa"/>
           </w:tcPr>
           <w:p>
+            <w:pPr>
+              <w:rPr>
+                <w:sz w:val="20"/>
+                <w:szCs w:val="20"/>
+              </w:rPr>
+            </w:pPr>
             <w:r>
               <w:rPr>
-                <w:sz w:val="0"/>
+                <w:sz w:val="20"/>
+                <w:szCs w:val="20"/>
               </w:rPr>
               <w:t>Chairlady of the Board / Founder and Custodian of Founding Legacy</w:t>
             </w:r>
@@ -311,15 +319,26 @@
         </w:tc>
       </w:tr>
       <w:tr>
+        <w:trPr>
+          <w:trHeight w:val="478"/>
+          <w:jc w:val="center"/>
+        </w:trPr>
         <w:tc>
           <w:tcPr>
-            <w:tcW w:type="dxa" w:w="4513"/>
+            <w:tcW w:w="4599" w:type="dxa"/>
             <w:shd w:val="clear" w:color="auto" w:fill="F7F8F5"/>
           </w:tcPr>
           <w:p>
+            <w:pPr>
+              <w:rPr>
+                <w:sz w:val="20"/>
+                <w:szCs w:val="20"/>
+              </w:rPr>
+            </w:pPr>
             <w:r>
               <w:rPr>
-                <w:sz w:val="0"/>
+                <w:sz w:val="20"/>
+                <w:szCs w:val="20"/>
               </w:rPr>
               <w:t>Mr Bhekisisa Shandu</w:t>
             </w:r>
@@ -327,13 +346,20 @@
         </w:tc>
         <w:tc>
           <w:tcPr>
-            <w:tcW w:type="dxa" w:w="4513"/>
+            <w:tcW w:w="4599" w:type="dxa"/>
             <w:shd w:val="clear" w:color="auto" w:fill="F7F8F5"/>
           </w:tcPr>
           <w:p>
+            <w:pPr>
+              <w:rPr>
+                <w:sz w:val="20"/>
+                <w:szCs w:val="20"/>
+              </w:rPr>
+            </w:pPr>
             <w:r>
               <w:rPr>
-                <w:sz w:val="0"/>
+                <w:sz w:val="20"/>
+                <w:szCs w:val="20"/>
               </w:rPr>
               <w:t>Executive Director</w:t>
             </w:r>
@@ -341,14 +367,25 @@
         </w:tc>
       </w:tr>
       <w:tr>
+        <w:trPr>
+          <w:trHeight w:val="478"/>
+          <w:jc w:val="center"/>
+        </w:trPr>
         <w:tc>
           <w:tcPr>
-            <w:tcW w:type="dxa" w:w="4513"/>
+            <w:tcW w:w="4599" w:type="dxa"/>
           </w:tcPr>
           <w:p>
+            <w:pPr>
+              <w:rPr>
+                <w:sz w:val="20"/>
+                <w:szCs w:val="20"/>
+              </w:rPr>
+            </w:pPr>
             <w:r>
               <w:rPr>
-                <w:sz w:val="0"/>
+                <w:sz w:val="20"/>
+                <w:szCs w:val="20"/>
               </w:rPr>
               <w:t>Mr Thapelo Nelson Maqalika</w:t>
             </w:r>
@@ -356,12 +393,19 @@
         </w:tc>
         <w:tc>
           <w:tcPr>
-            <w:tcW w:type="dxa" w:w="4513"/>
+            <w:tcW w:w="4599" w:type="dxa"/>
           </w:tcPr>
           <w:p>
+            <w:pPr>
+              <w:rPr>
+                <w:sz w:val="20"/>
+                <w:szCs w:val="20"/>
+              </w:rPr>
+            </w:pPr>
             <w:r>
               <w:rPr>
-                <w:sz w:val="0"/>
+                <w:sz w:val="20"/>
+                <w:szCs w:val="20"/>
               </w:rPr>
               <w:t>Director: Head of ICT and Communications</w:t>
             </w:r>
@@ -369,15 +413,26 @@
         </w:tc>
       </w:tr>
       <w:tr>
+        <w:trPr>
+          <w:trHeight w:val="478"/>
+          <w:jc w:val="center"/>
+        </w:trPr>
         <w:tc>
           <w:tcPr>
-            <w:tcW w:type="dxa" w:w="4513"/>
+            <w:tcW w:w="4599" w:type="dxa"/>
             <w:shd w:val="clear" w:color="auto" w:fill="F7F8F5"/>
           </w:tcPr>
           <w:p>
+            <w:pPr>
+              <w:rPr>
+                <w:sz w:val="20"/>
+                <w:szCs w:val="20"/>
+              </w:rPr>
+            </w:pPr>
             <w:r>
               <w:rPr>
-                <w:sz w:val="0"/>
+                <w:sz w:val="20"/>
+                <w:szCs w:val="20"/>
               </w:rPr>
               <w:t>Mr Khulekani Gumede</w:t>
             </w:r>
@@ -385,13 +440,20 @@
         </w:tc>
         <w:tc>
           <w:tcPr>
-            <w:tcW w:type="dxa" w:w="4513"/>
+            <w:tcW w:w="4599" w:type="dxa"/>
             <w:shd w:val="clear" w:color="auto" w:fill="F7F8F5"/>
           </w:tcPr>
           <w:p>
+            <w:pPr>
+              <w:rPr>
+                <w:sz w:val="20"/>
+                <w:szCs w:val="20"/>
+              </w:rPr>
+            </w:pPr>
             <w:r>
               <w:rPr>
-                <w:sz w:val="0"/>
+                <w:sz w:val="20"/>
+                <w:szCs w:val="20"/>
               </w:rPr>
               <w:t>Director: People and Culture</w:t>
             </w:r>
@@ -399,11 +461,14 @@
         </w:tc>
       </w:tr>
     </w:tbl>
-    <w:p/>
     <w:p>
       <w:pPr>
-        <w:spacing w:after="80" w:before="180"/>
-        <w:jc w:val="left"/>
+        <w:spacing w:line="276" w:lineRule="auto"/>
+      </w:pPr>
+    </w:p>
+    <w:p>
+      <w:pPr>
+        <w:spacing w:before="180" w:after="80" w:line="276" w:lineRule="auto"/>
       </w:pPr>
       <w:r>
         <w:rPr>
@@ -416,12 +481,10 @@
     </w:p>
     <w:p>
       <w:pPr>
-        <w:spacing w:after="90" w:before="0"/>
-        <w:jc w:val="left"/>
+        <w:spacing w:after="90" w:line="276" w:lineRule="auto"/>
       </w:pPr>
       <w:r>
         <w:rPr>
-          <w:b w:val="0"/>
           <w:sz w:val="20"/>
         </w:rPr>
         <w:t>No apologies were received.</w:t>
@@ -429,17 +492,7 @@
     </w:p>
     <w:p>
       <w:pPr>
-        <w:spacing w:after="90" w:before="90"/>
-        <w:jc w:val="center"/>
-        <w:pBdr>
-          <w:bottom w:val="single" w:sz="4" w:space="1" w:color="000000"/>
-        </w:pBdr>
-      </w:pPr>
-    </w:p>
-    <w:p>
-      <w:pPr>
-        <w:spacing w:after="80" w:before="180"/>
-        <w:jc w:val="left"/>
+        <w:spacing w:before="180" w:after="80" w:line="276" w:lineRule="auto"/>
       </w:pPr>
       <w:r>
         <w:rPr>
@@ -452,30 +505,19 @@
     </w:p>
     <w:p>
       <w:pPr>
-        <w:spacing w:after="90" w:before="0"/>
-        <w:jc w:val="left"/>
+        <w:spacing w:after="90" w:line="276" w:lineRule="auto"/>
       </w:pPr>
       <w:r>
         <w:rPr>
-          <w:b w:val="0"/>
           <w:sz w:val="20"/>
         </w:rPr>
+        <w:lastRenderedPageBreak/>
         <w:t>All Directors present confirmed that they had no personal financial interests that conflicted with the matters tabled before the meeting.</w:t>
       </w:r>
     </w:p>
     <w:p>
       <w:pPr>
-        <w:spacing w:after="90" w:before="90"/>
-        <w:jc w:val="center"/>
-        <w:pBdr>
-          <w:bottom w:val="single" w:sz="4" w:space="1" w:color="000000"/>
-        </w:pBdr>
-      </w:pPr>
-    </w:p>
-    <w:p>
-      <w:pPr>
-        <w:spacing w:after="80" w:before="180"/>
-        <w:jc w:val="left"/>
+        <w:spacing w:before="180" w:after="80" w:line="276" w:lineRule="auto"/>
       </w:pPr>
       <w:r>
         <w:rPr>
@@ -488,12 +530,10 @@
     </w:p>
     <w:p>
       <w:pPr>
-        <w:spacing w:after="90" w:before="0"/>
-        <w:jc w:val="left"/>
+        <w:spacing w:after="90" w:line="276" w:lineRule="auto"/>
       </w:pPr>
       <w:r>
         <w:rPr>
-          <w:b w:val="0"/>
           <w:sz w:val="20"/>
         </w:rPr>
         <w:t>The Chairlady tabled the following objectives of the meeting:</w:t>
@@ -501,9 +541,7 @@
     </w:p>
     <w:p>
       <w:pPr>
-        <w:spacing w:after="90"/>
-        <w:ind w:left="1829"/>
-        <w:jc w:val="left"/>
+        <w:spacing w:after="90" w:line="276" w:lineRule="auto"/>
       </w:pPr>
       <w:r>
         <w:rPr>
@@ -514,9 +552,7 @@
     </w:p>
     <w:p>
       <w:pPr>
-        <w:spacing w:after="90"/>
-        <w:ind w:left="1829"/>
-        <w:jc w:val="left"/>
+        <w:spacing w:after="90" w:line="276" w:lineRule="auto"/>
       </w:pPr>
       <w:r>
         <w:rPr>
@@ -527,9 +563,7 @@
     </w:p>
     <w:p>
       <w:pPr>
-        <w:spacing w:after="90"/>
-        <w:ind w:left="1829"/>
-        <w:jc w:val="left"/>
+        <w:spacing w:after="90" w:line="276" w:lineRule="auto"/>
       </w:pPr>
       <w:r>
         <w:rPr>
@@ -540,9 +574,7 @@
     </w:p>
     <w:p>
       <w:pPr>
-        <w:spacing w:after="90"/>
-        <w:ind w:left="1829"/>
-        <w:jc w:val="left"/>
+        <w:spacing w:after="90" w:line="276" w:lineRule="auto"/>
       </w:pPr>
       <w:r>
         <w:rPr>
@@ -553,30 +585,26 @@
     </w:p>
     <w:p>
       <w:pPr>
-        <w:spacing w:after="90"/>
-        <w:ind w:left="1829"/>
-        <w:jc w:val="left"/>
-      </w:pPr>
+        <w:spacing w:after="90" w:line="276" w:lineRule="auto"/>
+      </w:pPr>
+      <w:proofErr w:type="gramStart"/>
       <w:r>
         <w:rPr>
           <w:sz w:val="20"/>
         </w:rPr>
-        <w:t>5.5  To confirm the roles, responsibilities and authority of the Board of Directors and Executive Management.</w:t>
+        <w:t>5.5  To</w:t>
+      </w:r>
+      <w:proofErr w:type="gramEnd"/>
+      <w:r>
+        <w:rPr>
+          <w:sz w:val="20"/>
+        </w:rPr>
+        <w:t xml:space="preserve"> confirm the roles, responsibilities and authority of the Board of Directors and Executive Management.</w:t>
       </w:r>
     </w:p>
     <w:p>
       <w:pPr>
-        <w:spacing w:after="90" w:before="90"/>
-        <w:jc w:val="center"/>
-        <w:pBdr>
-          <w:bottom w:val="single" w:sz="4" w:space="1" w:color="000000"/>
-        </w:pBdr>
-      </w:pPr>
-    </w:p>
-    <w:p>
-      <w:pPr>
-        <w:spacing w:after="80" w:before="180"/>
-        <w:jc w:val="left"/>
+        <w:spacing w:before="180" w:after="80" w:line="276" w:lineRule="auto"/>
       </w:pPr>
       <w:r>
         <w:rPr>
@@ -589,12 +617,10 @@
     </w:p>
     <w:p>
       <w:pPr>
-        <w:spacing w:after="90" w:before="0"/>
-        <w:jc w:val="left"/>
+        <w:spacing w:after="90" w:line="276" w:lineRule="auto"/>
       </w:pPr>
       <w:r>
         <w:rPr>
-          <w:b w:val="0"/>
           <w:sz w:val="20"/>
         </w:rPr>
         <w:t>The Board considered the customised Memorandum of Incorporation prepared for ASCO NPC.</w:t>
@@ -602,12 +628,10 @@
     </w:p>
     <w:p>
       <w:pPr>
-        <w:spacing w:after="90" w:before="0"/>
-        <w:jc w:val="left"/>
+        <w:spacing w:after="90" w:line="276" w:lineRule="auto"/>
       </w:pPr>
       <w:r>
         <w:rPr>
-          <w:b w:val="0"/>
           <w:sz w:val="20"/>
         </w:rPr>
         <w:t>The Board noted that the MOI is intended to serve as the organisation's principal governance instrument and provides clarity on:</w:t>
@@ -615,8 +639,7 @@
     </w:p>
     <w:p>
       <w:pPr>
-        <w:spacing w:after="40"/>
-        <w:jc w:val="left"/>
+        <w:spacing w:after="40" w:line="276" w:lineRule="auto"/>
       </w:pPr>
       <w:r>
         <w:rPr>
@@ -635,8 +658,7 @@
     </w:p>
     <w:p>
       <w:pPr>
-        <w:spacing w:after="40"/>
-        <w:jc w:val="left"/>
+        <w:spacing w:after="40" w:line="276" w:lineRule="auto"/>
       </w:pPr>
       <w:r>
         <w:rPr>
@@ -655,8 +677,7 @@
     </w:p>
     <w:p>
       <w:pPr>
-        <w:spacing w:after="40"/>
-        <w:jc w:val="left"/>
+        <w:spacing w:after="40" w:line="276" w:lineRule="auto"/>
       </w:pPr>
       <w:r>
         <w:rPr>
@@ -675,8 +696,7 @@
     </w:p>
     <w:p>
       <w:pPr>
-        <w:spacing w:after="40"/>
-        <w:jc w:val="left"/>
+        <w:spacing w:after="40" w:line="276" w:lineRule="auto"/>
       </w:pPr>
       <w:r>
         <w:rPr>
@@ -695,8 +715,7 @@
     </w:p>
     <w:p>
       <w:pPr>
-        <w:spacing w:after="40"/>
-        <w:jc w:val="left"/>
+        <w:spacing w:after="40" w:line="276" w:lineRule="auto"/>
       </w:pPr>
       <w:r>
         <w:rPr>
@@ -715,8 +734,7 @@
     </w:p>
     <w:p>
       <w:pPr>
-        <w:spacing w:after="40"/>
-        <w:jc w:val="left"/>
+        <w:spacing w:after="40" w:line="276" w:lineRule="auto"/>
       </w:pPr>
       <w:r>
         <w:rPr>
@@ -735,8 +753,7 @@
     </w:p>
     <w:p>
       <w:pPr>
-        <w:spacing w:after="40"/>
-        <w:jc w:val="left"/>
+        <w:spacing w:after="40" w:line="276" w:lineRule="auto"/>
       </w:pPr>
       <w:r>
         <w:rPr>
@@ -755,8 +772,7 @@
     </w:p>
     <w:p>
       <w:pPr>
-        <w:spacing w:after="40"/>
-        <w:jc w:val="left"/>
+        <w:spacing w:after="40" w:line="276" w:lineRule="auto"/>
       </w:pPr>
       <w:r>
         <w:rPr>
@@ -775,30 +791,32 @@
     </w:p>
     <w:p>
       <w:pPr>
-        <w:spacing w:after="90" w:before="0"/>
-        <w:jc w:val="left"/>
+        <w:spacing w:after="90" w:line="276" w:lineRule="auto"/>
       </w:pPr>
       <w:r>
         <w:rPr>
-          <w:b w:val="0"/>
           <w:sz w:val="20"/>
         </w:rPr>
-        <w:t>The Board further noted that the customised MOI strengthens ASCO NPC's readiness to engage with funding institutions, government structures, international organisations and regulatory authorities.</w:t>
+        <w:t xml:space="preserve">The Board further noted that the customised MOI strengthens ASCO NPC's readiness to engage with funding institutions, government structures, international </w:t>
+      </w:r>
+      <w:proofErr w:type="spellStart"/>
+      <w:r>
+        <w:rPr>
+          <w:sz w:val="20"/>
+        </w:rPr>
+        <w:t>organisations</w:t>
+      </w:r>
+      <w:proofErr w:type="spellEnd"/>
+      <w:r>
+        <w:rPr>
+          <w:sz w:val="20"/>
+        </w:rPr>
+        <w:t xml:space="preserve"> and regulatory authorities.</w:t>
       </w:r>
     </w:p>
     <w:p>
       <w:pPr>
-        <w:spacing w:after="90" w:before="90"/>
-        <w:jc w:val="center"/>
-        <w:pBdr>
-          <w:bottom w:val="single" w:sz="4" w:space="1" w:color="000000"/>
-        </w:pBdr>
-      </w:pPr>
-    </w:p>
-    <w:p>
-      <w:pPr>
-        <w:spacing w:after="80" w:before="180"/>
-        <w:jc w:val="left"/>
+        <w:spacing w:before="180" w:after="80" w:line="276" w:lineRule="auto"/>
       </w:pPr>
       <w:r>
         <w:rPr>
@@ -811,12 +829,10 @@
     </w:p>
     <w:p>
       <w:pPr>
-        <w:spacing w:after="90" w:before="0"/>
-        <w:jc w:val="left"/>
+        <w:spacing w:after="90" w:line="276" w:lineRule="auto"/>
       </w:pPr>
       <w:r>
         <w:rPr>
-          <w:b w:val="0"/>
           <w:sz w:val="20"/>
         </w:rPr>
         <w:t>The Board formally considered the recognition of Ms Busisiwe Makhosi Shandu as Founder and Custodian of the Founding Legacy of African Solidarity Civic Organisation NPC.</w:t>
@@ -824,12 +840,10 @@
     </w:p>
     <w:p>
       <w:pPr>
-        <w:spacing w:after="90" w:before="0"/>
-        <w:jc w:val="left"/>
+        <w:spacing w:after="90" w:line="276" w:lineRule="auto"/>
       </w:pPr>
       <w:r>
         <w:rPr>
-          <w:b w:val="0"/>
           <w:sz w:val="20"/>
         </w:rPr>
         <w:t>The Board recorded that the recognition of the Founder is intended to preserve and honour:</w:t>
@@ -837,8 +851,7 @@
     </w:p>
     <w:p>
       <w:pPr>
-        <w:spacing w:after="40"/>
-        <w:jc w:val="left"/>
+        <w:spacing w:after="40" w:line="276" w:lineRule="auto"/>
       </w:pPr>
       <w:r>
         <w:rPr>
@@ -857,8 +870,7 @@
     </w:p>
     <w:p>
       <w:pPr>
-        <w:spacing w:after="40"/>
-        <w:jc w:val="left"/>
+        <w:spacing w:after="40" w:line="276" w:lineRule="auto"/>
       </w:pPr>
       <w:r>
         <w:rPr>
@@ -877,8 +889,7 @@
     </w:p>
     <w:p>
       <w:pPr>
-        <w:spacing w:after="40"/>
-        <w:jc w:val="left"/>
+        <w:spacing w:after="40" w:line="276" w:lineRule="auto"/>
       </w:pPr>
       <w:r>
         <w:rPr>
@@ -897,12 +908,10 @@
     </w:p>
     <w:p>
       <w:pPr>
-        <w:spacing w:after="90" w:before="0"/>
-        <w:jc w:val="left"/>
+        <w:spacing w:after="90" w:line="276" w:lineRule="auto"/>
       </w:pPr>
       <w:r>
         <w:rPr>
-          <w:b w:val="0"/>
           <w:sz w:val="20"/>
         </w:rPr>
         <w:t>The Board further resolved that:</w:t>
@@ -910,9 +919,7 @@
     </w:p>
     <w:p>
       <w:pPr>
-        <w:spacing w:after="90"/>
-        <w:ind w:left="1829"/>
-        <w:jc w:val="left"/>
+        <w:spacing w:after="90" w:line="276" w:lineRule="auto"/>
       </w:pPr>
       <w:r>
         <w:rPr>
@@ -923,9 +930,7 @@
     </w:p>
     <w:p>
       <w:pPr>
-        <w:spacing w:after="90"/>
-        <w:ind w:left="1829"/>
-        <w:jc w:val="left"/>
+        <w:spacing w:after="90" w:line="276" w:lineRule="auto"/>
       </w:pPr>
       <w:r>
         <w:rPr>
@@ -936,9 +941,7 @@
     </w:p>
     <w:p>
       <w:pPr>
-        <w:spacing w:after="90"/>
-        <w:ind w:left="1829"/>
-        <w:jc w:val="left"/>
+        <w:spacing w:after="90" w:line="276" w:lineRule="auto"/>
       </w:pPr>
       <w:r>
         <w:rPr>
@@ -949,9 +952,7 @@
     </w:p>
     <w:p>
       <w:pPr>
-        <w:spacing w:after="90"/>
-        <w:ind w:left="1829"/>
-        <w:jc w:val="left"/>
+        <w:spacing w:after="90" w:line="276" w:lineRule="auto"/>
       </w:pPr>
       <w:r>
         <w:rPr>
@@ -962,17 +963,7 @@
     </w:p>
     <w:p>
       <w:pPr>
-        <w:spacing w:after="90" w:before="90"/>
-        <w:jc w:val="center"/>
-        <w:pBdr>
-          <w:bottom w:val="single" w:sz="4" w:space="1" w:color="000000"/>
-        </w:pBdr>
-      </w:pPr>
-    </w:p>
-    <w:p>
-      <w:pPr>
-        <w:spacing w:after="80" w:before="180"/>
-        <w:jc w:val="left"/>
+        <w:spacing w:before="180" w:after="80" w:line="276" w:lineRule="auto"/>
       </w:pPr>
       <w:r>
         <w:rPr>
@@ -985,12 +976,10 @@
     </w:p>
     <w:p>
       <w:pPr>
-        <w:spacing w:after="90" w:before="0"/>
-        <w:jc w:val="left"/>
+        <w:spacing w:after="90" w:line="276" w:lineRule="auto"/>
       </w:pPr>
       <w:r>
         <w:rPr>
-          <w:b w:val="0"/>
           <w:sz w:val="20"/>
         </w:rPr>
         <w:t>The Board confirmed the following governance structure:</w:t>
@@ -998,8 +987,7 @@
     </w:p>
     <w:p>
       <w:pPr>
-        <w:spacing w:after="80" w:before="180"/>
-        <w:jc w:val="left"/>
+        <w:spacing w:before="180" w:after="80" w:line="276" w:lineRule="auto"/>
       </w:pPr>
       <w:r>
         <w:rPr>
@@ -1012,8 +1000,7 @@
     </w:p>
     <w:p>
       <w:pPr>
-        <w:spacing w:after="90" w:before="0"/>
-        <w:jc w:val="left"/>
+        <w:spacing w:after="90" w:line="276" w:lineRule="auto"/>
       </w:pPr>
       <w:r>
         <w:rPr>
@@ -1026,12 +1013,10 @@
     </w:p>
     <w:p>
       <w:pPr>
-        <w:spacing w:after="90" w:before="0"/>
-        <w:jc w:val="left"/>
+        <w:spacing w:after="90" w:line="276" w:lineRule="auto"/>
       </w:pPr>
       <w:r>
         <w:rPr>
-          <w:b w:val="0"/>
           <w:sz w:val="20"/>
         </w:rPr>
         <w:t>The Chairlady shall provide leadership to the Board, ensure effective governance oversight and safeguard the founding principles and long-term vision of ASCO NPC.</w:t>
@@ -1039,8 +1024,7 @@
     </w:p>
     <w:p>
       <w:pPr>
-        <w:spacing w:after="80" w:before="180"/>
-        <w:jc w:val="left"/>
+        <w:spacing w:before="180" w:after="80" w:line="276" w:lineRule="auto"/>
       </w:pPr>
       <w:r>
         <w:rPr>
@@ -1053,8 +1037,7 @@
     </w:p>
     <w:p>
       <w:pPr>
-        <w:spacing w:after="90" w:before="0"/>
-        <w:jc w:val="left"/>
+        <w:spacing w:after="90" w:line="276" w:lineRule="auto"/>
       </w:pPr>
       <w:r>
         <w:rPr>
@@ -1067,12 +1050,10 @@
     </w:p>
     <w:p>
       <w:pPr>
-        <w:spacing w:after="90" w:before="0"/>
-        <w:jc w:val="left"/>
+        <w:spacing w:after="90" w:line="276" w:lineRule="auto"/>
       </w:pPr>
       <w:r>
         <w:rPr>
-          <w:b w:val="0"/>
           <w:sz w:val="20"/>
         </w:rPr>
         <w:t>The Executive Director shall be responsible for:</w:t>
@@ -1080,8 +1061,7 @@
     </w:p>
     <w:p>
       <w:pPr>
-        <w:spacing w:after="40"/>
-        <w:jc w:val="left"/>
+        <w:spacing w:after="40" w:line="276" w:lineRule="auto"/>
       </w:pPr>
       <w:r>
         <w:rPr>
@@ -1100,8 +1080,7 @@
     </w:p>
     <w:p>
       <w:pPr>
-        <w:spacing w:after="40"/>
-        <w:jc w:val="left"/>
+        <w:spacing w:after="40" w:line="276" w:lineRule="auto"/>
       </w:pPr>
       <w:r>
         <w:rPr>
@@ -1120,8 +1099,7 @@
     </w:p>
     <w:p>
       <w:pPr>
-        <w:spacing w:after="40"/>
-        <w:jc w:val="left"/>
+        <w:spacing w:after="40" w:line="276" w:lineRule="auto"/>
       </w:pPr>
       <w:r>
         <w:rPr>
@@ -1140,8 +1118,7 @@
     </w:p>
     <w:p>
       <w:pPr>
-        <w:spacing w:after="40"/>
-        <w:jc w:val="left"/>
+        <w:spacing w:after="40" w:line="276" w:lineRule="auto"/>
       </w:pPr>
       <w:r>
         <w:rPr>
@@ -1160,8 +1137,7 @@
     </w:p>
     <w:p>
       <w:pPr>
-        <w:spacing w:after="40"/>
-        <w:jc w:val="left"/>
+        <w:spacing w:after="40" w:line="276" w:lineRule="auto"/>
       </w:pPr>
       <w:r>
         <w:rPr>
@@ -1180,8 +1156,7 @@
     </w:p>
     <w:p>
       <w:pPr>
-        <w:spacing w:after="80" w:before="180"/>
-        <w:jc w:val="left"/>
+        <w:spacing w:before="180" w:after="80" w:line="276" w:lineRule="auto"/>
       </w:pPr>
       <w:r>
         <w:rPr>
@@ -1194,8 +1169,7 @@
     </w:p>
     <w:p>
       <w:pPr>
-        <w:spacing w:after="90" w:before="0"/>
-        <w:jc w:val="left"/>
+        <w:spacing w:after="90" w:line="276" w:lineRule="auto"/>
       </w:pPr>
       <w:r>
         <w:rPr>
@@ -1208,12 +1182,10 @@
     </w:p>
     <w:p>
       <w:pPr>
-        <w:spacing w:after="90" w:before="0"/>
-        <w:jc w:val="left"/>
+        <w:spacing w:after="90" w:line="276" w:lineRule="auto"/>
       </w:pPr>
       <w:r>
         <w:rPr>
-          <w:b w:val="0"/>
           <w:sz w:val="20"/>
         </w:rPr>
         <w:t>The Board resolved that Mr Maqalika shall:</w:t>
@@ -1221,8 +1193,7 @@
     </w:p>
     <w:p>
       <w:pPr>
-        <w:spacing w:after="40"/>
-        <w:jc w:val="left"/>
+        <w:spacing w:after="40" w:line="276" w:lineRule="auto"/>
       </w:pPr>
       <w:r>
         <w:rPr>
@@ -1241,8 +1212,7 @@
     </w:p>
     <w:p>
       <w:pPr>
-        <w:spacing w:after="40"/>
-        <w:jc w:val="left"/>
+        <w:spacing w:after="40" w:line="276" w:lineRule="auto"/>
       </w:pPr>
       <w:r>
         <w:rPr>
@@ -1261,8 +1231,7 @@
     </w:p>
     <w:p>
       <w:pPr>
-        <w:spacing w:after="40"/>
-        <w:jc w:val="left"/>
+        <w:spacing w:after="40" w:line="276" w:lineRule="auto"/>
       </w:pPr>
       <w:r>
         <w:rPr>
@@ -1281,8 +1250,7 @@
     </w:p>
     <w:p>
       <w:pPr>
-        <w:spacing w:after="40"/>
-        <w:jc w:val="left"/>
+        <w:spacing w:after="40" w:line="276" w:lineRule="auto"/>
       </w:pPr>
       <w:r>
         <w:rPr>
@@ -1301,8 +1269,7 @@
     </w:p>
     <w:p>
       <w:pPr>
-        <w:spacing w:after="80" w:before="180"/>
-        <w:jc w:val="left"/>
+        <w:spacing w:before="180" w:after="80" w:line="276" w:lineRule="auto"/>
       </w:pPr>
       <w:r>
         <w:rPr>
@@ -1315,8 +1282,7 @@
     </w:p>
     <w:p>
       <w:pPr>
-        <w:spacing w:after="90" w:before="0"/>
-        <w:jc w:val="left"/>
+        <w:spacing w:after="90" w:line="276" w:lineRule="auto"/>
       </w:pPr>
       <w:r>
         <w:rPr>
@@ -1329,12 +1295,10 @@
     </w:p>
     <w:p>
       <w:pPr>
-        <w:spacing w:after="90" w:before="0"/>
-        <w:jc w:val="left"/>
+        <w:spacing w:after="90" w:line="276" w:lineRule="auto"/>
       </w:pPr>
       <w:r>
         <w:rPr>
-          <w:b w:val="0"/>
           <w:sz w:val="20"/>
         </w:rPr>
         <w:t>The Board confirmed that Mr Gumede shall provide leadership and oversight relating to:</w:t>
@@ -1342,8 +1306,7 @@
     </w:p>
     <w:p>
       <w:pPr>
-        <w:spacing w:after="40"/>
-        <w:jc w:val="left"/>
+        <w:spacing w:after="40" w:line="276" w:lineRule="auto"/>
       </w:pPr>
       <w:r>
         <w:rPr>
@@ -1362,8 +1325,7 @@
     </w:p>
     <w:p>
       <w:pPr>
-        <w:spacing w:after="40"/>
-        <w:jc w:val="left"/>
+        <w:spacing w:after="40" w:line="276" w:lineRule="auto"/>
       </w:pPr>
       <w:r>
         <w:rPr>
@@ -1382,8 +1344,7 @@
     </w:p>
     <w:p>
       <w:pPr>
-        <w:spacing w:after="40"/>
-        <w:jc w:val="left"/>
+        <w:spacing w:after="40" w:line="276" w:lineRule="auto"/>
       </w:pPr>
       <w:r>
         <w:rPr>
@@ -1402,8 +1363,7 @@
     </w:p>
     <w:p>
       <w:pPr>
-        <w:spacing w:after="40"/>
-        <w:jc w:val="left"/>
+        <w:spacing w:after="40" w:line="276" w:lineRule="auto"/>
       </w:pPr>
       <w:r>
         <w:rPr>
@@ -1422,8 +1382,7 @@
     </w:p>
     <w:p>
       <w:pPr>
-        <w:spacing w:after="40"/>
-        <w:jc w:val="left"/>
+        <w:spacing w:after="40" w:line="276" w:lineRule="auto"/>
       </w:pPr>
       <w:r>
         <w:rPr>
@@ -1442,17 +1401,7 @@
     </w:p>
     <w:p>
       <w:pPr>
-        <w:spacing w:after="90" w:before="90"/>
-        <w:jc w:val="center"/>
-        <w:pBdr>
-          <w:bottom w:val="single" w:sz="4" w:space="1" w:color="000000"/>
-        </w:pBdr>
-      </w:pPr>
-    </w:p>
-    <w:p>
-      <w:pPr>
-        <w:spacing w:after="80" w:before="180"/>
-        <w:jc w:val="left"/>
+        <w:spacing w:before="180" w:after="80" w:line="276" w:lineRule="auto"/>
       </w:pPr>
       <w:r>
         <w:rPr>
@@ -1465,12 +1414,10 @@
     </w:p>
     <w:p>
       <w:pPr>
-        <w:spacing w:after="90" w:before="0"/>
-        <w:jc w:val="left"/>
+        <w:spacing w:after="90" w:line="276" w:lineRule="auto"/>
       </w:pPr>
       <w:r>
         <w:rPr>
-          <w:b w:val="0"/>
           <w:sz w:val="20"/>
         </w:rPr>
         <w:t>After thorough consideration and discussion, the Board unanimously adopted the following resolution:</w:t>
@@ -1478,8 +1425,7 @@
     </w:p>
     <w:p>
       <w:pPr>
-        <w:spacing w:after="90" w:before="180"/>
-        <w:jc w:val="left"/>
+        <w:spacing w:before="180" w:after="90" w:line="276" w:lineRule="auto"/>
       </w:pPr>
       <w:r>
         <w:rPr>
@@ -1492,8 +1438,11 @@
     </w:p>
     <w:p>
       <w:pPr>
-        <w:spacing w:after="90" w:before="0"/>
-        <w:jc w:val="left"/>
+        <w:spacing w:after="90" w:line="276" w:lineRule="auto"/>
+        <w:rPr>
+          <w:b/>
+          <w:sz w:val="20"/>
+        </w:rPr>
       </w:pPr>
       <w:r>
         <w:rPr>
@@ -1505,9 +1454,7 @@
     </w:p>
     <w:p>
       <w:pPr>
-        <w:spacing w:after="90"/>
-        <w:ind w:left="1829"/>
-        <w:jc w:val="left"/>
+        <w:spacing w:after="90" w:line="276" w:lineRule="auto"/>
       </w:pPr>
       <w:r>
         <w:rPr>
@@ -1518,9 +1465,7 @@
     </w:p>
     <w:p>
       <w:pPr>
-        <w:spacing w:after="90"/>
-        <w:ind w:left="1829"/>
-        <w:jc w:val="left"/>
+        <w:spacing w:after="90" w:line="276" w:lineRule="auto"/>
       </w:pPr>
       <w:r>
         <w:rPr>
@@ -1531,9 +1476,7 @@
     </w:p>
     <w:p>
       <w:pPr>
-        <w:spacing w:after="90"/>
-        <w:ind w:left="1829"/>
-        <w:jc w:val="left"/>
+        <w:spacing w:after="90" w:line="276" w:lineRule="auto"/>
       </w:pPr>
       <w:r>
         <w:rPr>
@@ -1544,9 +1487,7 @@
     </w:p>
     <w:p>
       <w:pPr>
-        <w:spacing w:after="90"/>
-        <w:ind w:left="1829"/>
-        <w:jc w:val="left"/>
+        <w:spacing w:after="90" w:line="276" w:lineRule="auto"/>
       </w:pPr>
       <w:r>
         <w:rPr>
@@ -1557,9 +1498,7 @@
     </w:p>
     <w:p>
       <w:pPr>
-        <w:spacing w:after="90"/>
-        <w:ind w:left="1829"/>
-        <w:jc w:val="left"/>
+        <w:spacing w:after="90" w:line="276" w:lineRule="auto"/>
       </w:pPr>
       <w:r>
         <w:rPr>
@@ -1570,9 +1509,7 @@
     </w:p>
     <w:p>
       <w:pPr>
-        <w:spacing w:after="90"/>
-        <w:ind w:left="1829"/>
-        <w:jc w:val="left"/>
+        <w:spacing w:after="90" w:line="276" w:lineRule="auto"/>
       </w:pPr>
       <w:r>
         <w:rPr>
@@ -1583,9 +1520,7 @@
     </w:p>
     <w:p>
       <w:pPr>
-        <w:spacing w:after="90"/>
-        <w:ind w:left="1829"/>
-        <w:jc w:val="left"/>
+        <w:spacing w:after="90" w:line="276" w:lineRule="auto"/>
       </w:pPr>
       <w:r>
         <w:rPr>
@@ -1596,17 +1531,7 @@
     </w:p>
     <w:p>
       <w:pPr>
-        <w:spacing w:after="90" w:before="90"/>
-        <w:jc w:val="center"/>
-        <w:pBdr>
-          <w:bottom w:val="single" w:sz="4" w:space="1" w:color="000000"/>
-        </w:pBdr>
-      </w:pPr>
-    </w:p>
-    <w:p>
-      <w:pPr>
-        <w:spacing w:after="80" w:before="180"/>
-        <w:jc w:val="left"/>
+        <w:spacing w:before="180" w:after="80" w:line="276" w:lineRule="auto"/>
       </w:pPr>
       <w:r>
         <w:rPr>
@@ -1619,12 +1544,10 @@
     </w:p>
     <w:p>
       <w:pPr>
-        <w:spacing w:after="90" w:before="0"/>
-        <w:jc w:val="left"/>
+        <w:spacing w:after="90" w:line="276" w:lineRule="auto"/>
       </w:pPr>
       <w:r>
         <w:rPr>
-          <w:b w:val="0"/>
           <w:sz w:val="20"/>
         </w:rPr>
         <w:t>The Board directed that:</w:t>
@@ -1632,9 +1555,7 @@
     </w:p>
     <w:p>
       <w:pPr>
-        <w:spacing w:after="90"/>
-        <w:ind w:left="1829"/>
-        <w:jc w:val="left"/>
+        <w:spacing w:after="90" w:line="276" w:lineRule="auto"/>
       </w:pPr>
       <w:r>
         <w:rPr>
@@ -1645,9 +1566,7 @@
     </w:p>
     <w:p>
       <w:pPr>
-        <w:spacing w:after="90"/>
-        <w:ind w:left="1829"/>
-        <w:jc w:val="left"/>
+        <w:spacing w:after="90" w:line="276" w:lineRule="auto"/>
       </w:pPr>
       <w:r>
         <w:rPr>
@@ -1658,9 +1577,7 @@
     </w:p>
     <w:p>
       <w:pPr>
-        <w:spacing w:after="90"/>
-        <w:ind w:left="1829"/>
-        <w:jc w:val="left"/>
+        <w:spacing w:after="90" w:line="276" w:lineRule="auto"/>
       </w:pPr>
       <w:r>
         <w:rPr>
@@ -1671,17 +1588,7 @@
     </w:p>
     <w:p>
       <w:pPr>
-        <w:spacing w:after="90" w:before="90"/>
-        <w:jc w:val="center"/>
-        <w:pBdr>
-          <w:bottom w:val="single" w:sz="4" w:space="1" w:color="000000"/>
-        </w:pBdr>
-      </w:pPr>
-    </w:p>
-    <w:p>
-      <w:pPr>
-        <w:spacing w:after="80" w:before="180"/>
-        <w:jc w:val="left"/>
+        <w:spacing w:before="180" w:after="80" w:line="276" w:lineRule="auto"/>
       </w:pPr>
       <w:r>
         <w:rPr>
@@ -1694,12 +1601,10 @@
     </w:p>
     <w:p>
       <w:pPr>
-        <w:spacing w:after="90" w:before="0"/>
-        <w:jc w:val="left"/>
+        <w:spacing w:after="90" w:line="276" w:lineRule="auto"/>
       </w:pPr>
       <w:r>
         <w:rPr>
-          <w:b w:val="0"/>
           <w:sz w:val="20"/>
         </w:rPr>
         <w:t>There being no further matters for consideration, the Chairlady thanked all Directors for their participation and declared the meeting officially closed.</w:t>
@@ -1707,30 +1612,31 @@
     </w:p>
     <w:p>
       <w:pPr>
-        <w:spacing w:after="90" w:before="180"/>
-        <w:jc w:val="left"/>
+        <w:spacing w:before="180" w:after="90" w:line="276" w:lineRule="auto"/>
       </w:pPr>
       <w:r>
         <w:rPr>
-          <w:b w:val="0"/>
           <w:sz w:val="20"/>
         </w:rPr>
-        <w:t>Time closed: ____________________</w:t>
+        <w:t xml:space="preserve">Time closed: </w:t>
+      </w:r>
+      <w:r>
+        <w:rPr>
+          <w:sz w:val="20"/>
+          <w:u w:val="single"/>
+        </w:rPr>
+        <w:t>9/8/2026 14:18:05 PM</w:t>
       </w:r>
     </w:p>
     <w:p>
       <w:pPr>
-        <w:spacing w:after="90" w:before="90"/>
+        <w:spacing w:before="180" w:after="80" w:line="276" w:lineRule="auto"/>
         <w:jc w:val="center"/>
-        <w:pBdr>
-          <w:bottom w:val="single" w:sz="4" w:space="1" w:color="000000"/>
-        </w:pBdr>
-      </w:pPr>
-    </w:p>
-    <w:p>
-      <w:pPr>
-        <w:spacing w:after="90" w:before="180"/>
-        <w:jc w:val="center"/>
+        <w:rPr>
+          <w:b/>
+          <w:color w:val="145A32"/>
+          <w:sz w:val="22"/>
+        </w:rPr>
       </w:pPr>
       <w:r>
         <w:rPr>
@@ -1738,23 +1644,15 @@
           <w:color w:val="145A32"/>
           <w:sz w:val="22"/>
         </w:rPr>
-        <w:t>SIGNATURES OF DIRECTORS</w:t>
+        <w:t>SIGNATURES OF THE FOUNDING MEMBERS / BOARD OF DIRECTORS</w:t>
       </w:r>
     </w:p>
-    <w:sectPr>
-      <w:headerReference w:type="default" r:id="rId12"/>
-      <w:footerReference w:type="default" r:id="rId13"/>
-      <w:pgSz w:w="11906" w:h="16838"/>
-      <w:pgMar w:top="1440" w:right="1440" w:bottom="1440" w:left="1440" w:header="708" w:footer="708" w:gutter="0"/>
-      <w:cols w:space="708"/>
-      <w:docGrid w:linePitch="360"/>
-    </w:sectPr>
     <w:tbl>
       <w:tblPr>
         <w:tblW w:w="0" w:type="auto"/>
         <w:jc w:val="center"/>
         <w:tblLayout w:type="fixed"/>
-        <w:tblLook w:val="0020" w:firstRow="1" w:lastRow="0" w:firstColumn="0" w:lastColumn="0" w:noHBand="0" w:noVBand="0"/>
+        <w:tblLook w:val="04A0" w:firstRow="1" w:lastRow="0" w:firstColumn="1" w:lastColumn="0" w:noHBand="0" w:noVBand="1"/>
       </w:tblPr>
       <w:tblGrid>
         <w:gridCol w:w="4968"/>
@@ -1762,61 +1660,7 @@
       </w:tblGrid>
       <w:tr>
         <w:trPr>
-          <w:jc w:val="center"/>
-        </w:trPr>
-        <w:tc>
-          <w:tcPr>
-            <w:tcW w:w="4968" w:type="dxa"/>
-            <w:tcBorders>
-              <w:top w:val="single" w:sz="5" w:space="0" w:color="D8DDD8"/>
-              <w:left w:val="single" w:sz="5" w:space="0" w:color="D8DDD8"/>
-              <w:bottom w:val="single" w:sz="5" w:space="0" w:color="D8DDD8"/>
-              <w:right w:val="single" w:sz="5" w:space="0" w:color="D8DDD8"/>
-            </w:tcBorders>
-            <w:shd w:val="clear" w:color="auto" w:fill="145A32"/>
-          </w:tcPr>
-          <w:p>
-            <w:pPr>
-              <w:spacing w:after="0" w:line="276" w:lineRule="auto"/>
-            </w:pPr>
-            <w:r>
-              <w:rPr>
-                <w:b/>
-                <w:color w:val="FFFFFF"/>
-                <w:sz w:val="19"/>
-              </w:rPr>
-              <w:t>DOCUMENT STATUS</w:t>
-            </w:r>
-          </w:p>
-        </w:tc>
-        <w:tc>
-          <w:tcPr>
-            <w:tcW w:w="4968" w:type="dxa"/>
-            <w:tcBorders>
-              <w:top w:val="single" w:sz="5" w:space="0" w:color="D8DDD8"/>
-              <w:left w:val="single" w:sz="5" w:space="0" w:color="D8DDD8"/>
-              <w:bottom w:val="single" w:sz="5" w:space="0" w:color="D8DDD8"/>
-              <w:right w:val="single" w:sz="5" w:space="0" w:color="D8DDD8"/>
-            </w:tcBorders>
-            <w:shd w:val="clear" w:color="auto" w:fill="145A32"/>
-          </w:tcPr>
-          <w:p>
-            <w:pPr>
-              <w:spacing w:after="0" w:line="276" w:lineRule="auto"/>
-            </w:pPr>
-            <w:r>
-              <w:rPr>
-                <w:b/>
-                <w:color w:val="FFFFFF"/>
-                <w:sz w:val="19"/>
-              </w:rPr>
-              <w:t>APPROVAL AUTHORITY</w:t>
-            </w:r>
-          </w:p>
-        </w:tc>
-      </w:tr>
-      <w:tr>
-        <w:trPr>
+          <w:cantSplit/>
           <w:jc w:val="center"/>
         </w:trPr>
         <w:tc>
@@ -1831,14 +1675,118 @@
             <w:shd w:val="clear" w:color="auto" w:fill="F7F8F5"/>
           </w:tcPr>
           <w:p>
-            <w:pPr>
-              <w:spacing w:after="0" w:line="276" w:lineRule="auto"/>
-            </w:pPr>
             <w:r>
               <w:rPr>
-                <w:sz w:val="19"/>
+                <w:noProof/>
               </w:rPr>
-              <w:t>Effective date: 06 September 2026</w:t>
+              <w:drawing>
+                <wp:anchor distT="0" distB="0" distL="114300" distR="114300" simplePos="0" relativeHeight="251659264" behindDoc="0" locked="0" layoutInCell="1" allowOverlap="1" wp14:anchorId="4ED43FD9" wp14:editId="350DCEDC">
+                  <wp:simplePos x="0" y="0"/>
+                  <wp:positionH relativeFrom="column">
+                    <wp:posOffset>363082</wp:posOffset>
+                  </wp:positionH>
+                  <wp:positionV relativeFrom="paragraph">
+                    <wp:posOffset>275645</wp:posOffset>
+                  </wp:positionV>
+                  <wp:extent cx="1866900" cy="421292"/>
+                  <wp:effectExtent l="0" t="0" r="0" b="0"/>
+                  <wp:wrapNone/>
+                  <wp:docPr id="1466813974" name="Picture 2"/>
+                  <wp:cNvGraphicFramePr>
+                    <a:graphicFrameLocks xmlns:a="http://schemas.openxmlformats.org/drawingml/2006/main" noChangeAspect="1"/>
+                  </wp:cNvGraphicFramePr>
+                  <a:graphic xmlns:a="http://schemas.openxmlformats.org/drawingml/2006/main">
+                    <a:graphicData uri="http://schemas.openxmlformats.org/drawingml/2006/picture">
+                      <pic:pic xmlns:pic="http://schemas.openxmlformats.org/drawingml/2006/picture">
+                        <pic:nvPicPr>
+                          <pic:cNvPr id="1466813974" name="Picture 1466813974"/>
+                          <pic:cNvPicPr/>
+                        </pic:nvPicPr>
+                        <pic:blipFill rotWithShape="1">
+                          <a:blip r:embed="rId8">
+                            <a:biLevel thresh="75000"/>
+                          </a:blip>
+                          <a:srcRect l="9786" t="42903" r="18875" b="40265"/>
+                          <a:stretch>
+                            <a:fillRect/>
+                          </a:stretch>
+                        </pic:blipFill>
+                        <pic:spPr bwMode="auto">
+                          <a:xfrm>
+                            <a:off x="0" y="0"/>
+                            <a:ext cx="1866900" cy="421292"/>
+                          </a:xfrm>
+                          <a:prstGeom prst="rect">
+                            <a:avLst/>
+                          </a:prstGeom>
+                          <a:ln>
+                            <a:noFill/>
+                          </a:ln>
+                          <a:extLst>
+                            <a:ext uri="{53640926-AAD7-44D8-BBD7-CCE9431645EC}">
+                              <a14:shadowObscured xmlns:a14="http://schemas.microsoft.com/office/drawing/2010/main"/>
+                            </a:ext>
+                          </a:extLst>
+                        </pic:spPr>
+                      </pic:pic>
+                    </a:graphicData>
+                  </a:graphic>
+                  <wp14:sizeRelH relativeFrom="margin">
+                    <wp14:pctWidth>0</wp14:pctWidth>
+                  </wp14:sizeRelH>
+                  <wp14:sizeRelV relativeFrom="margin">
+                    <wp14:pctHeight>0</wp14:pctHeight>
+                  </wp14:sizeRelV>
+                </wp:anchor>
+              </w:drawing>
+            </w:r>
+            <w:r>
+              <w:rPr>
+                <w:b/>
+                <w:color w:val="145A32"/>
+                <w:sz w:val="16"/>
+              </w:rPr>
+              <w:t>CHAIR LADY</w:t>
+            </w:r>
+            <w:r>
+              <w:rPr>
+                <w:b/>
+                <w:sz w:val="18"/>
+              </w:rPr>
+              <w:br/>
+              <w:t>Ms. Busisiwe Makhosi Shandu</w:t>
+            </w:r>
+            <w:r>
+              <w:br/>
+            </w:r>
+          </w:p>
+          <w:p>
+            <w:r>
+              <w:t>Signature: ____________________________</w:t>
+            </w:r>
+            <w:r>
+              <w:br/>
+            </w:r>
+          </w:p>
+          <w:p>
+            <w:r>
+              <w:t xml:space="preserve">Date: </w:t>
+            </w:r>
+            <w:r>
+              <w:rPr>
+                <w:b/>
+                <w:bCs/>
+                <w:u w:val="single"/>
+              </w:rPr>
+              <w:t>8</w:t>
+            </w:r>
+            <w:r>
+              <w:rPr>
+                <w:b/>
+                <w:bCs/>
+                <w:u w:val="single"/>
+              </w:rPr>
+              <w:t xml:space="preserve"> September 2026</w:t>
             </w:r>
           </w:p>
         </w:tc>
@@ -1854,19 +1802,409 @@
             <w:shd w:val="clear" w:color="auto" w:fill="F7F8F5"/>
           </w:tcPr>
           <w:p>
+            <w:r>
+              <w:rPr>
+                <w:noProof/>
+              </w:rPr>
+              <w:drawing>
+                <wp:anchor distT="0" distB="0" distL="114300" distR="114300" simplePos="0" relativeHeight="251662336" behindDoc="0" locked="0" layoutInCell="1" allowOverlap="1" wp14:anchorId="4E9BB6B5" wp14:editId="7042C93C">
+                  <wp:simplePos x="0" y="0"/>
+                  <wp:positionH relativeFrom="column">
+                    <wp:posOffset>415649</wp:posOffset>
+                  </wp:positionH>
+                  <wp:positionV relativeFrom="paragraph">
+                    <wp:posOffset>231250</wp:posOffset>
+                  </wp:positionV>
+                  <wp:extent cx="2137410" cy="485775"/>
+                  <wp:effectExtent l="0" t="0" r="0" b="0"/>
+                  <wp:wrapNone/>
+                  <wp:docPr id="1629349264" name="Picture 5"/>
+                  <wp:cNvGraphicFramePr>
+                    <a:graphicFrameLocks xmlns:a="http://schemas.openxmlformats.org/drawingml/2006/main" noChangeAspect="1"/>
+                  </wp:cNvGraphicFramePr>
+                  <a:graphic xmlns:a="http://schemas.openxmlformats.org/drawingml/2006/main">
+                    <a:graphicData uri="http://schemas.openxmlformats.org/drawingml/2006/picture">
+                      <pic:pic xmlns:pic="http://schemas.openxmlformats.org/drawingml/2006/picture">
+                        <pic:nvPicPr>
+                          <pic:cNvPr id="1629349264" name="Picture 1629349264"/>
+                          <pic:cNvPicPr/>
+                        </pic:nvPicPr>
+                        <pic:blipFill rotWithShape="1">
+                          <a:blip r:embed="rId9">
+                            <a:biLevel thresh="75000"/>
+                          </a:blip>
+                          <a:srcRect t="41080" b="41419"/>
+                          <a:stretch>
+                            <a:fillRect/>
+                          </a:stretch>
+                        </pic:blipFill>
+                        <pic:spPr bwMode="auto">
+                          <a:xfrm>
+                            <a:off x="0" y="0"/>
+                            <a:ext cx="2137410" cy="485775"/>
+                          </a:xfrm>
+                          <a:prstGeom prst="rect">
+                            <a:avLst/>
+                          </a:prstGeom>
+                          <a:ln>
+                            <a:noFill/>
+                          </a:ln>
+                          <a:extLst>
+                            <a:ext uri="{53640926-AAD7-44D8-BBD7-CCE9431645EC}">
+                              <a14:shadowObscured xmlns:a14="http://schemas.microsoft.com/office/drawing/2010/main"/>
+                            </a:ext>
+                          </a:extLst>
+                        </pic:spPr>
+                      </pic:pic>
+                    </a:graphicData>
+                  </a:graphic>
+                  <wp14:sizeRelH relativeFrom="page">
+                    <wp14:pctWidth>0</wp14:pctWidth>
+                  </wp14:sizeRelH>
+                  <wp14:sizeRelV relativeFrom="page">
+                    <wp14:pctHeight>0</wp14:pctHeight>
+                  </wp14:sizeRelV>
+                </wp:anchor>
+              </w:drawing>
+            </w:r>
+            <w:r>
+              <w:rPr>
+                <w:b/>
+                <w:color w:val="145A32"/>
+                <w:sz w:val="16"/>
+              </w:rPr>
+              <w:t>DIRECTOR: HEAD OF ICT AND COMMUNICATIONS</w:t>
+            </w:r>
+            <w:r>
+              <w:rPr>
+                <w:b/>
+                <w:sz w:val="18"/>
+              </w:rPr>
+              <w:br/>
+              <w:t>Mr. Thapelo Nelson Maqalika</w:t>
+            </w:r>
+            <w:r>
+              <w:br/>
+            </w:r>
+          </w:p>
+          <w:p>
+            <w:r>
+              <w:t>Signature: ____________________________</w:t>
+            </w:r>
+            <w:r>
+              <w:br/>
+            </w:r>
+          </w:p>
+          <w:p>
             <w:pPr>
-              <w:spacing w:after="0" w:line="276" w:lineRule="auto"/>
+              <w:rPr>
+                <w:noProof/>
+              </w:rPr>
             </w:pPr>
             <w:r>
+              <w:t xml:space="preserve">Date: </w:t>
+            </w:r>
+            <w:r>
               <w:rPr>
-                <w:sz w:val="19"/>
+                <w:b/>
+                <w:bCs/>
+                <w:u w:val="single"/>
               </w:rPr>
-              <w:t>ASCO Board of Directors</w:t>
+              <w:t>8</w:t>
+            </w:r>
+            <w:r>
+              <w:rPr>
+                <w:b/>
+                <w:bCs/>
+                <w:u w:val="single"/>
+              </w:rPr>
+              <w:t xml:space="preserve"> September 2026</w:t>
+            </w:r>
+          </w:p>
+        </w:tc>
+      </w:tr>
+      <w:tr>
+        <w:trPr>
+          <w:cantSplit/>
+          <w:jc w:val="center"/>
+        </w:trPr>
+        <w:tc>
+          <w:tcPr>
+            <w:tcW w:w="4968" w:type="dxa"/>
+            <w:tcBorders>
+              <w:top w:val="single" w:sz="5" w:space="0" w:color="D8DDD8"/>
+              <w:left w:val="single" w:sz="5" w:space="0" w:color="D8DDD8"/>
+              <w:bottom w:val="single" w:sz="5" w:space="0" w:color="D8DDD8"/>
+              <w:right w:val="single" w:sz="5" w:space="0" w:color="D8DDD8"/>
+            </w:tcBorders>
+            <w:shd w:val="clear" w:color="auto" w:fill="F7F8F5"/>
+          </w:tcPr>
+          <w:p>
+            <w:r>
+              <w:rPr>
+                <w:noProof/>
+              </w:rPr>
+              <w:drawing>
+                <wp:anchor distT="0" distB="0" distL="114300" distR="114300" simplePos="0" relativeHeight="251661312" behindDoc="0" locked="0" layoutInCell="1" allowOverlap="1" wp14:anchorId="60D72186" wp14:editId="70BB50A7">
+                  <wp:simplePos x="0" y="0"/>
+                  <wp:positionH relativeFrom="column">
+                    <wp:posOffset>578099</wp:posOffset>
+                  </wp:positionH>
+                  <wp:positionV relativeFrom="paragraph">
+                    <wp:posOffset>186744</wp:posOffset>
+                  </wp:positionV>
+                  <wp:extent cx="1601887" cy="616888"/>
+                  <wp:effectExtent l="0" t="0" r="0" b="0"/>
+                  <wp:wrapNone/>
+                  <wp:docPr id="264294559" name="Picture 4"/>
+                  <wp:cNvGraphicFramePr>
+                    <a:graphicFrameLocks xmlns:a="http://schemas.openxmlformats.org/drawingml/2006/main" noChangeAspect="1"/>
+                  </wp:cNvGraphicFramePr>
+                  <a:graphic xmlns:a="http://schemas.openxmlformats.org/drawingml/2006/main">
+                    <a:graphicData uri="http://schemas.openxmlformats.org/drawingml/2006/picture">
+                      <pic:pic xmlns:pic="http://schemas.openxmlformats.org/drawingml/2006/picture">
+                        <pic:nvPicPr>
+                          <pic:cNvPr id="264294559" name="Picture 264294559"/>
+                          <pic:cNvPicPr/>
+                        </pic:nvPicPr>
+                        <pic:blipFill rotWithShape="1">
+                          <a:blip r:embed="rId10">
+                            <a:biLevel thresh="75000"/>
+                          </a:blip>
+                          <a:srcRect t="36616" b="24874"/>
+                          <a:stretch>
+                            <a:fillRect/>
+                          </a:stretch>
+                        </pic:blipFill>
+                        <pic:spPr bwMode="auto">
+                          <a:xfrm rot="462680">
+                            <a:off x="0" y="0"/>
+                            <a:ext cx="1601887" cy="616888"/>
+                          </a:xfrm>
+                          <a:prstGeom prst="rect">
+                            <a:avLst/>
+                          </a:prstGeom>
+                          <a:ln>
+                            <a:noFill/>
+                          </a:ln>
+                          <a:extLst>
+                            <a:ext uri="{53640926-AAD7-44D8-BBD7-CCE9431645EC}">
+                              <a14:shadowObscured xmlns:a14="http://schemas.microsoft.com/office/drawing/2010/main"/>
+                            </a:ext>
+                          </a:extLst>
+                        </pic:spPr>
+                      </pic:pic>
+                    </a:graphicData>
+                  </a:graphic>
+                  <wp14:sizeRelH relativeFrom="page">
+                    <wp14:pctWidth>0</wp14:pctWidth>
+                  </wp14:sizeRelH>
+                  <wp14:sizeRelV relativeFrom="page">
+                    <wp14:pctHeight>0</wp14:pctHeight>
+                  </wp14:sizeRelV>
+                </wp:anchor>
+              </w:drawing>
+            </w:r>
+            <w:r>
+              <w:rPr>
+                <w:b/>
+                <w:color w:val="145A32"/>
+                <w:sz w:val="16"/>
+              </w:rPr>
+              <w:t>EXECUTIVE DIRECTOR</w:t>
+            </w:r>
+            <w:r>
+              <w:rPr>
+                <w:b/>
+                <w:sz w:val="18"/>
+              </w:rPr>
+              <w:br/>
+              <w:t>Mr. Bhekisisa Shandu</w:t>
+            </w:r>
+            <w:r>
+              <w:br/>
+            </w:r>
+          </w:p>
+          <w:p>
+            <w:r>
+              <w:t>Signature: ____________________________</w:t>
+            </w:r>
+            <w:r>
+              <w:br/>
+            </w:r>
+          </w:p>
+          <w:p>
+            <w:pPr>
+              <w:rPr>
+                <w:noProof/>
+              </w:rPr>
+            </w:pPr>
+            <w:r>
+              <w:t xml:space="preserve">Date: </w:t>
+            </w:r>
+            <w:r>
+              <w:rPr>
+                <w:b/>
+                <w:bCs/>
+              </w:rPr>
+              <w:t>8</w:t>
+            </w:r>
+            <w:r>
+              <w:rPr>
+                <w:b/>
+                <w:bCs/>
+              </w:rPr>
+              <w:t xml:space="preserve"> September 2026</w:t>
+            </w:r>
+          </w:p>
+        </w:tc>
+        <w:tc>
+          <w:tcPr>
+            <w:tcW w:w="4968" w:type="dxa"/>
+            <w:tcBorders>
+              <w:top w:val="single" w:sz="5" w:space="0" w:color="D8DDD8"/>
+              <w:left w:val="single" w:sz="5" w:space="0" w:color="D8DDD8"/>
+              <w:bottom w:val="single" w:sz="5" w:space="0" w:color="D8DDD8"/>
+              <w:right w:val="single" w:sz="5" w:space="0" w:color="D8DDD8"/>
+            </w:tcBorders>
+            <w:shd w:val="clear" w:color="auto" w:fill="F7F8F5"/>
+          </w:tcPr>
+          <w:p>
+            <w:r>
+              <w:rPr>
+                <w:noProof/>
+                <w:sz w:val="16"/>
+                <w:szCs w:val="16"/>
+              </w:rPr>
+              <w:drawing>
+                <wp:anchor distT="0" distB="0" distL="114300" distR="114300" simplePos="0" relativeHeight="251660288" behindDoc="0" locked="0" layoutInCell="1" allowOverlap="1" wp14:anchorId="58E9EE5C" wp14:editId="36F3245E">
+                  <wp:simplePos x="0" y="0"/>
+                  <wp:positionH relativeFrom="column">
+                    <wp:posOffset>694911</wp:posOffset>
+                  </wp:positionH>
+                  <wp:positionV relativeFrom="paragraph">
+                    <wp:posOffset>269903</wp:posOffset>
+                  </wp:positionV>
+                  <wp:extent cx="1354277" cy="892568"/>
+                  <wp:effectExtent l="0" t="0" r="0" b="0"/>
+                  <wp:wrapNone/>
+                  <wp:docPr id="70748101" name="Picture 3"/>
+                  <wp:cNvGraphicFramePr>
+                    <a:graphicFrameLocks xmlns:a="http://schemas.openxmlformats.org/drawingml/2006/main" noChangeAspect="1"/>
+                  </wp:cNvGraphicFramePr>
+                  <a:graphic xmlns:a="http://schemas.openxmlformats.org/drawingml/2006/main">
+                    <a:graphicData uri="http://schemas.openxmlformats.org/drawingml/2006/picture">
+                      <pic:pic xmlns:pic="http://schemas.openxmlformats.org/drawingml/2006/picture">
+                        <pic:nvPicPr>
+                          <pic:cNvPr id="70748101" name="Picture 70748101"/>
+                          <pic:cNvPicPr/>
+                        </pic:nvPicPr>
+                        <pic:blipFill rotWithShape="1">
+                          <a:blip r:embed="rId11">
+                            <a:biLevel thresh="75000"/>
+                          </a:blip>
+                          <a:srcRect t="20028" b="17298"/>
+                          <a:stretch>
+                            <a:fillRect/>
+                          </a:stretch>
+                        </pic:blipFill>
+                        <pic:spPr bwMode="auto">
+                          <a:xfrm rot="164574">
+                            <a:off x="0" y="0"/>
+                            <a:ext cx="1354277" cy="892568"/>
+                          </a:xfrm>
+                          <a:prstGeom prst="rect">
+                            <a:avLst/>
+                          </a:prstGeom>
+                          <a:ln>
+                            <a:noFill/>
+                          </a:ln>
+                          <a:extLst>
+                            <a:ext uri="{53640926-AAD7-44D8-BBD7-CCE9431645EC}">
+                              <a14:shadowObscured xmlns:a14="http://schemas.microsoft.com/office/drawing/2010/main"/>
+                            </a:ext>
+                          </a:extLst>
+                        </pic:spPr>
+                      </pic:pic>
+                    </a:graphicData>
+                  </a:graphic>
+                  <wp14:sizeRelH relativeFrom="margin">
+                    <wp14:pctWidth>0</wp14:pctWidth>
+                  </wp14:sizeRelH>
+                  <wp14:sizeRelV relativeFrom="margin">
+                    <wp14:pctHeight>0</wp14:pctHeight>
+                  </wp14:sizeRelV>
+                </wp:anchor>
+              </w:drawing>
+            </w:r>
+            <w:r>
+              <w:rPr>
+                <w:b/>
+                <w:color w:val="145A32"/>
+                <w:sz w:val="16"/>
+                <w:szCs w:val="16"/>
+              </w:rPr>
+              <w:t>DIRECTOR: PEOPLE AND CULTURE / CHAIRPERSON: FINANCE AND PROCUREMENT COMMITTEE</w:t>
+            </w:r>
+            <w:r>
+              <w:br/>
+            </w:r>
+            <w:r>
+              <w:rPr>
+                <w:b/>
+                <w:sz w:val="18"/>
+              </w:rPr>
+              <w:t>Mr. Khulekani Gumede</w:t>
+            </w:r>
+            <w:r>
+              <w:br/>
+            </w:r>
+          </w:p>
+          <w:p>
+            <w:r>
+              <w:t>Signature: ____________________________</w:t>
+            </w:r>
+            <w:r>
+              <w:br/>
+            </w:r>
+          </w:p>
+          <w:p>
+            <w:r>
+              <w:t xml:space="preserve">Date: </w:t>
+            </w:r>
+            <w:r>
+              <w:rPr>
+                <w:b/>
+                <w:bCs/>
+                <w:u w:val="single"/>
+              </w:rPr>
+              <w:t>8</w:t>
+            </w:r>
+            <w:r>
+              <w:rPr>
+                <w:b/>
+                <w:bCs/>
+                <w:u w:val="single"/>
+              </w:rPr>
+              <w:t xml:space="preserve"> September 2026</w:t>
             </w:r>
           </w:p>
         </w:tc>
       </w:tr>
     </w:tbl>
+    <w:p>
+      <w:pPr>
+        <w:spacing w:line="276" w:lineRule="auto"/>
+      </w:pPr>
+    </w:p>
+    <w:sectPr>
+      <w:headerReference w:type="default" r:id="rId12"/>
+      <w:footerReference w:type="default" r:id="rId13"/>
+      <w:pgSz w:w="11906" w:h="16838"/>
+      <w:pgMar w:top="1440" w:right="1440" w:bottom="1440" w:left="1440" w:header="709" w:footer="709" w:gutter="0"/>
+      <w:cols w:space="708"/>
+      <w:docGrid w:linePitch="360"/>
+    </w:sectPr>
   </w:body>
 </w:document>
 </file>
@@ -1901,6 +2239,7 @@
   <w:p>
     <w:pPr>
       <w:pStyle w:val="Footer"/>
+      <w:spacing w:line="276" w:lineRule="auto"/>
       <w:jc w:val="center"/>
     </w:pPr>
     <w:r>
@@ -1930,14 +2269,14 @@
         <w:color w:val="5F6B63"/>
         <w:sz w:val="16"/>
       </w:rPr>
-      <w:t xml:space="preserve">  |  OFFICIAL </w:t>
+      <w:t xml:space="preserve">  |  </w:t>
     </w:r>
     <w:r>
       <w:rPr>
         <w:color w:val="5F6B63"/>
         <w:sz w:val="16"/>
       </w:rPr>
-      <w:t>CONSTITUTION</w:t>
+      <w:t>BOARD MINUTES</w:t>
     </w:r>
   </w:p>
 </w:ftr>
@@ -2251,6 +2590,7 @@
   <w:p>
     <w:pPr>
       <w:pStyle w:val="Header"/>
+      <w:spacing w:line="276" w:lineRule="auto"/>
     </w:pPr>
   </w:p>
 </w:hdr>

</xml_diff>